<commit_message>
chore: Consolidate remaining local pipeline modifications and prompt changes
</commit_message>
<xml_diff>
--- a/templates/Template_Documento_Anexos_Alpha_v06_Tower_Annex_v2_6.docx
+++ b/templates/Template_Documento_Anexos_Alpha_v06_Tower_Annex_v2_6.docx
@@ -4,34 +4,33 @@
   <w:body>
     <w:p>
       <w:pPr>
-        <w:spacing w:before="0" w:after="40" w:line="240" w:lineRule="auto"/>
-        <w:jc w:val="left"/>
+        <w:spacing w:after="40"/>
       </w:pPr>
       <w:r>
         <w:rPr>
           <w:rFonts w:ascii="Aptos" w:hAnsi="Aptos" w:cs="Aptos"/>
           <w:b/>
-          <w:i w:val="0"/>
+          <w:noProof/>
           <w:color w:val="1F1F1F"/>
           <w:sz w:val="30"/>
-          <w:noProof/>
         </w:rPr>
         <w:t>ANEXO {{TOWER_CODE}} – {{TOWER_NAME}}</w:t>
       </w:r>
     </w:p>
     <w:p>
       <w:pPr>
-        <w:spacing w:before="0" w:after="200" w:line="240" w:lineRule="auto"/>
-        <w:jc w:val="left"/>
+        <w:spacing w:after="200"/>
+        <w:rPr>
+          <w:lang w:val="fr-FR"/>
+        </w:rPr>
       </w:pPr>
       <w:r>
         <w:rPr>
           <w:rFonts w:ascii="Aptos" w:hAnsi="Aptos" w:cs="Aptos"/>
-          <w:b w:val="0"/>
-          <w:i w:val="0"/>
+          <w:noProof/>
           <w:color w:val="5A5A5A"/>
           <w:sz w:val="23"/>
-          <w:noProof/>
+          <w:lang w:val="fr-FR"/>
         </w:rPr>
         <w:t>{{CLIENT_NAME}} · Fast Infrastructure Assessment</w:t>
       </w:r>
@@ -39,37 +38,815 @@
     <w:p>
       <w:pPr>
         <w:keepNext/>
-        <w:spacing w:before="120" w:after="120" w:line="240" w:lineRule="auto"/>
-        <w:jc w:val="left"/>
+        <w:spacing w:before="120" w:after="120"/>
       </w:pPr>
       <w:r>
         <w:rPr>
           <w:rFonts w:ascii="Aptos" w:hAnsi="Aptos" w:cs="Aptos"/>
           <w:b/>
-          <w:i w:val="0"/>
+          <w:noProof/>
           <w:color w:val="0070C0"/>
           <w:sz w:val="34"/>
-          <w:noProof/>
         </w:rPr>
         <w:t>Resumen ejecutivo de la torre</w:t>
       </w:r>
     </w:p>
     <w:tbl>
       <w:tblPr>
-        <w:tblW w:type="auto" w:w="0"/>
+        <w:tblW w:w="0" w:type="auto"/>
         <w:jc w:val="center"/>
         <w:tblLayout w:type="fixed"/>
-        <w:tblLook w:firstColumn="1" w:firstRow="1" w:lastColumn="0" w:lastRow="0" w:noHBand="0" w:noVBand="1" w:val="04A0"/>
+        <w:tblLook w:val="04A0" w:firstRow="1" w:lastRow="0" w:firstColumn="1" w:lastColumn="0" w:noHBand="0" w:noVBand="1"/>
       </w:tblPr>
       <w:tblGrid>
-        <w:gridCol w:w="3213"/>
-        <w:gridCol w:w="3213"/>
-        <w:gridCol w:w="3213"/>
+        <w:gridCol w:w="3175"/>
+        <w:gridCol w:w="3175"/>
+        <w:gridCol w:w="3175"/>
       </w:tblGrid>
       <w:tr>
+        <w:trPr>
+          <w:jc w:val="center"/>
+        </w:trPr>
         <w:tc>
           <w:tcPr>
-            <w:tcW w:type="dxa" w:w="3175"/>
+            <w:tcW w:w="3175" w:type="dxa"/>
+            <w:tcBorders>
+              <w:top w:val="single" w:sz="6" w:space="0" w:color="B8C9D9"/>
+              <w:left w:val="single" w:sz="6" w:space="0" w:color="B8C9D9"/>
+              <w:bottom w:val="single" w:sz="6" w:space="0" w:color="B8C9D9"/>
+              <w:right w:val="single" w:sz="6" w:space="0" w:color="B8C9D9"/>
+            </w:tcBorders>
+            <w:shd w:val="clear" w:color="auto" w:fill="CFE2F3"/>
+            <w:tcMar>
+              <w:top w:w="80" w:type="dxa"/>
+              <w:left w:w="100" w:type="dxa"/>
+              <w:bottom w:w="80" w:type="dxa"/>
+              <w:right w:w="100" w:type="dxa"/>
+            </w:tcMar>
+            <w:vAlign w:val="center"/>
+          </w:tcPr>
+          <w:p>
+            <w:pPr>
+              <w:jc w:val="center"/>
+            </w:pPr>
+            <w:r>
+              <w:rPr>
+                <w:rFonts w:ascii="Aptos" w:hAnsi="Aptos" w:cs="Aptos"/>
+                <w:b/>
+                <w:noProof/>
+                <w:color w:val="0070C0"/>
+              </w:rPr>
+              <w:t>SCORE ACTUAL</w:t>
+            </w:r>
+          </w:p>
+        </w:tc>
+        <w:tc>
+          <w:tcPr>
+            <w:tcW w:w="3175" w:type="dxa"/>
+            <w:tcBorders>
+              <w:top w:val="single" w:sz="6" w:space="0" w:color="B8C9D9"/>
+              <w:left w:val="single" w:sz="6" w:space="0" w:color="B8C9D9"/>
+              <w:bottom w:val="single" w:sz="6" w:space="0" w:color="B8C9D9"/>
+              <w:right w:val="single" w:sz="6" w:space="0" w:color="B8C9D9"/>
+            </w:tcBorders>
+            <w:shd w:val="clear" w:color="auto" w:fill="CFE2F3"/>
+            <w:tcMar>
+              <w:top w:w="80" w:type="dxa"/>
+              <w:left w:w="100" w:type="dxa"/>
+              <w:bottom w:w="80" w:type="dxa"/>
+              <w:right w:w="100" w:type="dxa"/>
+            </w:tcMar>
+            <w:vAlign w:val="center"/>
+          </w:tcPr>
+          <w:p>
+            <w:pPr>
+              <w:jc w:val="center"/>
+            </w:pPr>
+            <w:r>
+              <w:rPr>
+                <w:rFonts w:ascii="Aptos" w:hAnsi="Aptos" w:cs="Aptos"/>
+                <w:b/>
+                <w:noProof/>
+                <w:color w:val="0070C0"/>
+              </w:rPr>
+              <w:t>BANDA DE MADUREZ</w:t>
+            </w:r>
+          </w:p>
+        </w:tc>
+        <w:tc>
+          <w:tcPr>
+            <w:tcW w:w="3175" w:type="dxa"/>
+            <w:tcBorders>
+              <w:top w:val="single" w:sz="6" w:space="0" w:color="B8C9D9"/>
+              <w:left w:val="single" w:sz="6" w:space="0" w:color="B8C9D9"/>
+              <w:bottom w:val="single" w:sz="6" w:space="0" w:color="B8C9D9"/>
+              <w:right w:val="single" w:sz="6" w:space="0" w:color="B8C9D9"/>
+            </w:tcBorders>
+            <w:shd w:val="clear" w:color="auto" w:fill="CFE2F3"/>
+            <w:tcMar>
+              <w:top w:w="80" w:type="dxa"/>
+              <w:left w:w="100" w:type="dxa"/>
+              <w:bottom w:w="80" w:type="dxa"/>
+              <w:right w:w="100" w:type="dxa"/>
+            </w:tcMar>
+            <w:vAlign w:val="center"/>
+          </w:tcPr>
+          <w:p>
+            <w:pPr>
+              <w:jc w:val="center"/>
+            </w:pPr>
+            <w:r>
+              <w:rPr>
+                <w:rFonts w:ascii="Aptos" w:hAnsi="Aptos" w:cs="Aptos"/>
+                <w:b/>
+                <w:noProof/>
+                <w:color w:val="0070C0"/>
+              </w:rPr>
+              <w:t>MADUREZ OBJETIVO</w:t>
+            </w:r>
+          </w:p>
+        </w:tc>
+      </w:tr>
+      <w:tr>
+        <w:trPr>
+          <w:jc w:val="center"/>
+        </w:trPr>
+        <w:tc>
+          <w:tcPr>
+            <w:tcW w:w="3175" w:type="dxa"/>
+            <w:tcBorders>
+              <w:top w:val="single" w:sz="6" w:space="0" w:color="B8C9D9"/>
+              <w:left w:val="single" w:sz="6" w:space="0" w:color="B8C9D9"/>
+              <w:bottom w:val="single" w:sz="6" w:space="0" w:color="B8C9D9"/>
+              <w:right w:val="single" w:sz="6" w:space="0" w:color="B8C9D9"/>
+            </w:tcBorders>
+            <w:shd w:val="clear" w:color="auto" w:fill="FFFFFF"/>
+            <w:tcMar>
+              <w:top w:w="80" w:type="dxa"/>
+              <w:left w:w="100" w:type="dxa"/>
+              <w:bottom w:w="80" w:type="dxa"/>
+              <w:right w:w="100" w:type="dxa"/>
+            </w:tcMar>
+            <w:vAlign w:val="center"/>
+          </w:tcPr>
+          <w:p>
+            <w:pPr>
+              <w:spacing w:before="40" w:after="40"/>
+              <w:jc w:val="center"/>
+            </w:pPr>
+            <w:r>
+              <w:rPr>
+                <w:rFonts w:ascii="Aptos" w:hAnsi="Aptos" w:cs="Aptos"/>
+                <w:noProof/>
+                <w:color w:val="1F1F1F"/>
+                <w:sz w:val="28"/>
+              </w:rPr>
+              <w:t>{{GLOBAL_SCORE}}</w:t>
+            </w:r>
+          </w:p>
+        </w:tc>
+        <w:tc>
+          <w:tcPr>
+            <w:tcW w:w="3175" w:type="dxa"/>
+            <w:tcBorders>
+              <w:top w:val="single" w:sz="6" w:space="0" w:color="B8C9D9"/>
+              <w:left w:val="single" w:sz="6" w:space="0" w:color="B8C9D9"/>
+              <w:bottom w:val="single" w:sz="6" w:space="0" w:color="B8C9D9"/>
+              <w:right w:val="single" w:sz="6" w:space="0" w:color="B8C9D9"/>
+            </w:tcBorders>
+            <w:shd w:val="clear" w:color="auto" w:fill="FFFFFF"/>
+            <w:tcMar>
+              <w:top w:w="80" w:type="dxa"/>
+              <w:left w:w="100" w:type="dxa"/>
+              <w:bottom w:w="80" w:type="dxa"/>
+              <w:right w:w="100" w:type="dxa"/>
+            </w:tcMar>
+            <w:vAlign w:val="center"/>
+          </w:tcPr>
+          <w:p>
+            <w:pPr>
+              <w:spacing w:before="40" w:after="40"/>
+              <w:jc w:val="center"/>
+            </w:pPr>
+            <w:r>
+              <w:rPr>
+                <w:rFonts w:ascii="Aptos" w:hAnsi="Aptos" w:cs="Aptos"/>
+                <w:noProof/>
+                <w:color w:val="1F1F1F"/>
+                <w:sz w:val="28"/>
+              </w:rPr>
+              <w:t>{{GLOBAL_BAND}}</w:t>
+            </w:r>
+          </w:p>
+        </w:tc>
+        <w:tc>
+          <w:tcPr>
+            <w:tcW w:w="3175" w:type="dxa"/>
+            <w:tcBorders>
+              <w:top w:val="single" w:sz="6" w:space="0" w:color="B8C9D9"/>
+              <w:left w:val="single" w:sz="6" w:space="0" w:color="B8C9D9"/>
+              <w:bottom w:val="single" w:sz="6" w:space="0" w:color="B8C9D9"/>
+              <w:right w:val="single" w:sz="6" w:space="0" w:color="B8C9D9"/>
+            </w:tcBorders>
+            <w:shd w:val="clear" w:color="auto" w:fill="FFFFFF"/>
+            <w:tcMar>
+              <w:top w:w="80" w:type="dxa"/>
+              <w:left w:w="100" w:type="dxa"/>
+              <w:bottom w:w="80" w:type="dxa"/>
+              <w:right w:w="100" w:type="dxa"/>
+            </w:tcMar>
+            <w:vAlign w:val="center"/>
+          </w:tcPr>
+          <w:p>
+            <w:pPr>
+              <w:spacing w:before="40" w:after="40"/>
+              <w:jc w:val="center"/>
+            </w:pPr>
+            <w:r>
+              <w:rPr>
+                <w:rFonts w:ascii="Aptos" w:hAnsi="Aptos" w:cs="Aptos"/>
+                <w:noProof/>
+                <w:color w:val="1F1F1F"/>
+                <w:sz w:val="28"/>
+              </w:rPr>
+              <w:t>{{TARGET_MATURITY}}</w:t>
+            </w:r>
+          </w:p>
+        </w:tc>
+      </w:tr>
+    </w:tbl>
+    <w:p/>
+    <w:p>
+      <w:pPr>
+        <w:spacing w:after="160" w:line="276" w:lineRule="auto"/>
+        <w:jc w:val="both"/>
+      </w:pPr>
+      <w:r>
+        <w:rPr>
+          <w:rFonts w:ascii="Aptos" w:hAnsi="Aptos" w:cs="Aptos"/>
+          <w:noProof/>
+          <w:color w:val="1F1F1F"/>
+        </w:rPr>
+        <w:t>{{EXEC_SUMMARY_BODY}}</w:t>
+      </w:r>
+    </w:p>
+    <w:tbl>
+      <w:tblPr>
+        <w:tblW w:w="0" w:type="auto"/>
+        <w:jc w:val="center"/>
+        <w:tblLayout w:type="fixed"/>
+        <w:tblLook w:val="04A0" w:firstRow="1" w:lastRow="0" w:firstColumn="1" w:lastColumn="0" w:noHBand="0" w:noVBand="1"/>
+      </w:tblPr>
+      <w:tblGrid>
+        <w:gridCol w:w="2551"/>
+        <w:gridCol w:w="7087"/>
+      </w:tblGrid>
+      <w:tr>
+        <w:trPr>
+          <w:jc w:val="center"/>
+        </w:trPr>
+        <w:tc>
+          <w:tcPr>
+            <w:tcW w:w="2551" w:type="dxa"/>
+            <w:tcBorders>
+              <w:top w:val="single" w:sz="6" w:space="0" w:color="B8C9D9"/>
+              <w:left w:val="single" w:sz="6" w:space="0" w:color="B8C9D9"/>
+              <w:bottom w:val="single" w:sz="6" w:space="0" w:color="B8C9D9"/>
+              <w:right w:val="single" w:sz="6" w:space="0" w:color="B8C9D9"/>
+            </w:tcBorders>
+            <w:shd w:val="clear" w:color="auto" w:fill="F6FAFD"/>
+            <w:tcMar>
+              <w:top w:w="80" w:type="dxa"/>
+              <w:left w:w="100" w:type="dxa"/>
+              <w:bottom w:w="80" w:type="dxa"/>
+              <w:right w:w="100" w:type="dxa"/>
+            </w:tcMar>
+            <w:vAlign w:val="center"/>
+          </w:tcPr>
+          <w:p>
+            <w:r>
+              <w:rPr>
+                <w:rFonts w:ascii="Aptos" w:hAnsi="Aptos" w:cs="Aptos"/>
+                <w:b/>
+                <w:noProof/>
+                <w:color w:val="0070C0"/>
+                <w:sz w:val="20"/>
+              </w:rPr>
+              <w:t>Fortaleza principal</w:t>
+            </w:r>
+          </w:p>
+        </w:tc>
+        <w:tc>
+          <w:tcPr>
+            <w:tcW w:w="7087" w:type="dxa"/>
+            <w:tcBorders>
+              <w:top w:val="single" w:sz="6" w:space="0" w:color="B8C9D9"/>
+              <w:left w:val="single" w:sz="6" w:space="0" w:color="B8C9D9"/>
+              <w:bottom w:val="single" w:sz="6" w:space="0" w:color="B8C9D9"/>
+              <w:right w:val="single" w:sz="6" w:space="0" w:color="B8C9D9"/>
+            </w:tcBorders>
+            <w:shd w:val="clear" w:color="auto" w:fill="FFFFFF"/>
+            <w:tcMar>
+              <w:top w:w="80" w:type="dxa"/>
+              <w:left w:w="100" w:type="dxa"/>
+              <w:bottom w:w="80" w:type="dxa"/>
+              <w:right w:w="100" w:type="dxa"/>
+            </w:tcMar>
+            <w:vAlign w:val="center"/>
+          </w:tcPr>
+          <w:p>
+            <w:pPr>
+              <w:spacing w:line="269" w:lineRule="auto"/>
+            </w:pPr>
+            <w:r>
+              <w:rPr>
+                <w:rFonts w:ascii="Aptos" w:hAnsi="Aptos" w:cs="Aptos"/>
+                <w:noProof/>
+                <w:color w:val="1F1F1F"/>
+              </w:rPr>
+              <w:t>{{MSG_STRENGTH_VALUE}}</w:t>
+            </w:r>
+          </w:p>
+        </w:tc>
+      </w:tr>
+      <w:tr>
+        <w:trPr>
+          <w:jc w:val="center"/>
+        </w:trPr>
+        <w:tc>
+          <w:tcPr>
+            <w:tcW w:w="2551" w:type="dxa"/>
+            <w:tcBorders>
+              <w:top w:val="single" w:sz="6" w:space="0" w:color="B8C9D9"/>
+              <w:left w:val="single" w:sz="6" w:space="0" w:color="B8C9D9"/>
+              <w:bottom w:val="single" w:sz="6" w:space="0" w:color="B8C9D9"/>
+              <w:right w:val="single" w:sz="6" w:space="0" w:color="B8C9D9"/>
+            </w:tcBorders>
+            <w:shd w:val="clear" w:color="auto" w:fill="F6FAFD"/>
+            <w:tcMar>
+              <w:top w:w="80" w:type="dxa"/>
+              <w:left w:w="100" w:type="dxa"/>
+              <w:bottom w:w="80" w:type="dxa"/>
+              <w:right w:w="100" w:type="dxa"/>
+            </w:tcMar>
+            <w:vAlign w:val="center"/>
+          </w:tcPr>
+          <w:p>
+            <w:r>
+              <w:rPr>
+                <w:rFonts w:ascii="Aptos" w:hAnsi="Aptos" w:cs="Aptos"/>
+                <w:b/>
+                <w:noProof/>
+                <w:color w:val="0070C0"/>
+                <w:sz w:val="20"/>
+              </w:rPr>
+              <w:t>Brecha principal</w:t>
+            </w:r>
+          </w:p>
+        </w:tc>
+        <w:tc>
+          <w:tcPr>
+            <w:tcW w:w="7087" w:type="dxa"/>
+            <w:tcBorders>
+              <w:top w:val="single" w:sz="6" w:space="0" w:color="B8C9D9"/>
+              <w:left w:val="single" w:sz="6" w:space="0" w:color="B8C9D9"/>
+              <w:bottom w:val="single" w:sz="6" w:space="0" w:color="B8C9D9"/>
+              <w:right w:val="single" w:sz="6" w:space="0" w:color="B8C9D9"/>
+            </w:tcBorders>
+            <w:shd w:val="clear" w:color="auto" w:fill="FFFFFF"/>
+            <w:tcMar>
+              <w:top w:w="80" w:type="dxa"/>
+              <w:left w:w="100" w:type="dxa"/>
+              <w:bottom w:w="80" w:type="dxa"/>
+              <w:right w:w="100" w:type="dxa"/>
+            </w:tcMar>
+            <w:vAlign w:val="center"/>
+          </w:tcPr>
+          <w:p>
+            <w:pPr>
+              <w:spacing w:line="269" w:lineRule="auto"/>
+            </w:pPr>
+            <w:r>
+              <w:rPr>
+                <w:rFonts w:ascii="Aptos" w:hAnsi="Aptos" w:cs="Aptos"/>
+                <w:noProof/>
+                <w:color w:val="1F1F1F"/>
+              </w:rPr>
+              <w:t>{{MSG_GAP_VALUE}}</w:t>
+            </w:r>
+          </w:p>
+        </w:tc>
+      </w:tr>
+      <w:tr>
+        <w:trPr>
+          <w:jc w:val="center"/>
+        </w:trPr>
+        <w:tc>
+          <w:tcPr>
+            <w:tcW w:w="2551" w:type="dxa"/>
+            <w:tcBorders>
+              <w:top w:val="single" w:sz="6" w:space="0" w:color="B8C9D9"/>
+              <w:left w:val="single" w:sz="6" w:space="0" w:color="B8C9D9"/>
+              <w:bottom w:val="single" w:sz="6" w:space="0" w:color="B8C9D9"/>
+              <w:right w:val="single" w:sz="6" w:space="0" w:color="B8C9D9"/>
+            </w:tcBorders>
+            <w:shd w:val="clear" w:color="auto" w:fill="F6FAFD"/>
+            <w:tcMar>
+              <w:top w:w="80" w:type="dxa"/>
+              <w:left w:w="100" w:type="dxa"/>
+              <w:bottom w:w="80" w:type="dxa"/>
+              <w:right w:w="100" w:type="dxa"/>
+            </w:tcMar>
+            <w:vAlign w:val="center"/>
+          </w:tcPr>
+          <w:p>
+            <w:r>
+              <w:rPr>
+                <w:rFonts w:ascii="Aptos" w:hAnsi="Aptos" w:cs="Aptos"/>
+                <w:b/>
+                <w:noProof/>
+                <w:color w:val="0070C0"/>
+                <w:sz w:val="20"/>
+              </w:rPr>
+              <w:t>Cuello de botella</w:t>
+            </w:r>
+          </w:p>
+        </w:tc>
+        <w:tc>
+          <w:tcPr>
+            <w:tcW w:w="7087" w:type="dxa"/>
+            <w:tcBorders>
+              <w:top w:val="single" w:sz="6" w:space="0" w:color="B8C9D9"/>
+              <w:left w:val="single" w:sz="6" w:space="0" w:color="B8C9D9"/>
+              <w:bottom w:val="single" w:sz="6" w:space="0" w:color="B8C9D9"/>
+              <w:right w:val="single" w:sz="6" w:space="0" w:color="B8C9D9"/>
+            </w:tcBorders>
+            <w:shd w:val="clear" w:color="auto" w:fill="FFFFFF"/>
+            <w:tcMar>
+              <w:top w:w="80" w:type="dxa"/>
+              <w:left w:w="100" w:type="dxa"/>
+              <w:bottom w:w="80" w:type="dxa"/>
+              <w:right w:w="100" w:type="dxa"/>
+            </w:tcMar>
+            <w:vAlign w:val="center"/>
+          </w:tcPr>
+          <w:p>
+            <w:pPr>
+              <w:spacing w:line="269" w:lineRule="auto"/>
+            </w:pPr>
+            <w:r>
+              <w:rPr>
+                <w:rFonts w:ascii="Aptos" w:hAnsi="Aptos" w:cs="Aptos"/>
+                <w:noProof/>
+                <w:color w:val="1F1F1F"/>
+              </w:rPr>
+              <w:t>{{MSG_BOTTLENECK_VALUE}}</w:t>
+            </w:r>
+          </w:p>
+        </w:tc>
+      </w:tr>
+    </w:tbl>
+    <w:p>
+      <w:pPr>
+        <w:keepNext/>
+        <w:spacing w:before="360" w:after="160"/>
+      </w:pPr>
+      <w:r>
+        <w:rPr>
+          <w:rFonts w:ascii="Aptos" w:hAnsi="Aptos" w:cs="Aptos"/>
+          <w:b/>
+          <w:noProof/>
+          <w:color w:val="0070C0"/>
+          <w:sz w:val="34"/>
+        </w:rPr>
+        <w:t>Perfil de madurez por pilar</w:t>
+      </w:r>
+    </w:p>
+    <w:p>
+      <w:pPr>
+        <w:spacing w:after="80" w:line="276" w:lineRule="auto"/>
+        <w:jc w:val="both"/>
+      </w:pPr>
+      <w:r>
+        <w:rPr>
+          <w:rFonts w:ascii="Aptos" w:hAnsi="Aptos" w:cs="Aptos"/>
+          <w:noProof/>
+          <w:color w:val="1F1F1F"/>
+        </w:rPr>
+        <w:t>{{PILLAR_PROFILE_INTRO}}</w:t>
+      </w:r>
+    </w:p>
+    <w:p>
+      <w:pPr>
+        <w:spacing w:after="160"/>
+      </w:pPr>
+      <w:r>
+        <w:rPr>
+          <w:rFonts w:ascii="Aptos" w:hAnsi="Aptos" w:cs="Aptos"/>
+          <w:noProof/>
+          <w:color w:val="5A5A5A"/>
+          <w:sz w:val="18"/>
+        </w:rPr>
+        <w:t>{{SCORING_METHOD_NOTE}}</w:t>
+      </w:r>
+    </w:p>
+    <w:p>
+      <w:pPr>
+        <w:keepNext/>
+        <w:spacing w:before="120" w:after="120"/>
+      </w:pPr>
+      <w:r>
+        <w:rPr>
+          <w:rFonts w:ascii="Aptos" w:hAnsi="Aptos" w:cs="Aptos"/>
+          <w:b/>
+          <w:noProof/>
+          <w:color w:val="0070C0"/>
+        </w:rPr>
+        <w:t>Gráfico radial</w:t>
+      </w:r>
+    </w:p>
+    <w:p>
+      <w:r>
+        <w:rPr>
+          <w:rFonts w:ascii="Aptos" w:hAnsi="Aptos" w:cs="Aptos"/>
+          <w:noProof/>
+          <w:color w:val="1F1F1F"/>
+        </w:rPr>
+        <w:t>{{RADAR_CHART_BLOCK}}</w:t>
+      </w:r>
+    </w:p>
+    <w:p>
+      <w:pPr>
+        <w:spacing w:after="60"/>
+      </w:pPr>
+    </w:p>
+    <w:p>
+      <w:pPr>
+        <w:keepNext/>
+        <w:spacing w:before="120" w:after="120"/>
+      </w:pPr>
+      <w:r>
+        <w:rPr>
+          <w:rFonts w:ascii="Aptos" w:hAnsi="Aptos" w:cs="Aptos"/>
+          <w:b/>
+          <w:noProof/>
+          <w:color w:val="0070C0"/>
+        </w:rPr>
+        <w:t>Detalle compacto por pilar</w:t>
+      </w:r>
+    </w:p>
+    <w:p>
+      <w:r>
+        <w:rPr>
+          <w:rFonts w:ascii="Aptos" w:hAnsi="Aptos" w:cs="Aptos"/>
+          <w:noProof/>
+          <w:color w:val="1F1F1F"/>
+        </w:rPr>
+        <w:t>{{PILLAR_SCORE_TABLE}}</w:t>
+      </w:r>
+    </w:p>
+    <w:p>
+      <w:pPr>
+        <w:spacing w:after="80"/>
+      </w:pPr>
+    </w:p>
+    <w:p>
+      <w:pPr>
+        <w:keepNext/>
+        <w:pageBreakBefore/>
+        <w:spacing w:after="160"/>
+      </w:pPr>
+      <w:r>
+        <w:rPr>
+          <w:rFonts w:ascii="Aptos" w:hAnsi="Aptos" w:cs="Aptos"/>
+          <w:b/>
+          <w:noProof/>
+          <w:color w:val="0070C0"/>
+          <w:sz w:val="34"/>
+        </w:rPr>
+        <w:lastRenderedPageBreak/>
+        <w:t>AS-IS resumido</w:t>
+      </w:r>
+    </w:p>
+    <w:p>
+      <w:pPr>
+        <w:spacing w:after="160" w:line="276" w:lineRule="auto"/>
+        <w:jc w:val="both"/>
+      </w:pPr>
+      <w:r>
+        <w:rPr>
+          <w:rFonts w:ascii="Aptos" w:hAnsi="Aptos" w:cs="Aptos"/>
+          <w:noProof/>
+          <w:color w:val="1F1F1F"/>
+        </w:rPr>
+        <w:t>{{ASIS_NARRATIVE}}</w:t>
+      </w:r>
+    </w:p>
+    <w:tbl>
+      <w:tblPr>
+        <w:tblW w:w="0" w:type="auto"/>
+        <w:jc w:val="center"/>
+        <w:tblLayout w:type="fixed"/>
+        <w:tblLook w:val="04A0" w:firstRow="1" w:lastRow="0" w:firstColumn="1" w:lastColumn="0" w:noHBand="0" w:noVBand="1"/>
+      </w:tblPr>
+      <w:tblGrid>
+        <w:gridCol w:w="4819"/>
+        <w:gridCol w:w="4819"/>
+      </w:tblGrid>
+      <w:tr>
+        <w:trPr>
+          <w:jc w:val="center"/>
+        </w:trPr>
+        <w:tc>
+          <w:tcPr>
+            <w:tcW w:w="4819" w:type="dxa"/>
+            <w:tcBorders>
+              <w:top w:val="single" w:sz="6" w:space="0" w:color="B8C9D9"/>
+              <w:left w:val="single" w:sz="6" w:space="0" w:color="B8C9D9"/>
+              <w:bottom w:val="single" w:sz="6" w:space="0" w:color="B8C9D9"/>
+              <w:right w:val="single" w:sz="6" w:space="0" w:color="B8C9D9"/>
+            </w:tcBorders>
+            <w:shd w:val="clear" w:color="auto" w:fill="CFE2F3"/>
+            <w:tcMar>
+              <w:top w:w="80" w:type="dxa"/>
+              <w:left w:w="100" w:type="dxa"/>
+              <w:bottom w:w="80" w:type="dxa"/>
+              <w:right w:w="100" w:type="dxa"/>
+            </w:tcMar>
+          </w:tcPr>
+          <w:p>
+            <w:pPr>
+              <w:spacing w:before="120" w:after="80"/>
+            </w:pPr>
+            <w:r>
+              <w:rPr>
+                <w:rFonts w:ascii="Aptos" w:hAnsi="Aptos" w:cs="Aptos"/>
+                <w:b/>
+                <w:noProof/>
+                <w:color w:val="0070C0"/>
+              </w:rPr>
+              <w:t>Fortalezas clave</w:t>
+            </w:r>
+          </w:p>
+        </w:tc>
+        <w:tc>
+          <w:tcPr>
+            <w:tcW w:w="4819" w:type="dxa"/>
+            <w:tcBorders>
+              <w:top w:val="single" w:sz="6" w:space="0" w:color="B8C9D9"/>
+              <w:left w:val="single" w:sz="6" w:space="0" w:color="B8C9D9"/>
+              <w:bottom w:val="single" w:sz="6" w:space="0" w:color="B8C9D9"/>
+              <w:right w:val="single" w:sz="6" w:space="0" w:color="B8C9D9"/>
+            </w:tcBorders>
+            <w:shd w:val="clear" w:color="auto" w:fill="CFE2F3"/>
+            <w:tcMar>
+              <w:top w:w="80" w:type="dxa"/>
+              <w:left w:w="100" w:type="dxa"/>
+              <w:bottom w:w="80" w:type="dxa"/>
+              <w:right w:w="100" w:type="dxa"/>
+            </w:tcMar>
+          </w:tcPr>
+          <w:p>
+            <w:pPr>
+              <w:spacing w:before="120" w:after="80"/>
+            </w:pPr>
+            <w:r>
+              <w:rPr>
+                <w:rFonts w:ascii="Aptos" w:hAnsi="Aptos" w:cs="Aptos"/>
+                <w:b/>
+                <w:noProof/>
+                <w:color w:val="0070C0"/>
+              </w:rPr>
+              <w:t>Brechas clave</w:t>
+            </w:r>
+          </w:p>
+        </w:tc>
+      </w:tr>
+      <w:tr>
+        <w:trPr>
+          <w:jc w:val="center"/>
+        </w:trPr>
+        <w:tc>
+          <w:tcPr>
+            <w:tcW w:w="4819" w:type="dxa"/>
+            <w:tcBorders>
+              <w:top w:val="single" w:sz="6" w:space="0" w:color="B8C9D9"/>
+              <w:left w:val="single" w:sz="6" w:space="0" w:color="B8C9D9"/>
+              <w:bottom w:val="single" w:sz="6" w:space="0" w:color="B8C9D9"/>
+              <w:right w:val="single" w:sz="6" w:space="0" w:color="B8C9D9"/>
+            </w:tcBorders>
+            <w:tcMar>
+              <w:top w:w="110" w:type="dxa"/>
+              <w:left w:w="130" w:type="dxa"/>
+              <w:bottom w:w="110" w:type="dxa"/>
+              <w:right w:w="130" w:type="dxa"/>
+            </w:tcMar>
+          </w:tcPr>
+          <w:p>
+            <w:pPr>
+              <w:spacing w:line="264" w:lineRule="auto"/>
+            </w:pPr>
+            <w:r>
+              <w:rPr>
+                <w:rFonts w:ascii="Aptos" w:hAnsi="Aptos" w:cs="Aptos"/>
+                <w:noProof/>
+                <w:color w:val="1F1F1F"/>
+              </w:rPr>
+              <w:t>{{ASIS_STRENGTHS_LIST}}</w:t>
+            </w:r>
+          </w:p>
+        </w:tc>
+        <w:tc>
+          <w:tcPr>
+            <w:tcW w:w="4819" w:type="dxa"/>
+            <w:tcBorders>
+              <w:top w:val="single" w:sz="6" w:space="0" w:color="B8C9D9"/>
+              <w:left w:val="single" w:sz="6" w:space="0" w:color="B8C9D9"/>
+              <w:bottom w:val="single" w:sz="6" w:space="0" w:color="B8C9D9"/>
+              <w:right w:val="single" w:sz="6" w:space="0" w:color="B8C9D9"/>
+            </w:tcBorders>
+            <w:tcMar>
+              <w:top w:w="110" w:type="dxa"/>
+              <w:left w:w="130" w:type="dxa"/>
+              <w:bottom w:w="110" w:type="dxa"/>
+              <w:right w:w="130" w:type="dxa"/>
+            </w:tcMar>
+          </w:tcPr>
+          <w:p>
+            <w:pPr>
+              <w:spacing w:line="264" w:lineRule="auto"/>
+            </w:pPr>
+            <w:r>
+              <w:rPr>
+                <w:rFonts w:ascii="Aptos" w:hAnsi="Aptos" w:cs="Aptos"/>
+                <w:noProof/>
+                <w:color w:val="1F1F1F"/>
+              </w:rPr>
+              <w:t>{{ASIS_GAPS_LIST}}</w:t>
+            </w:r>
+          </w:p>
+        </w:tc>
+      </w:tr>
+    </w:tbl>
+    <w:p>
+      <w:pPr>
+        <w:spacing w:after="100"/>
+      </w:pPr>
+    </w:p>
+    <w:tbl>
+      <w:tblPr>
+        <w:tblW w:w="0" w:type="auto"/>
+        <w:jc w:val="center"/>
+        <w:tblLayout w:type="fixed"/>
+        <w:tblLook w:val="04A0" w:firstRow="1" w:lastRow="0" w:firstColumn="1" w:lastColumn="0" w:noHBand="0" w:noVBand="1"/>
+      </w:tblPr>
+      <w:tblGrid>
+        <w:gridCol w:w="9638"/>
+      </w:tblGrid>
+      <w:tr>
+        <w:trPr>
+          <w:jc w:val="center"/>
+        </w:trPr>
+        <w:tc>
+          <w:tcPr>
+            <w:tcW w:w="9638" w:type="dxa"/>
+            <w:tcBorders>
+              <w:top w:val="single" w:sz="6" w:space="0" w:color="B8C9D9"/>
+              <w:left w:val="single" w:sz="6" w:space="0" w:color="B8C9D9"/>
+              <w:bottom w:val="single" w:sz="6" w:space="0" w:color="B8C9D9"/>
+              <w:right w:val="single" w:sz="6" w:space="0" w:color="B8C9D9"/>
+            </w:tcBorders>
+            <w:shd w:val="clear" w:color="auto" w:fill="CFE2F3"/>
+            <w:tcMar>
+              <w:top w:w="80" w:type="dxa"/>
+              <w:left w:w="100" w:type="dxa"/>
+              <w:bottom w:w="80" w:type="dxa"/>
+              <w:right w:w="100" w:type="dxa"/>
+            </w:tcMar>
+          </w:tcPr>
+          <w:p>
+            <w:pPr>
+              <w:spacing w:before="120" w:after="80"/>
+            </w:pPr>
+            <w:r>
+              <w:rPr>
+                <w:rFonts w:ascii="Aptos" w:hAnsi="Aptos" w:cs="Aptos"/>
+                <w:b/>
+                <w:noProof/>
+                <w:color w:val="0070C0"/>
+              </w:rPr>
+              <w:t>Implicaciones operativas clave</w:t>
+            </w:r>
+          </w:p>
+        </w:tc>
+      </w:tr>
+      <w:tr>
+        <w:trPr>
+          <w:jc w:val="center"/>
+        </w:trPr>
+        <w:tc>
+          <w:tcPr>
+            <w:tcW w:w="9638" w:type="dxa"/>
             <w:tcBorders>
               <w:top w:val="single" w:sz="6" w:space="0" w:color="B8C9D9"/>
               <w:left w:val="single" w:sz="6" w:space="0" w:color="B8C9D9"/>
@@ -78,34 +855,172 @@
             </w:tcBorders>
             <w:tcMar>
               <w:top w:w="80" w:type="dxa"/>
-              <w:start w:w="100" w:type="dxa"/>
+              <w:left w:w="100" w:type="dxa"/>
               <w:bottom w:w="80" w:type="dxa"/>
-              <w:end w:w="100" w:type="dxa"/>
+              <w:right w:w="100" w:type="dxa"/>
             </w:tcMar>
-            <w:vAlign w:val="center"/>
-            <w:shd w:fill="CFE2F3"/>
           </w:tcPr>
           <w:p>
             <w:pPr>
-              <w:spacing w:before="0" w:after="0" w:line="240" w:lineRule="auto"/>
-              <w:jc w:val="center"/>
+              <w:spacing w:line="264" w:lineRule="auto"/>
+            </w:pPr>
+            <w:r>
+              <w:rPr>
+                <w:rFonts w:ascii="Aptos" w:hAnsi="Aptos" w:cs="Aptos"/>
+                <w:noProof/>
+                <w:color w:val="1F1F1F"/>
+              </w:rPr>
+              <w:t>{{ASIS_OPERATIONAL_IMPACTS_LIST}}</w:t>
+            </w:r>
+          </w:p>
+        </w:tc>
+      </w:tr>
+    </w:tbl>
+    <w:p>
+      <w:pPr>
+        <w:keepNext/>
+        <w:pageBreakBefore/>
+        <w:spacing w:after="160"/>
+      </w:pPr>
+      <w:r>
+        <w:rPr>
+          <w:rFonts w:ascii="Aptos" w:hAnsi="Aptos" w:cs="Aptos"/>
+          <w:b/>
+          <w:noProof/>
+          <w:color w:val="0070C0"/>
+          <w:sz w:val="34"/>
+        </w:rPr>
+        <w:lastRenderedPageBreak/>
+        <w:t>Riesgos principales</w:t>
+      </w:r>
+    </w:p>
+    <w:p>
+      <w:pPr>
+        <w:spacing w:after="160" w:line="276" w:lineRule="auto"/>
+        <w:jc w:val="both"/>
+      </w:pPr>
+      <w:r>
+        <w:rPr>
+          <w:rFonts w:ascii="Aptos" w:hAnsi="Aptos" w:cs="Aptos"/>
+          <w:noProof/>
+          <w:color w:val="1F1F1F"/>
+        </w:rPr>
+        <w:t>{{RISKS_INTRO}}</w:t>
+      </w:r>
+    </w:p>
+    <w:p>
+      <w:r>
+        <w:rPr>
+          <w:rFonts w:ascii="Aptos" w:hAnsi="Aptos" w:cs="Aptos"/>
+          <w:noProof/>
+          <w:color w:val="1F1F1F"/>
+        </w:rPr>
+        <w:t>{{RISKS_TABLE}}</w:t>
+      </w:r>
+    </w:p>
+    <w:p>
+      <w:pPr>
+        <w:spacing w:after="100"/>
+      </w:pPr>
+    </w:p>
+    <w:p>
+      <w:pPr>
+        <w:spacing w:line="276" w:lineRule="auto"/>
+        <w:jc w:val="both"/>
+      </w:pPr>
+      <w:r>
+        <w:rPr>
+          <w:rFonts w:ascii="Aptos" w:hAnsi="Aptos" w:cs="Aptos"/>
+          <w:noProof/>
+          <w:color w:val="1F1F1F"/>
+        </w:rPr>
+        <w:t>{{RISKS_CLOSING}}</w:t>
+      </w:r>
+    </w:p>
+    <w:p>
+      <w:pPr>
+        <w:keepNext/>
+        <w:spacing w:before="360" w:after="160"/>
+      </w:pPr>
+      <w:r>
+        <w:rPr>
+          <w:rFonts w:ascii="Aptos" w:hAnsi="Aptos" w:cs="Aptos"/>
+          <w:b/>
+          <w:noProof/>
+          <w:color w:val="0070C0"/>
+          <w:sz w:val="34"/>
+        </w:rPr>
+        <w:t>Estado objetivo y brechas</w:t>
+      </w:r>
+    </w:p>
+    <w:p>
+      <w:pPr>
+        <w:spacing w:after="160" w:line="276" w:lineRule="auto"/>
+        <w:jc w:val="both"/>
+      </w:pPr>
+      <w:r>
+        <w:rPr>
+          <w:rFonts w:ascii="Aptos" w:hAnsi="Aptos" w:cs="Aptos"/>
+          <w:noProof/>
+          <w:color w:val="1F1F1F"/>
+        </w:rPr>
+        <w:t>{{TOBE_INTRO}}</w:t>
+      </w:r>
+    </w:p>
+    <w:tbl>
+      <w:tblPr>
+        <w:tblW w:w="0" w:type="auto"/>
+        <w:jc w:val="center"/>
+        <w:tblLayout w:type="fixed"/>
+        <w:tblLook w:val="04A0" w:firstRow="1" w:lastRow="0" w:firstColumn="1" w:lastColumn="0" w:noHBand="0" w:noVBand="1"/>
+      </w:tblPr>
+      <w:tblGrid>
+        <w:gridCol w:w="9638"/>
+      </w:tblGrid>
+      <w:tr>
+        <w:trPr>
+          <w:jc w:val="center"/>
+        </w:trPr>
+        <w:tc>
+          <w:tcPr>
+            <w:tcW w:w="9638" w:type="dxa"/>
+            <w:tcBorders>
+              <w:top w:val="single" w:sz="6" w:space="0" w:color="B8C9D9"/>
+              <w:left w:val="single" w:sz="6" w:space="0" w:color="B8C9D9"/>
+              <w:bottom w:val="single" w:sz="6" w:space="0" w:color="B8C9D9"/>
+              <w:right w:val="single" w:sz="6" w:space="0" w:color="B8C9D9"/>
+            </w:tcBorders>
+            <w:shd w:val="clear" w:color="auto" w:fill="CFE2F3"/>
+            <w:tcMar>
+              <w:top w:w="80" w:type="dxa"/>
+              <w:left w:w="100" w:type="dxa"/>
+              <w:bottom w:w="80" w:type="dxa"/>
+              <w:right w:w="100" w:type="dxa"/>
+            </w:tcMar>
+          </w:tcPr>
+          <w:p>
+            <w:pPr>
+              <w:spacing w:before="120" w:after="80"/>
             </w:pPr>
             <w:r>
               <w:rPr>
                 <w:rFonts w:ascii="Aptos" w:hAnsi="Aptos" w:cs="Aptos"/>
                 <w:b/>
-                <w:i w:val="0"/>
+                <w:noProof/>
                 <w:color w:val="0070C0"/>
-                <w:sz w:val="21"/>
-                <w:noProof/>
               </w:rPr>
-              <w:t>SCORE ACTUAL</w:t>
+              <w:t>Principios / capacidades objetivo</w:t>
             </w:r>
           </w:p>
         </w:tc>
+      </w:tr>
+      <w:tr>
+        <w:trPr>
+          <w:jc w:val="center"/>
+        </w:trPr>
         <w:tc>
           <w:tcPr>
-            <w:tcW w:type="dxa" w:w="3175"/>
+            <w:tcW w:w="9638" w:type="dxa"/>
             <w:tcBorders>
               <w:top w:val="single" w:sz="6" w:space="0" w:color="B8C9D9"/>
               <w:left w:val="single" w:sz="6" w:space="0" w:color="B8C9D9"/>
@@ -114,34 +1029,197 @@
             </w:tcBorders>
             <w:tcMar>
               <w:top w:w="80" w:type="dxa"/>
-              <w:start w:w="100" w:type="dxa"/>
+              <w:left w:w="100" w:type="dxa"/>
               <w:bottom w:w="80" w:type="dxa"/>
-              <w:end w:w="100" w:type="dxa"/>
+              <w:right w:w="100" w:type="dxa"/>
             </w:tcMar>
-            <w:vAlign w:val="center"/>
-            <w:shd w:fill="CFE2F3"/>
           </w:tcPr>
           <w:p>
             <w:pPr>
-              <w:spacing w:before="0" w:after="0" w:line="240" w:lineRule="auto"/>
-              <w:jc w:val="center"/>
+              <w:spacing w:line="264" w:lineRule="auto"/>
+            </w:pPr>
+            <w:r>
+              <w:rPr>
+                <w:rFonts w:ascii="Aptos" w:hAnsi="Aptos" w:cs="Aptos"/>
+                <w:noProof/>
+                <w:color w:val="1F1F1F"/>
+              </w:rPr>
+              <w:t>{{TARGET_CAPABILITIES_LIST}}</w:t>
+            </w:r>
+          </w:p>
+        </w:tc>
+      </w:tr>
+    </w:tbl>
+    <w:p>
+      <w:pPr>
+        <w:spacing w:after="100"/>
+      </w:pPr>
+    </w:p>
+    <w:p>
+      <w:pPr>
+        <w:keepNext/>
+        <w:spacing w:before="120" w:after="120"/>
+      </w:pPr>
+      <w:r>
+        <w:rPr>
+          <w:rFonts w:ascii="Aptos" w:hAnsi="Aptos" w:cs="Aptos"/>
+          <w:b/>
+          <w:noProof/>
+          <w:color w:val="0070C0"/>
+        </w:rPr>
+        <w:t>Tabla de brechas por pilar</w:t>
+      </w:r>
+    </w:p>
+    <w:p>
+      <w:r>
+        <w:rPr>
+          <w:rFonts w:ascii="Aptos" w:hAnsi="Aptos" w:cs="Aptos"/>
+          <w:noProof/>
+          <w:color w:val="1F1F1F"/>
+        </w:rPr>
+        <w:t>{{GAP_TABLE}}</w:t>
+      </w:r>
+    </w:p>
+    <w:p>
+      <w:pPr>
+        <w:keepNext/>
+        <w:spacing w:before="360" w:after="160"/>
+      </w:pPr>
+      <w:r>
+        <w:rPr>
+          <w:rFonts w:ascii="Aptos" w:hAnsi="Aptos" w:cs="Aptos"/>
+          <w:b/>
+          <w:noProof/>
+          <w:color w:val="0070C0"/>
+          <w:sz w:val="34"/>
+        </w:rPr>
+        <w:t>Iniciativas prioritarias</w:t>
+      </w:r>
+    </w:p>
+    <w:p>
+      <w:pPr>
+        <w:spacing w:after="160" w:line="276" w:lineRule="auto"/>
+        <w:jc w:val="both"/>
+      </w:pPr>
+      <w:r>
+        <w:rPr>
+          <w:rFonts w:ascii="Aptos" w:hAnsi="Aptos" w:cs="Aptos"/>
+          <w:noProof/>
+          <w:color w:val="1F1F1F"/>
+        </w:rPr>
+        <w:t>{{TODO_INTRO}}</w:t>
+      </w:r>
+    </w:p>
+    <w:p>
+      <w:pPr>
+        <w:keepNext/>
+        <w:spacing w:before="120" w:after="120"/>
+      </w:pPr>
+      <w:r>
+        <w:rPr>
+          <w:rFonts w:ascii="Aptos" w:hAnsi="Aptos" w:cs="Aptos"/>
+          <w:b/>
+          <w:noProof/>
+          <w:color w:val="0070C0"/>
+        </w:rPr>
+        <w:t>Fichas de iniciativas priorizadas</w:t>
+      </w:r>
+    </w:p>
+    <w:p>
+      <w:r>
+        <w:rPr>
+          <w:rFonts w:ascii="Aptos" w:hAnsi="Aptos" w:cs="Aptos"/>
+          <w:noProof/>
+          <w:color w:val="1F1F1F"/>
+        </w:rPr>
+        <w:t>{{PRIORITY_INITIATIVES_CARDS}}</w:t>
+      </w:r>
+    </w:p>
+    <w:p>
+      <w:pPr>
+        <w:keepNext/>
+        <w:spacing w:before="120" w:after="120"/>
+      </w:pPr>
+      <w:r>
+        <w:rPr>
+          <w:rFonts w:ascii="Aptos" w:hAnsi="Aptos" w:cs="Aptos"/>
+          <w:b/>
+          <w:noProof/>
+          <w:color w:val="0070C0"/>
+          <w:sz w:val="34"/>
+        </w:rPr>
+        <w:t>Conclusión</w:t>
+      </w:r>
+    </w:p>
+    <w:p>
+      <w:pPr>
+        <w:spacing w:after="160" w:line="276" w:lineRule="auto"/>
+        <w:jc w:val="both"/>
+      </w:pPr>
+      <w:r>
+        <w:rPr>
+          <w:rFonts w:ascii="Aptos" w:hAnsi="Aptos" w:cs="Aptos"/>
+          <w:noProof/>
+          <w:color w:val="1F1F1F"/>
+        </w:rPr>
+        <w:t>{{FINAL_ASSESSMENT}}</w:t>
+      </w:r>
+    </w:p>
+    <w:tbl>
+      <w:tblPr>
+        <w:tblW w:w="0" w:type="auto"/>
+        <w:jc w:val="center"/>
+        <w:tblLayout w:type="fixed"/>
+        <w:tblLook w:val="04A0" w:firstRow="1" w:lastRow="0" w:firstColumn="1" w:lastColumn="0" w:noHBand="0" w:noVBand="1"/>
+      </w:tblPr>
+      <w:tblGrid>
+        <w:gridCol w:w="9638"/>
+      </w:tblGrid>
+      <w:tr>
+        <w:trPr>
+          <w:jc w:val="center"/>
+        </w:trPr>
+        <w:tc>
+          <w:tcPr>
+            <w:tcW w:w="9638" w:type="dxa"/>
+            <w:tcBorders>
+              <w:top w:val="single" w:sz="6" w:space="0" w:color="B8C9D9"/>
+              <w:left w:val="single" w:sz="6" w:space="0" w:color="B8C9D9"/>
+              <w:bottom w:val="single" w:sz="6" w:space="0" w:color="B8C9D9"/>
+              <w:right w:val="single" w:sz="6" w:space="0" w:color="B8C9D9"/>
+            </w:tcBorders>
+            <w:shd w:val="clear" w:color="auto" w:fill="CFE2F3"/>
+            <w:tcMar>
+              <w:top w:w="80" w:type="dxa"/>
+              <w:left w:w="100" w:type="dxa"/>
+              <w:bottom w:w="80" w:type="dxa"/>
+              <w:right w:w="100" w:type="dxa"/>
+            </w:tcMar>
+            <w:vAlign w:val="center"/>
+          </w:tcPr>
+          <w:p>
+            <w:pPr>
+              <w:spacing w:before="120" w:after="80"/>
             </w:pPr>
             <w:r>
               <w:rPr>
                 <w:rFonts w:ascii="Aptos" w:hAnsi="Aptos" w:cs="Aptos"/>
                 <w:b/>
-                <w:i w:val="0"/>
+                <w:noProof/>
                 <w:color w:val="0070C0"/>
-                <w:sz w:val="21"/>
-                <w:noProof/>
               </w:rPr>
-              <w:t>BANDA DE MADUREZ</w:t>
+              <w:t>Mensaje ejecutivo final</w:t>
             </w:r>
           </w:p>
         </w:tc>
+      </w:tr>
+      <w:tr>
+        <w:trPr>
+          <w:jc w:val="center"/>
+        </w:trPr>
         <w:tc>
           <w:tcPr>
-            <w:tcW w:type="dxa" w:w="3175"/>
+            <w:tcW w:w="9638" w:type="dxa"/>
             <w:tcBorders>
               <w:top w:val="single" w:sz="6" w:space="0" w:color="B8C9D9"/>
               <w:left w:val="single" w:sz="6" w:space="0" w:color="B8C9D9"/>
@@ -150,36 +1228,87 @@
             </w:tcBorders>
             <w:tcMar>
               <w:top w:w="80" w:type="dxa"/>
-              <w:start w:w="100" w:type="dxa"/>
+              <w:left w:w="100" w:type="dxa"/>
               <w:bottom w:w="80" w:type="dxa"/>
-              <w:end w:w="100" w:type="dxa"/>
+              <w:right w:w="100" w:type="dxa"/>
             </w:tcMar>
             <w:vAlign w:val="center"/>
-            <w:shd w:fill="CFE2F3"/>
           </w:tcPr>
           <w:p>
             <w:pPr>
-              <w:spacing w:before="0" w:after="0" w:line="240" w:lineRule="auto"/>
-              <w:jc w:val="center"/>
+              <w:spacing w:line="264" w:lineRule="auto"/>
+            </w:pPr>
+            <w:r>
+              <w:rPr>
+                <w:rFonts w:ascii="Aptos" w:hAnsi="Aptos" w:cs="Aptos"/>
+                <w:noProof/>
+                <w:color w:val="1F1F1F"/>
+              </w:rPr>
+              <w:t>{{EXECUTIVE_MESSAGE}}</w:t>
+            </w:r>
+          </w:p>
+        </w:tc>
+      </w:tr>
+    </w:tbl>
+    <w:p>
+      <w:pPr>
+        <w:spacing w:after="100"/>
+      </w:pPr>
+    </w:p>
+    <w:tbl>
+      <w:tblPr>
+        <w:tblW w:w="0" w:type="auto"/>
+        <w:jc w:val="center"/>
+        <w:tblLayout w:type="fixed"/>
+        <w:tblLook w:val="04A0" w:firstRow="1" w:lastRow="0" w:firstColumn="1" w:lastColumn="0" w:noHBand="0" w:noVBand="1"/>
+      </w:tblPr>
+      <w:tblGrid>
+        <w:gridCol w:w="9638"/>
+      </w:tblGrid>
+      <w:tr>
+        <w:trPr>
+          <w:jc w:val="center"/>
+        </w:trPr>
+        <w:tc>
+          <w:tcPr>
+            <w:tcW w:w="9638" w:type="dxa"/>
+            <w:tcBorders>
+              <w:top w:val="single" w:sz="6" w:space="0" w:color="B8C9D9"/>
+              <w:left w:val="single" w:sz="6" w:space="0" w:color="B8C9D9"/>
+              <w:bottom w:val="single" w:sz="6" w:space="0" w:color="B8C9D9"/>
+              <w:right w:val="single" w:sz="6" w:space="0" w:color="B8C9D9"/>
+            </w:tcBorders>
+            <w:shd w:val="clear" w:color="auto" w:fill="CFE2F3"/>
+            <w:tcMar>
+              <w:top w:w="80" w:type="dxa"/>
+              <w:left w:w="100" w:type="dxa"/>
+              <w:bottom w:w="80" w:type="dxa"/>
+              <w:right w:w="100" w:type="dxa"/>
+            </w:tcMar>
+          </w:tcPr>
+          <w:p>
+            <w:pPr>
+              <w:spacing w:before="120" w:after="80"/>
             </w:pPr>
             <w:r>
               <w:rPr>
                 <w:rFonts w:ascii="Aptos" w:hAnsi="Aptos" w:cs="Aptos"/>
                 <w:b/>
-                <w:i w:val="0"/>
+                <w:noProof/>
                 <w:color w:val="0070C0"/>
-                <w:sz w:val="21"/>
-                <w:noProof/>
               </w:rPr>
-              <w:t>MADUREZ OBJETIVO</w:t>
+              <w:t>Áreas prioritarias de actuación</w:t>
             </w:r>
           </w:p>
         </w:tc>
       </w:tr>
       <w:tr>
+        <w:trPr>
+          <w:jc w:val="center"/>
+        </w:trPr>
         <w:tc>
           <w:tcPr>
-            <w:tcW w:type="dxa" w:w="3175"/>
+            <w:tcW w:w="9638" w:type="dxa"/>
             <w:tcBorders>
               <w:top w:val="single" w:sz="6" w:space="0" w:color="B8C9D9"/>
               <w:left w:val="single" w:sz="6" w:space="0" w:color="B8C9D9"/>
@@ -188,1292 +1317,20 @@
             </w:tcBorders>
             <w:tcMar>
               <w:top w:w="80" w:type="dxa"/>
-              <w:start w:w="100" w:type="dxa"/>
+              <w:left w:w="100" w:type="dxa"/>
               <w:bottom w:w="80" w:type="dxa"/>
-              <w:end w:w="100" w:type="dxa"/>
+              <w:right w:w="100" w:type="dxa"/>
             </w:tcMar>
-            <w:vAlign w:val="center"/>
-            <w:shd w:fill="FFFFFF"/>
           </w:tcPr>
           <w:p>
             <w:pPr>
-              <w:spacing w:before="40" w:after="40" w:line="240" w:lineRule="auto"/>
-              <w:jc w:val="center"/>
+              <w:spacing w:line="264" w:lineRule="auto"/>
             </w:pPr>
             <w:r>
               <w:rPr>
                 <w:rFonts w:ascii="Aptos" w:hAnsi="Aptos" w:cs="Aptos"/>
-                <w:b w:val="0"/>
-                <w:i w:val="0"/>
+                <w:noProof/>
                 <w:color w:val="1F1F1F"/>
-                <w:sz w:val="28"/>
-                <w:noProof/>
-              </w:rPr>
-              <w:t>{{GLOBAL_SCORE}}</w:t>
-            </w:r>
-          </w:p>
-        </w:tc>
-        <w:tc>
-          <w:tcPr>
-            <w:tcW w:type="dxa" w:w="3175"/>
-            <w:tcBorders>
-              <w:top w:val="single" w:sz="6" w:space="0" w:color="B8C9D9"/>
-              <w:left w:val="single" w:sz="6" w:space="0" w:color="B8C9D9"/>
-              <w:bottom w:val="single" w:sz="6" w:space="0" w:color="B8C9D9"/>
-              <w:right w:val="single" w:sz="6" w:space="0" w:color="B8C9D9"/>
-            </w:tcBorders>
-            <w:tcMar>
-              <w:top w:w="80" w:type="dxa"/>
-              <w:start w:w="100" w:type="dxa"/>
-              <w:bottom w:w="80" w:type="dxa"/>
-              <w:end w:w="100" w:type="dxa"/>
-            </w:tcMar>
-            <w:vAlign w:val="center"/>
-            <w:shd w:fill="FFFFFF"/>
-          </w:tcPr>
-          <w:p>
-            <w:pPr>
-              <w:spacing w:before="40" w:after="40" w:line="240" w:lineRule="auto"/>
-              <w:jc w:val="center"/>
-            </w:pPr>
-            <w:r>
-              <w:rPr>
-                <w:rFonts w:ascii="Aptos" w:hAnsi="Aptos" w:cs="Aptos"/>
-                <w:b w:val="0"/>
-                <w:i w:val="0"/>
-                <w:color w:val="1F1F1F"/>
-                <w:sz w:val="28"/>
-                <w:noProof/>
-              </w:rPr>
-              <w:t>{{GLOBAL_BAND}}</w:t>
-            </w:r>
-          </w:p>
-        </w:tc>
-        <w:tc>
-          <w:tcPr>
-            <w:tcW w:type="dxa" w:w="3175"/>
-            <w:tcBorders>
-              <w:top w:val="single" w:sz="6" w:space="0" w:color="B8C9D9"/>
-              <w:left w:val="single" w:sz="6" w:space="0" w:color="B8C9D9"/>
-              <w:bottom w:val="single" w:sz="6" w:space="0" w:color="B8C9D9"/>
-              <w:right w:val="single" w:sz="6" w:space="0" w:color="B8C9D9"/>
-            </w:tcBorders>
-            <w:tcMar>
-              <w:top w:w="80" w:type="dxa"/>
-              <w:start w:w="100" w:type="dxa"/>
-              <w:bottom w:w="80" w:type="dxa"/>
-              <w:end w:w="100" w:type="dxa"/>
-            </w:tcMar>
-            <w:vAlign w:val="center"/>
-            <w:shd w:fill="FFFFFF"/>
-          </w:tcPr>
-          <w:p>
-            <w:pPr>
-              <w:spacing w:before="40" w:after="40" w:line="240" w:lineRule="auto"/>
-              <w:jc w:val="center"/>
-            </w:pPr>
-            <w:r>
-              <w:rPr>
-                <w:rFonts w:ascii="Aptos" w:hAnsi="Aptos" w:cs="Aptos"/>
-                <w:b w:val="0"/>
-                <w:i w:val="0"/>
-                <w:color w:val="1F1F1F"/>
-                <w:sz w:val="28"/>
-                <w:noProof/>
-              </w:rPr>
-              <w:t>{{TARGET_MATURITY}}</w:t>
-            </w:r>
-          </w:p>
-        </w:tc>
-      </w:tr>
-    </w:tbl>
-    <w:p>
-      <w:pPr>
-        <w:spacing w:before="0" w:after="0" w:line="240" w:lineRule="auto"/>
-      </w:pPr>
-    </w:p>
-    <w:p>
-      <w:pPr>
-        <w:spacing w:before="0" w:after="160" w:line="276" w:lineRule="auto"/>
-        <w:jc w:val="both"/>
-      </w:pPr>
-      <w:r>
-        <w:rPr>
-          <w:rFonts w:ascii="Aptos" w:hAnsi="Aptos" w:cs="Aptos"/>
-          <w:b w:val="0"/>
-          <w:i w:val="0"/>
-          <w:color w:val="1F1F1F"/>
-          <w:sz w:val="21"/>
-          <w:noProof/>
-        </w:rPr>
-        <w:t>{{EXEC_SUMMARY_BODY}}</w:t>
-      </w:r>
-    </w:p>
-    <w:tbl>
-      <w:tblPr>
-        <w:tblW w:type="auto" w:w="0"/>
-        <w:jc w:val="center"/>
-        <w:tblLayout w:type="fixed"/>
-        <w:tblLook w:firstColumn="1" w:firstRow="1" w:lastColumn="0" w:lastRow="0" w:noHBand="0" w:noVBand="1" w:val="04A0"/>
-      </w:tblPr>
-      <w:tblGrid>
-        <w:gridCol w:w="4819"/>
-        <w:gridCol w:w="4819"/>
-      </w:tblGrid>
-      <w:tr>
-        <w:tc>
-          <w:tcPr>
-            <w:tcW w:type="dxa" w:w="2551"/>
-            <w:tcBorders>
-              <w:top w:val="single" w:sz="6" w:space="0" w:color="B8C9D9"/>
-              <w:left w:val="single" w:sz="6" w:space="0" w:color="B8C9D9"/>
-              <w:bottom w:val="single" w:sz="6" w:space="0" w:color="B8C9D9"/>
-              <w:right w:val="single" w:sz="6" w:space="0" w:color="B8C9D9"/>
-            </w:tcBorders>
-            <w:tcMar>
-              <w:top w:w="80" w:type="dxa"/>
-              <w:start w:w="100" w:type="dxa"/>
-              <w:bottom w:w="80" w:type="dxa"/>
-              <w:end w:w="100" w:type="dxa"/>
-            </w:tcMar>
-            <w:vAlign w:val="center"/>
-            <w:shd w:fill="F6FAFD"/>
-          </w:tcPr>
-          <w:p>
-            <w:pPr>
-              <w:spacing w:before="0" w:after="0" w:line="240" w:lineRule="auto"/>
-              <w:jc w:val="left"/>
-            </w:pPr>
-            <w:r>
-              <w:rPr>
-                <w:rFonts w:ascii="Aptos" w:hAnsi="Aptos" w:cs="Aptos"/>
-                <w:b/>
-                <w:i w:val="0"/>
-                <w:color w:val="0070C0"/>
-                <w:sz w:val="20"/>
-                <w:noProof/>
-              </w:rPr>
-              <w:t>Fortaleza principal</w:t>
-            </w:r>
-          </w:p>
-        </w:tc>
-        <w:tc>
-          <w:tcPr>
-            <w:tcW w:type="dxa" w:w="7087"/>
-            <w:tcBorders>
-              <w:top w:val="single" w:sz="6" w:space="0" w:color="B8C9D9"/>
-              <w:left w:val="single" w:sz="6" w:space="0" w:color="B8C9D9"/>
-              <w:bottom w:val="single" w:sz="6" w:space="0" w:color="B8C9D9"/>
-              <w:right w:val="single" w:sz="6" w:space="0" w:color="B8C9D9"/>
-            </w:tcBorders>
-            <w:tcMar>
-              <w:top w:w="80" w:type="dxa"/>
-              <w:start w:w="100" w:type="dxa"/>
-              <w:bottom w:w="80" w:type="dxa"/>
-              <w:end w:w="100" w:type="dxa"/>
-            </w:tcMar>
-            <w:vAlign w:val="center"/>
-            <w:shd w:fill="FFFFFF"/>
-          </w:tcPr>
-          <w:p>
-            <w:pPr>
-              <w:spacing w:before="0" w:after="0" w:line="269" w:lineRule="auto"/>
-              <w:jc w:val="left"/>
-            </w:pPr>
-            <w:r>
-              <w:rPr>
-                <w:rFonts w:ascii="Aptos" w:hAnsi="Aptos" w:cs="Aptos"/>
-                <w:b w:val="0"/>
-                <w:i w:val="0"/>
-                <w:color w:val="1F1F1F"/>
-                <w:sz w:val="21"/>
-                <w:noProof/>
-              </w:rPr>
-              <w:t>{{MSG_STRENGTH_VALUE}}</w:t>
-            </w:r>
-          </w:p>
-        </w:tc>
-      </w:tr>
-      <w:tr>
-        <w:tc>
-          <w:tcPr>
-            <w:tcW w:type="dxa" w:w="2551"/>
-            <w:tcBorders>
-              <w:top w:val="single" w:sz="6" w:space="0" w:color="B8C9D9"/>
-              <w:left w:val="single" w:sz="6" w:space="0" w:color="B8C9D9"/>
-              <w:bottom w:val="single" w:sz="6" w:space="0" w:color="B8C9D9"/>
-              <w:right w:val="single" w:sz="6" w:space="0" w:color="B8C9D9"/>
-            </w:tcBorders>
-            <w:tcMar>
-              <w:top w:w="80" w:type="dxa"/>
-              <w:start w:w="100" w:type="dxa"/>
-              <w:bottom w:w="80" w:type="dxa"/>
-              <w:end w:w="100" w:type="dxa"/>
-            </w:tcMar>
-            <w:vAlign w:val="center"/>
-            <w:shd w:fill="F6FAFD"/>
-          </w:tcPr>
-          <w:p>
-            <w:pPr>
-              <w:spacing w:before="0" w:after="0" w:line="240" w:lineRule="auto"/>
-              <w:jc w:val="left"/>
-            </w:pPr>
-            <w:r>
-              <w:rPr>
-                <w:rFonts w:ascii="Aptos" w:hAnsi="Aptos" w:cs="Aptos"/>
-                <w:b/>
-                <w:i w:val="0"/>
-                <w:color w:val="0070C0"/>
-                <w:sz w:val="20"/>
-                <w:noProof/>
-              </w:rPr>
-              <w:t>Brecha principal</w:t>
-            </w:r>
-          </w:p>
-        </w:tc>
-        <w:tc>
-          <w:tcPr>
-            <w:tcW w:type="dxa" w:w="7087"/>
-            <w:tcBorders>
-              <w:top w:val="single" w:sz="6" w:space="0" w:color="B8C9D9"/>
-              <w:left w:val="single" w:sz="6" w:space="0" w:color="B8C9D9"/>
-              <w:bottom w:val="single" w:sz="6" w:space="0" w:color="B8C9D9"/>
-              <w:right w:val="single" w:sz="6" w:space="0" w:color="B8C9D9"/>
-            </w:tcBorders>
-            <w:tcMar>
-              <w:top w:w="80" w:type="dxa"/>
-              <w:start w:w="100" w:type="dxa"/>
-              <w:bottom w:w="80" w:type="dxa"/>
-              <w:end w:w="100" w:type="dxa"/>
-            </w:tcMar>
-            <w:vAlign w:val="center"/>
-            <w:shd w:fill="FFFFFF"/>
-          </w:tcPr>
-          <w:p>
-            <w:pPr>
-              <w:spacing w:before="0" w:after="0" w:line="269" w:lineRule="auto"/>
-              <w:jc w:val="left"/>
-            </w:pPr>
-            <w:r>
-              <w:rPr>
-                <w:rFonts w:ascii="Aptos" w:hAnsi="Aptos" w:cs="Aptos"/>
-                <w:b w:val="0"/>
-                <w:i w:val="0"/>
-                <w:color w:val="1F1F1F"/>
-                <w:sz w:val="21"/>
-                <w:noProof/>
-              </w:rPr>
-              <w:t>{{MSG_GAP_VALUE}}</w:t>
-            </w:r>
-          </w:p>
-        </w:tc>
-      </w:tr>
-      <w:tr>
-        <w:tc>
-          <w:tcPr>
-            <w:tcW w:type="dxa" w:w="2551"/>
-            <w:tcBorders>
-              <w:top w:val="single" w:sz="6" w:space="0" w:color="B8C9D9"/>
-              <w:left w:val="single" w:sz="6" w:space="0" w:color="B8C9D9"/>
-              <w:bottom w:val="single" w:sz="6" w:space="0" w:color="B8C9D9"/>
-              <w:right w:val="single" w:sz="6" w:space="0" w:color="B8C9D9"/>
-            </w:tcBorders>
-            <w:tcMar>
-              <w:top w:w="80" w:type="dxa"/>
-              <w:start w:w="100" w:type="dxa"/>
-              <w:bottom w:w="80" w:type="dxa"/>
-              <w:end w:w="100" w:type="dxa"/>
-            </w:tcMar>
-            <w:vAlign w:val="center"/>
-            <w:shd w:fill="F6FAFD"/>
-          </w:tcPr>
-          <w:p>
-            <w:pPr>
-              <w:spacing w:before="0" w:after="0" w:line="240" w:lineRule="auto"/>
-              <w:jc w:val="left"/>
-            </w:pPr>
-            <w:r>
-              <w:rPr>
-                <w:rFonts w:ascii="Aptos" w:hAnsi="Aptos" w:cs="Aptos"/>
-                <w:b/>
-                <w:i w:val="0"/>
-                <w:color w:val="0070C0"/>
-                <w:sz w:val="20"/>
-                <w:noProof/>
-              </w:rPr>
-              <w:t>Cuello de botella</w:t>
-            </w:r>
-          </w:p>
-        </w:tc>
-        <w:tc>
-          <w:tcPr>
-            <w:tcW w:type="dxa" w:w="7087"/>
-            <w:tcBorders>
-              <w:top w:val="single" w:sz="6" w:space="0" w:color="B8C9D9"/>
-              <w:left w:val="single" w:sz="6" w:space="0" w:color="B8C9D9"/>
-              <w:bottom w:val="single" w:sz="6" w:space="0" w:color="B8C9D9"/>
-              <w:right w:val="single" w:sz="6" w:space="0" w:color="B8C9D9"/>
-            </w:tcBorders>
-            <w:tcMar>
-              <w:top w:w="80" w:type="dxa"/>
-              <w:start w:w="100" w:type="dxa"/>
-              <w:bottom w:w="80" w:type="dxa"/>
-              <w:end w:w="100" w:type="dxa"/>
-            </w:tcMar>
-            <w:vAlign w:val="center"/>
-            <w:shd w:fill="FFFFFF"/>
-          </w:tcPr>
-          <w:p>
-            <w:pPr>
-              <w:spacing w:before="0" w:after="0" w:line="269" w:lineRule="auto"/>
-              <w:jc w:val="left"/>
-            </w:pPr>
-            <w:r>
-              <w:rPr>
-                <w:rFonts w:ascii="Aptos" w:hAnsi="Aptos" w:cs="Aptos"/>
-                <w:b w:val="0"/>
-                <w:i w:val="0"/>
-                <w:color w:val="1F1F1F"/>
-                <w:sz w:val="21"/>
-                <w:noProof/>
-              </w:rPr>
-              <w:t>{{MSG_BOTTLENECK_VALUE}}</w:t>
-            </w:r>
-          </w:p>
-        </w:tc>
-      </w:tr>
-    </w:tbl>
-    <w:p>
-      <w:pPr>
-        <w:keepNext/>
-        <w:pageBreakBefore w:val="0"/>
-        <w:spacing w:before="360" w:after="160" w:line="240" w:lineRule="auto"/>
-        <w:jc w:val="left"/>
-      </w:pPr>
-      <w:r>
-        <w:rPr>
-          <w:rFonts w:ascii="Aptos" w:hAnsi="Aptos" w:cs="Aptos"/>
-          <w:b/>
-          <w:i w:val="0"/>
-          <w:color w:val="0070C0"/>
-          <w:sz w:val="34"/>
-          <w:noProof/>
-        </w:rPr>
-        <w:t>Perfil de madurez por pilar</w:t>
-      </w:r>
-    </w:p>
-    <w:p>
-      <w:pPr>
-        <w:spacing w:before="0" w:after="80" w:line="276" w:lineRule="auto"/>
-        <w:jc w:val="both"/>
-      </w:pPr>
-      <w:r>
-        <w:rPr>
-          <w:rFonts w:ascii="Aptos" w:hAnsi="Aptos" w:cs="Aptos"/>
-          <w:b w:val="0"/>
-          <w:i w:val="0"/>
-          <w:color w:val="1F1F1F"/>
-          <w:sz w:val="21"/>
-          <w:noProof/>
-        </w:rPr>
-        <w:t>{{PILLAR_PROFILE_INTRO}}</w:t>
-      </w:r>
-    </w:p>
-    <w:p>
-      <w:pPr>
-        <w:spacing w:before="0" w:after="160" w:line="240" w:lineRule="auto"/>
-        <w:jc w:val="left"/>
-      </w:pPr>
-      <w:r>
-        <w:rPr>
-          <w:rFonts w:ascii="Aptos" w:hAnsi="Aptos" w:cs="Aptos"/>
-          <w:b w:val="0"/>
-          <w:i w:val="0"/>
-          <w:color w:val="5A5A5A"/>
-          <w:sz w:val="18"/>
-          <w:noProof/>
-        </w:rPr>
-        <w:t>{{SCORING_METHOD_NOTE}}</w:t>
-      </w:r>
-    </w:p>
-    <w:p>
-      <w:pPr>
-        <w:keepNext/>
-        <w:spacing w:before="120" w:after="120" w:line="240" w:lineRule="auto"/>
-        <w:jc w:val="left"/>
-      </w:pPr>
-      <w:r>
-        <w:rPr>
-          <w:rFonts w:ascii="Aptos" w:hAnsi="Aptos" w:cs="Aptos"/>
-          <w:b/>
-          <w:i w:val="0"/>
-          <w:color w:val="0070C0"/>
-          <w:sz w:val="21"/>
-          <w:noProof/>
-        </w:rPr>
-        <w:t>Gráfico radial</w:t>
-      </w:r>
-    </w:p>
-    <w:p>
-      <w:pPr>
-        <w:spacing w:before="0" w:after="0" w:line="240" w:lineRule="auto"/>
-        <w:jc w:val="left"/>
-      </w:pPr>
-      <w:r>
-        <w:rPr>
-          <w:rFonts w:ascii="Aptos" w:hAnsi="Aptos" w:cs="Aptos"/>
-          <w:b w:val="0"/>
-          <w:i w:val="0"/>
-          <w:color w:val="1F1F1F"/>
-          <w:sz w:val="21"/>
-          <w:noProof/>
-        </w:rPr>
-        <w:t>{{RADAR_CHART_BLOCK}}</w:t>
-      </w:r>
-    </w:p>
-    <w:p>
-      <w:pPr>
-        <w:spacing w:before="0" w:after="60" w:line="240" w:lineRule="auto"/>
-      </w:pPr>
-    </w:p>
-    <w:p>
-      <w:pPr>
-        <w:keepNext/>
-        <w:spacing w:before="120" w:after="120" w:line="240" w:lineRule="auto"/>
-        <w:jc w:val="left"/>
-      </w:pPr>
-      <w:r>
-        <w:rPr>
-          <w:rFonts w:ascii="Aptos" w:hAnsi="Aptos" w:cs="Aptos"/>
-          <w:b/>
-          <w:i w:val="0"/>
-          <w:color w:val="0070C0"/>
-          <w:sz w:val="21"/>
-          <w:noProof/>
-        </w:rPr>
-        <w:t>Detalle compacto por pilar</w:t>
-      </w:r>
-    </w:p>
-    <w:p>
-      <w:pPr>
-        <w:spacing w:before="0" w:after="0" w:line="240" w:lineRule="auto"/>
-        <w:jc w:val="left"/>
-      </w:pPr>
-      <w:r>
-        <w:rPr>
-          <w:rFonts w:ascii="Aptos" w:hAnsi="Aptos" w:cs="Aptos"/>
-          <w:b w:val="0"/>
-          <w:i w:val="0"/>
-          <w:color w:val="1F1F1F"/>
-          <w:sz w:val="21"/>
-          <w:noProof/>
-        </w:rPr>
-        <w:t>{{PILLAR_SCORE_TABLE}}</w:t>
-      </w:r>
-    </w:p>
-    <w:p>
-      <w:pPr>
-        <w:spacing w:before="0" w:after="80" w:line="240" w:lineRule="auto"/>
-      </w:pPr>
-    </w:p>
-    <w:p>
-      <w:pPr>
-        <w:keepNext/>
-        <w:pageBreakBefore/>
-        <w:spacing w:before="0" w:after="160" w:line="240" w:lineRule="auto"/>
-        <w:jc w:val="left"/>
-      </w:pPr>
-      <w:r>
-        <w:rPr>
-          <w:rFonts w:ascii="Aptos" w:hAnsi="Aptos" w:cs="Aptos"/>
-          <w:b/>
-          <w:i w:val="0"/>
-          <w:color w:val="0070C0"/>
-          <w:sz w:val="34"/>
-          <w:noProof/>
-        </w:rPr>
-        <w:t>AS-IS resumido</w:t>
-      </w:r>
-    </w:p>
-    <w:p>
-      <w:pPr>
-        <w:spacing w:before="0" w:after="160" w:line="276" w:lineRule="auto"/>
-        <w:jc w:val="both"/>
-      </w:pPr>
-      <w:r>
-        <w:rPr>
-          <w:rFonts w:ascii="Aptos" w:hAnsi="Aptos" w:cs="Aptos"/>
-          <w:b w:val="0"/>
-          <w:i w:val="0"/>
-          <w:color w:val="1F1F1F"/>
-          <w:sz w:val="21"/>
-          <w:noProof/>
-        </w:rPr>
-        <w:t>{{ASIS_NARRATIVE}}</w:t>
-      </w:r>
-    </w:p>
-    <w:tbl>
-      <w:tblPr>
-        <w:tblW w:type="auto" w:w="0"/>
-        <w:jc w:val="center"/>
-        <w:tblLayout w:type="fixed"/>
-        <w:tblLook w:firstColumn="1" w:firstRow="1" w:lastColumn="0" w:lastRow="0" w:noHBand="0" w:noVBand="1" w:val="04A0"/>
-      </w:tblPr>
-      <w:tblGrid>
-        <w:gridCol w:w="4819"/>
-        <w:gridCol w:w="4819"/>
-      </w:tblGrid>
-      <w:tr>
-        <w:tc>
-          <w:tcPr>
-            <w:tcW w:type="dxa" w:w="4819"/>
-            <w:tcBorders>
-              <w:top w:val="single" w:sz="6" w:space="0" w:color="B8C9D9"/>
-              <w:left w:val="single" w:sz="6" w:space="0" w:color="B8C9D9"/>
-              <w:bottom w:val="single" w:sz="6" w:space="0" w:color="B8C9D9"/>
-              <w:right w:val="single" w:sz="6" w:space="0" w:color="B8C9D9"/>
-            </w:tcBorders>
-            <w:tcMar>
-              <w:top w:w="80" w:type="dxa"/>
-              <w:start w:w="100" w:type="dxa"/>
-              <w:bottom w:w="80" w:type="dxa"/>
-              <w:end w:w="100" w:type="dxa"/>
-            </w:tcMar>
-            <w:vAlign w:val="top"/>
-            <w:shd w:fill="CFE2F3"/>
-          </w:tcPr>
-          <w:p>
-            <w:pPr>
-              <w:spacing w:before="120" w:after="80" w:line="240" w:lineRule="auto"/>
-              <w:jc w:val="left"/>
-            </w:pPr>
-            <w:r>
-              <w:rPr>
-                <w:rFonts w:ascii="Aptos" w:hAnsi="Aptos" w:cs="Aptos"/>
-                <w:b/>
-                <w:i w:val="0"/>
-                <w:color w:val="0070C0"/>
-                <w:sz w:val="21"/>
-                <w:noProof/>
-              </w:rPr>
-              <w:t>Fortalezas clave</w:t>
-            </w:r>
-          </w:p>
-        </w:tc>
-        <w:tc>
-          <w:tcPr>
-            <w:tcW w:type="dxa" w:w="4819"/>
-            <w:tcBorders>
-              <w:top w:val="single" w:sz="6" w:space="0" w:color="B8C9D9"/>
-              <w:left w:val="single" w:sz="6" w:space="0" w:color="B8C9D9"/>
-              <w:bottom w:val="single" w:sz="6" w:space="0" w:color="B8C9D9"/>
-              <w:right w:val="single" w:sz="6" w:space="0" w:color="B8C9D9"/>
-            </w:tcBorders>
-            <w:tcMar>
-              <w:top w:w="80" w:type="dxa"/>
-              <w:start w:w="100" w:type="dxa"/>
-              <w:bottom w:w="80" w:type="dxa"/>
-              <w:end w:w="100" w:type="dxa"/>
-            </w:tcMar>
-            <w:vAlign w:val="top"/>
-            <w:shd w:fill="CFE2F3"/>
-          </w:tcPr>
-          <w:p>
-            <w:pPr>
-              <w:spacing w:before="120" w:after="80" w:line="240" w:lineRule="auto"/>
-              <w:jc w:val="left"/>
-            </w:pPr>
-            <w:r>
-              <w:rPr>
-                <w:rFonts w:ascii="Aptos" w:hAnsi="Aptos" w:cs="Aptos"/>
-                <w:b/>
-                <w:i w:val="0"/>
-                <w:color w:val="0070C0"/>
-                <w:sz w:val="21"/>
-                <w:noProof/>
-              </w:rPr>
-              <w:t>Brechas clave</w:t>
-            </w:r>
-          </w:p>
-        </w:tc>
-      </w:tr>
-      <w:tr>
-        <w:tc>
-          <w:tcPr>
-            <w:tcW w:type="dxa" w:w="4819"/>
-            <w:tcBorders>
-              <w:top w:val="single" w:sz="6" w:space="0" w:color="B8C9D9"/>
-              <w:left w:val="single" w:sz="6" w:space="0" w:color="B8C9D9"/>
-              <w:bottom w:val="single" w:sz="6" w:space="0" w:color="B8C9D9"/>
-              <w:right w:val="single" w:sz="6" w:space="0" w:color="B8C9D9"/>
-            </w:tcBorders>
-            <w:tcMar>
-              <w:top w:w="110" w:type="dxa"/>
-              <w:start w:w="130" w:type="dxa"/>
-              <w:bottom w:w="110" w:type="dxa"/>
-              <w:end w:w="130" w:type="dxa"/>
-            </w:tcMar>
-            <w:vAlign w:val="top"/>
-          </w:tcPr>
-          <w:p>
-            <w:pPr>
-              <w:spacing w:before="0" w:after="0" w:line="264" w:lineRule="auto"/>
-              <w:jc w:val="left"/>
-            </w:pPr>
-            <w:r>
-              <w:rPr>
-                <w:rFonts w:ascii="Aptos" w:hAnsi="Aptos" w:cs="Aptos"/>
-                <w:b w:val="0"/>
-                <w:i w:val="0"/>
-                <w:color w:val="1F1F1F"/>
-                <w:sz w:val="21"/>
-                <w:noProof/>
-              </w:rPr>
-              <w:t>{{ASIS_STRENGTHS_LIST}}</w:t>
-            </w:r>
-          </w:p>
-        </w:tc>
-        <w:tc>
-          <w:tcPr>
-            <w:tcW w:type="dxa" w:w="4819"/>
-            <w:tcBorders>
-              <w:top w:val="single" w:sz="6" w:space="0" w:color="B8C9D9"/>
-              <w:left w:val="single" w:sz="6" w:space="0" w:color="B8C9D9"/>
-              <w:bottom w:val="single" w:sz="6" w:space="0" w:color="B8C9D9"/>
-              <w:right w:val="single" w:sz="6" w:space="0" w:color="B8C9D9"/>
-            </w:tcBorders>
-            <w:tcMar>
-              <w:top w:w="110" w:type="dxa"/>
-              <w:start w:w="130" w:type="dxa"/>
-              <w:bottom w:w="110" w:type="dxa"/>
-              <w:end w:w="130" w:type="dxa"/>
-            </w:tcMar>
-            <w:vAlign w:val="top"/>
-          </w:tcPr>
-          <w:p>
-            <w:pPr>
-              <w:spacing w:before="0" w:after="0" w:line="264" w:lineRule="auto"/>
-              <w:jc w:val="left"/>
-            </w:pPr>
-            <w:r>
-              <w:rPr>
-                <w:rFonts w:ascii="Aptos" w:hAnsi="Aptos" w:cs="Aptos"/>
-                <w:b w:val="0"/>
-                <w:i w:val="0"/>
-                <w:color w:val="1F1F1F"/>
-                <w:sz w:val="21"/>
-                <w:noProof/>
-              </w:rPr>
-              <w:t>{{ASIS_GAPS_LIST}}</w:t>
-            </w:r>
-          </w:p>
-        </w:tc>
-      </w:tr>
-    </w:tbl>
-    <w:p>
-      <w:pPr>
-        <w:spacing w:before="0" w:after="100" w:line="240" w:lineRule="auto"/>
-      </w:pPr>
-    </w:p>
-    <w:tbl>
-      <w:tblPr>
-        <w:tblW w:type="auto" w:w="0"/>
-        <w:jc w:val="center"/>
-        <w:tblLayout w:type="fixed"/>
-        <w:tblLook w:firstColumn="1" w:firstRow="1" w:lastColumn="0" w:lastRow="0" w:noHBand="0" w:noVBand="1" w:val="04A0"/>
-      </w:tblPr>
-      <w:tblGrid>
-        <w:gridCol w:w="9638"/>
-      </w:tblGrid>
-      <w:tr>
-        <w:tc>
-          <w:tcPr>
-            <w:tcW w:type="dxa" w:w="9638"/>
-            <w:tcBorders>
-              <w:top w:val="single" w:sz="6" w:space="0" w:color="B8C9D9"/>
-              <w:left w:val="single" w:sz="6" w:space="0" w:color="B8C9D9"/>
-              <w:bottom w:val="single" w:sz="6" w:space="0" w:color="B8C9D9"/>
-              <w:right w:val="single" w:sz="6" w:space="0" w:color="B8C9D9"/>
-            </w:tcBorders>
-            <w:tcMar>
-              <w:top w:w="80" w:type="dxa"/>
-              <w:start w:w="100" w:type="dxa"/>
-              <w:bottom w:w="80" w:type="dxa"/>
-              <w:end w:w="100" w:type="dxa"/>
-            </w:tcMar>
-            <w:vAlign w:val="top"/>
-            <w:shd w:fill="CFE2F3"/>
-          </w:tcPr>
-          <w:p>
-            <w:pPr>
-              <w:spacing w:before="120" w:after="80" w:line="240" w:lineRule="auto"/>
-              <w:jc w:val="left"/>
-            </w:pPr>
-            <w:r>
-              <w:rPr>
-                <w:rFonts w:ascii="Aptos" w:hAnsi="Aptos" w:cs="Aptos"/>
-                <w:b/>
-                <w:i w:val="0"/>
-                <w:color w:val="0070C0"/>
-                <w:sz w:val="21"/>
-                <w:noProof/>
-              </w:rPr>
-              <w:t>Implicaciones operativas clave</w:t>
-            </w:r>
-          </w:p>
-        </w:tc>
-      </w:tr>
-      <w:tr>
-        <w:tc>
-          <w:tcPr>
-            <w:tcW w:type="dxa" w:w="9638"/>
-            <w:tcBorders>
-              <w:top w:val="single" w:sz="6" w:space="0" w:color="B8C9D9"/>
-              <w:left w:val="single" w:sz="6" w:space="0" w:color="B8C9D9"/>
-              <w:bottom w:val="single" w:sz="6" w:space="0" w:color="B8C9D9"/>
-              <w:right w:val="single" w:sz="6" w:space="0" w:color="B8C9D9"/>
-            </w:tcBorders>
-            <w:tcMar>
-              <w:top w:w="80" w:type="dxa"/>
-              <w:start w:w="100" w:type="dxa"/>
-              <w:bottom w:w="80" w:type="dxa"/>
-              <w:end w:w="100" w:type="dxa"/>
-            </w:tcMar>
-            <w:vAlign w:val="top"/>
-          </w:tcPr>
-          <w:p>
-            <w:pPr>
-              <w:spacing w:before="0" w:after="0" w:line="264" w:lineRule="auto"/>
-              <w:jc w:val="left"/>
-            </w:pPr>
-            <w:r>
-              <w:rPr>
-                <w:rFonts w:ascii="Aptos" w:hAnsi="Aptos" w:cs="Aptos"/>
-                <w:b w:val="0"/>
-                <w:i w:val="0"/>
-                <w:color w:val="1F1F1F"/>
-                <w:sz w:val="21"/>
-                <w:noProof/>
-              </w:rPr>
-              <w:t>{{ASIS_OPERATIONAL_IMPACTS_LIST}}</w:t>
-            </w:r>
-          </w:p>
-        </w:tc>
-      </w:tr>
-    </w:tbl>
-    <w:p>
-      <w:pPr>
-        <w:keepNext/>
-        <w:pageBreakBefore/>
-        <w:spacing w:before="0" w:after="160" w:line="240" w:lineRule="auto"/>
-        <w:jc w:val="left"/>
-      </w:pPr>
-      <w:r>
-        <w:rPr>
-          <w:rFonts w:ascii="Aptos" w:hAnsi="Aptos" w:cs="Aptos"/>
-          <w:b/>
-          <w:i w:val="0"/>
-          <w:color w:val="0070C0"/>
-          <w:sz w:val="34"/>
-          <w:noProof/>
-        </w:rPr>
-        <w:t>Riesgos principales</w:t>
-      </w:r>
-    </w:p>
-    <w:p>
-      <w:pPr>
-        <w:spacing w:before="0" w:after="160" w:line="276" w:lineRule="auto"/>
-        <w:jc w:val="both"/>
-      </w:pPr>
-      <w:r>
-        <w:rPr>
-          <w:rFonts w:ascii="Aptos" w:hAnsi="Aptos" w:cs="Aptos"/>
-          <w:b w:val="0"/>
-          <w:i w:val="0"/>
-          <w:color w:val="1F1F1F"/>
-          <w:sz w:val="21"/>
-          <w:noProof/>
-        </w:rPr>
-        <w:t>{{RISKS_INTRO}}</w:t>
-      </w:r>
-    </w:p>
-    <w:p>
-      <w:pPr>
-        <w:spacing w:before="0" w:after="0" w:line="240" w:lineRule="auto"/>
-        <w:jc w:val="left"/>
-      </w:pPr>
-      <w:r>
-        <w:rPr>
-          <w:rFonts w:ascii="Aptos" w:hAnsi="Aptos" w:cs="Aptos"/>
-          <w:b w:val="0"/>
-          <w:i w:val="0"/>
-          <w:color w:val="1F1F1F"/>
-          <w:sz w:val="21"/>
-          <w:noProof/>
-        </w:rPr>
-        <w:t>{{RISKS_TABLE}}</w:t>
-      </w:r>
-    </w:p>
-    <w:p>
-      <w:pPr>
-        <w:spacing w:before="0" w:after="100" w:line="240" w:lineRule="auto"/>
-      </w:pPr>
-    </w:p>
-    <w:p>
-      <w:pPr>
-        <w:spacing w:before="0" w:after="0" w:line="276" w:lineRule="auto"/>
-        <w:jc w:val="both"/>
-      </w:pPr>
-      <w:r>
-        <w:rPr>
-          <w:rFonts w:ascii="Aptos" w:hAnsi="Aptos" w:cs="Aptos"/>
-          <w:b w:val="0"/>
-          <w:i w:val="0"/>
-          <w:color w:val="1F1F1F"/>
-          <w:sz w:val="21"/>
-          <w:noProof/>
-        </w:rPr>
-        <w:t>{{RISKS_CLOSING}}</w:t>
-      </w:r>
-    </w:p>
-    <w:p>
-      <w:pPr>
-        <w:keepNext/>
-        <w:pageBreakBefore w:val="0"/>
-        <w:spacing w:before="360" w:after="160" w:line="240" w:lineRule="auto"/>
-        <w:jc w:val="left"/>
-      </w:pPr>
-      <w:r>
-        <w:rPr>
-          <w:rFonts w:ascii="Aptos" w:hAnsi="Aptos" w:cs="Aptos"/>
-          <w:b/>
-          <w:i w:val="0"/>
-          <w:color w:val="0070C0"/>
-          <w:sz w:val="34"/>
-          <w:noProof/>
-        </w:rPr>
-        <w:t>Estado objetivo y brechas</w:t>
-      </w:r>
-    </w:p>
-    <w:p>
-      <w:pPr>
-        <w:spacing w:before="0" w:after="160" w:line="276" w:lineRule="auto"/>
-        <w:jc w:val="both"/>
-      </w:pPr>
-      <w:r>
-        <w:rPr>
-          <w:rFonts w:ascii="Aptos" w:hAnsi="Aptos" w:cs="Aptos"/>
-          <w:b w:val="0"/>
-          <w:i w:val="0"/>
-          <w:color w:val="1F1F1F"/>
-          <w:sz w:val="21"/>
-          <w:noProof/>
-        </w:rPr>
-        <w:t>{{TOBE_INTRO}}</w:t>
-      </w:r>
-    </w:p>
-    <w:tbl>
-      <w:tblPr>
-        <w:tblW w:type="auto" w:w="0"/>
-        <w:jc w:val="center"/>
-        <w:tblLayout w:type="fixed"/>
-        <w:tblLook w:firstColumn="1" w:firstRow="1" w:lastColumn="0" w:lastRow="0" w:noHBand="0" w:noVBand="1" w:val="04A0"/>
-      </w:tblPr>
-      <w:tblGrid>
-        <w:gridCol w:w="9638"/>
-      </w:tblGrid>
-      <w:tr>
-        <w:tc>
-          <w:tcPr>
-            <w:tcW w:type="dxa" w:w="9638"/>
-            <w:tcBorders>
-              <w:top w:val="single" w:sz="6" w:space="0" w:color="B8C9D9"/>
-              <w:left w:val="single" w:sz="6" w:space="0" w:color="B8C9D9"/>
-              <w:bottom w:val="single" w:sz="6" w:space="0" w:color="B8C9D9"/>
-              <w:right w:val="single" w:sz="6" w:space="0" w:color="B8C9D9"/>
-            </w:tcBorders>
-            <w:tcMar>
-              <w:top w:w="80" w:type="dxa"/>
-              <w:start w:w="100" w:type="dxa"/>
-              <w:bottom w:w="80" w:type="dxa"/>
-              <w:end w:w="100" w:type="dxa"/>
-            </w:tcMar>
-            <w:vAlign w:val="top"/>
-            <w:shd w:fill="CFE2F3"/>
-          </w:tcPr>
-          <w:p>
-            <w:pPr>
-              <w:spacing w:before="120" w:after="80" w:line="240" w:lineRule="auto"/>
-              <w:jc w:val="left"/>
-            </w:pPr>
-            <w:r>
-              <w:rPr>
-                <w:rFonts w:ascii="Aptos" w:hAnsi="Aptos" w:cs="Aptos"/>
-                <w:b/>
-                <w:i w:val="0"/>
-                <w:color w:val="0070C0"/>
-                <w:sz w:val="21"/>
-                <w:noProof/>
-              </w:rPr>
-              <w:t>Principios / capacidades objetivo</w:t>
-            </w:r>
-          </w:p>
-        </w:tc>
-      </w:tr>
-      <w:tr>
-        <w:tc>
-          <w:tcPr>
-            <w:tcW w:type="dxa" w:w="9638"/>
-            <w:tcBorders>
-              <w:top w:val="single" w:sz="6" w:space="0" w:color="B8C9D9"/>
-              <w:left w:val="single" w:sz="6" w:space="0" w:color="B8C9D9"/>
-              <w:bottom w:val="single" w:sz="6" w:space="0" w:color="B8C9D9"/>
-              <w:right w:val="single" w:sz="6" w:space="0" w:color="B8C9D9"/>
-            </w:tcBorders>
-            <w:tcMar>
-              <w:top w:w="80" w:type="dxa"/>
-              <w:start w:w="100" w:type="dxa"/>
-              <w:bottom w:w="80" w:type="dxa"/>
-              <w:end w:w="100" w:type="dxa"/>
-            </w:tcMar>
-            <w:vAlign w:val="top"/>
-          </w:tcPr>
-          <w:p>
-            <w:pPr>
-              <w:spacing w:before="0" w:after="0" w:line="264" w:lineRule="auto"/>
-              <w:jc w:val="left"/>
-            </w:pPr>
-            <w:r>
-              <w:rPr>
-                <w:rFonts w:ascii="Aptos" w:hAnsi="Aptos" w:cs="Aptos"/>
-                <w:b w:val="0"/>
-                <w:i w:val="0"/>
-                <w:color w:val="1F1F1F"/>
-                <w:sz w:val="21"/>
-                <w:noProof/>
-              </w:rPr>
-              <w:t>{{TARGET_CAPABILITIES_LIST}}</w:t>
-            </w:r>
-          </w:p>
-        </w:tc>
-      </w:tr>
-    </w:tbl>
-    <w:p>
-      <w:pPr>
-        <w:spacing w:before="0" w:after="100" w:line="240" w:lineRule="auto"/>
-      </w:pPr>
-    </w:p>
-    <w:p>
-      <w:pPr>
-        <w:keepNext/>
-        <w:spacing w:before="120" w:after="120" w:line="240" w:lineRule="auto"/>
-        <w:jc w:val="left"/>
-      </w:pPr>
-      <w:r>
-        <w:rPr>
-          <w:rFonts w:ascii="Aptos" w:hAnsi="Aptos" w:cs="Aptos"/>
-          <w:b/>
-          <w:i w:val="0"/>
-          <w:color w:val="0070C0"/>
-          <w:sz w:val="21"/>
-          <w:noProof/>
-        </w:rPr>
-        <w:t>Tabla de brechas por pilar</w:t>
-      </w:r>
-    </w:p>
-    <w:p>
-      <w:pPr>
-        <w:spacing w:before="0" w:after="0" w:line="240" w:lineRule="auto"/>
-        <w:jc w:val="left"/>
-      </w:pPr>
-      <w:r>
-        <w:rPr>
-          <w:rFonts w:ascii="Aptos" w:hAnsi="Aptos" w:cs="Aptos"/>
-          <w:b w:val="0"/>
-          <w:i w:val="0"/>
-          <w:color w:val="1F1F1F"/>
-          <w:sz w:val="21"/>
-          <w:noProof/>
-        </w:rPr>
-        <w:t>{{GAP_TABLE}}</w:t>
-      </w:r>
-    </w:p>
-    <w:p>
-      <w:pPr>
-        <w:keepNext/>
-        <w:pageBreakBefore w:val="0"/>
-        <w:spacing w:before="360" w:after="160" w:line="240" w:lineRule="auto"/>
-        <w:jc w:val="left"/>
-      </w:pPr>
-      <w:r>
-        <w:rPr>
-          <w:rFonts w:ascii="Aptos" w:hAnsi="Aptos" w:cs="Aptos"/>
-          <w:b/>
-          <w:i w:val="0"/>
-          <w:color w:val="0070C0"/>
-          <w:sz w:val="34"/>
-          <w:noProof/>
-        </w:rPr>
-        <w:t>Iniciativas prioritarias</w:t>
-      </w:r>
-    </w:p>
-    <w:p>
-      <w:pPr>
-        <w:spacing w:before="0" w:after="160" w:line="276" w:lineRule="auto"/>
-        <w:jc w:val="both"/>
-      </w:pPr>
-      <w:r>
-        <w:rPr>
-          <w:rFonts w:ascii="Aptos" w:hAnsi="Aptos" w:cs="Aptos"/>
-          <w:b w:val="0"/>
-          <w:i w:val="0"/>
-          <w:color w:val="1F1F1F"/>
-          <w:sz w:val="21"/>
-          <w:noProof/>
-        </w:rPr>
-        <w:t>{{TODO_INTRO}}</w:t>
-      </w:r>
-    </w:p>
-    <w:p>
-      <w:pPr>
-        <w:keepNext/>
-        <w:spacing w:before="120" w:after="120" w:line="240" w:lineRule="auto"/>
-        <w:jc w:val="left"/>
-      </w:pPr>
-      <w:r>
-        <w:rPr>
-          <w:rFonts w:ascii="Aptos" w:hAnsi="Aptos" w:cs="Aptos"/>
-          <w:b/>
-          <w:i w:val="0"/>
-          <w:color w:val="0070C0"/>
-          <w:sz w:val="21"/>
-          <w:noProof/>
-        </w:rPr>
-        <w:t>Fichas de iniciativas priorizadas</w:t>
-      </w:r>
-    </w:p>
-    <w:p>
-      <w:pPr>
-        <w:spacing w:before="0" w:after="0" w:line="240" w:lineRule="auto"/>
-        <w:jc w:val="left"/>
-      </w:pPr>
-      <w:r>
-        <w:rPr>
-          <w:rFonts w:ascii="Aptos" w:hAnsi="Aptos" w:cs="Aptos"/>
-          <w:b w:val="0"/>
-          <w:i w:val="0"/>
-          <w:color w:val="1F1F1F"/>
-          <w:sz w:val="21"/>
-          <w:noProof/>
-        </w:rPr>
-        <w:t>{{PRIORITY_INITIATIVES_CARDS}}</w:t>
-      </w:r>
-    </w:p>
-    <w:p>
-      <w:pPr>
-        <w:keepNext/>
-        <w:spacing w:before="120" w:after="120" w:line="240" w:lineRule="auto"/>
-        <w:jc w:val="left"/>
-      </w:pPr>
-      <w:r>
-        <w:rPr>
-          <w:rFonts w:ascii="Aptos" w:hAnsi="Aptos" w:cs="Aptos"/>
-          <w:b/>
-          <w:i w:val="0"/>
-          <w:color w:val="0070C0"/>
-          <w:sz w:val="34"/>
-          <w:noProof/>
-        </w:rPr>
-        <w:t>Conclusión</w:t>
-      </w:r>
-    </w:p>
-    <w:p>
-      <w:pPr>
-        <w:spacing w:before="0" w:after="160" w:line="276" w:lineRule="auto"/>
-        <w:jc w:val="both"/>
-      </w:pPr>
-      <w:r>
-        <w:rPr>
-          <w:rFonts w:ascii="Aptos" w:hAnsi="Aptos" w:cs="Aptos"/>
-          <w:b w:val="0"/>
-          <w:i w:val="0"/>
-          <w:color w:val="1F1F1F"/>
-          <w:sz w:val="21"/>
-          <w:noProof/>
-        </w:rPr>
-        <w:t>{{FINAL_ASSESSMENT}}</w:t>
-      </w:r>
-    </w:p>
-    <w:tbl>
-      <w:tblPr>
-        <w:tblW w:type="auto" w:w="0"/>
-        <w:jc w:val="center"/>
-        <w:tblLayout w:type="fixed"/>
-        <w:tblLook w:firstColumn="1" w:firstRow="1" w:lastColumn="0" w:lastRow="0" w:noHBand="0" w:noVBand="1" w:val="04A0"/>
-      </w:tblPr>
-      <w:tblGrid>
-        <w:gridCol w:w="9638"/>
-      </w:tblGrid>
-      <w:tr>
-        <w:tc>
-          <w:tcPr>
-            <w:tcW w:type="dxa" w:w="9638"/>
-            <w:tcBorders>
-              <w:top w:val="single" w:sz="6" w:space="0" w:color="B8C9D9"/>
-              <w:left w:val="single" w:sz="6" w:space="0" w:color="B8C9D9"/>
-              <w:bottom w:val="single" w:sz="6" w:space="0" w:color="B8C9D9"/>
-              <w:right w:val="single" w:sz="6" w:space="0" w:color="B8C9D9"/>
-            </w:tcBorders>
-            <w:tcMar>
-              <w:top w:w="80" w:type="dxa"/>
-              <w:start w:w="100" w:type="dxa"/>
-              <w:bottom w:w="80" w:type="dxa"/>
-              <w:end w:w="100" w:type="dxa"/>
-            </w:tcMar>
-            <w:vAlign w:val="center"/>
-            <w:shd w:fill="CFE2F3"/>
-          </w:tcPr>
-          <w:p>
-            <w:pPr>
-              <w:spacing w:before="120" w:after="80" w:line="240" w:lineRule="auto"/>
-              <w:jc w:val="left"/>
-            </w:pPr>
-            <w:r>
-              <w:rPr>
-                <w:rFonts w:ascii="Aptos" w:hAnsi="Aptos" w:cs="Aptos"/>
-                <w:b/>
-                <w:i w:val="0"/>
-                <w:color w:val="0070C0"/>
-                <w:sz w:val="21"/>
-                <w:noProof/>
-              </w:rPr>
-              <w:t>Mensaje ejecutivo final</w:t>
-            </w:r>
-          </w:p>
-        </w:tc>
-      </w:tr>
-      <w:tr>
-        <w:tc>
-          <w:tcPr>
-            <w:tcW w:type="dxa" w:w="9638"/>
-            <w:tcBorders>
-              <w:top w:val="single" w:sz="6" w:space="0" w:color="B8C9D9"/>
-              <w:left w:val="single" w:sz="6" w:space="0" w:color="B8C9D9"/>
-              <w:bottom w:val="single" w:sz="6" w:space="0" w:color="B8C9D9"/>
-              <w:right w:val="single" w:sz="6" w:space="0" w:color="B8C9D9"/>
-            </w:tcBorders>
-            <w:tcMar>
-              <w:top w:w="80" w:type="dxa"/>
-              <w:start w:w="100" w:type="dxa"/>
-              <w:bottom w:w="80" w:type="dxa"/>
-              <w:end w:w="100" w:type="dxa"/>
-            </w:tcMar>
-            <w:vAlign w:val="center"/>
-          </w:tcPr>
-          <w:p>
-            <w:pPr>
-              <w:spacing w:before="0" w:after="0" w:line="264" w:lineRule="auto"/>
-              <w:jc w:val="left"/>
-            </w:pPr>
-            <w:r>
-              <w:rPr>
-                <w:rFonts w:ascii="Aptos" w:hAnsi="Aptos" w:cs="Aptos"/>
-                <w:b w:val="0"/>
-                <w:i w:val="0"/>
-                <w:color w:val="1F1F1F"/>
-                <w:sz w:val="21"/>
-                <w:noProof/>
-              </w:rPr>
-              <w:t>{{EXECUTIVE_MESSAGE}}</w:t>
-            </w:r>
-          </w:p>
-        </w:tc>
-      </w:tr>
-    </w:tbl>
-    <w:p>
-      <w:pPr>
-        <w:spacing w:before="0" w:after="100" w:line="240" w:lineRule="auto"/>
-      </w:pPr>
-    </w:p>
-    <w:tbl>
-      <w:tblPr>
-        <w:tblW w:type="auto" w:w="0"/>
-        <w:jc w:val="center"/>
-        <w:tblLayout w:type="fixed"/>
-        <w:tblLook w:firstColumn="1" w:firstRow="1" w:lastColumn="0" w:lastRow="0" w:noHBand="0" w:noVBand="1" w:val="04A0"/>
-      </w:tblPr>
-      <w:tblGrid>
-        <w:gridCol w:w="9638"/>
-      </w:tblGrid>
-      <w:tr>
-        <w:tc>
-          <w:tcPr>
-            <w:tcW w:type="dxa" w:w="9638"/>
-            <w:tcBorders>
-              <w:top w:val="single" w:sz="6" w:space="0" w:color="B8C9D9"/>
-              <w:left w:val="single" w:sz="6" w:space="0" w:color="B8C9D9"/>
-              <w:bottom w:val="single" w:sz="6" w:space="0" w:color="B8C9D9"/>
-              <w:right w:val="single" w:sz="6" w:space="0" w:color="B8C9D9"/>
-            </w:tcBorders>
-            <w:tcMar>
-              <w:top w:w="80" w:type="dxa"/>
-              <w:start w:w="100" w:type="dxa"/>
-              <w:bottom w:w="80" w:type="dxa"/>
-              <w:end w:w="100" w:type="dxa"/>
-            </w:tcMar>
-            <w:vAlign w:val="top"/>
-            <w:shd w:fill="CFE2F3"/>
-          </w:tcPr>
-          <w:p>
-            <w:pPr>
-              <w:spacing w:before="120" w:after="80" w:line="240" w:lineRule="auto"/>
-              <w:jc w:val="left"/>
-            </w:pPr>
-            <w:r>
-              <w:rPr>
-                <w:rFonts w:ascii="Aptos" w:hAnsi="Aptos" w:cs="Aptos"/>
-                <w:b/>
-                <w:i w:val="0"/>
-                <w:color w:val="0070C0"/>
-                <w:sz w:val="21"/>
-                <w:noProof/>
-              </w:rPr>
-              <w:t>Áreas prioritarias de actuación</w:t>
-            </w:r>
-          </w:p>
-        </w:tc>
-      </w:tr>
-      <w:tr>
-        <w:tc>
-          <w:tcPr>
-            <w:tcW w:type="dxa" w:w="9638"/>
-            <w:tcBorders>
-              <w:top w:val="single" w:sz="6" w:space="0" w:color="B8C9D9"/>
-              <w:left w:val="single" w:sz="6" w:space="0" w:color="B8C9D9"/>
-              <w:bottom w:val="single" w:sz="6" w:space="0" w:color="B8C9D9"/>
-              <w:right w:val="single" w:sz="6" w:space="0" w:color="B8C9D9"/>
-            </w:tcBorders>
-            <w:tcMar>
-              <w:top w:w="80" w:type="dxa"/>
-              <w:start w:w="100" w:type="dxa"/>
-              <w:bottom w:w="80" w:type="dxa"/>
-              <w:end w:w="100" w:type="dxa"/>
-            </w:tcMar>
-            <w:vAlign w:val="top"/>
-          </w:tcPr>
-          <w:p>
-            <w:pPr>
-              <w:spacing w:before="0" w:after="0" w:line="264" w:lineRule="auto"/>
-              <w:jc w:val="left"/>
-            </w:pPr>
-            <w:r>
-              <w:rPr>
-                <w:rFonts w:ascii="Aptos" w:hAnsi="Aptos" w:cs="Aptos"/>
-                <w:b w:val="0"/>
-                <w:i w:val="0"/>
-                <w:color w:val="1F1F1F"/>
-                <w:sz w:val="21"/>
-                <w:noProof/>
               </w:rPr>
               <w:t>{{PRIORITY_AREAS_LIST}}</w:t>
             </w:r>
@@ -1483,30 +1340,27 @@
     </w:tbl>
     <w:p>
       <w:pPr>
-        <w:spacing w:before="0" w:after="100" w:line="240" w:lineRule="auto"/>
+        <w:spacing w:after="100"/>
       </w:pPr>
     </w:p>
     <w:p>
       <w:pPr>
-        <w:spacing w:before="0" w:after="0" w:line="276" w:lineRule="auto"/>
+        <w:spacing w:line="276" w:lineRule="auto"/>
         <w:jc w:val="both"/>
       </w:pPr>
       <w:r>
         <w:rPr>
           <w:rFonts w:ascii="Aptos" w:hAnsi="Aptos" w:cs="Aptos"/>
-          <w:b w:val="0"/>
-          <w:i w:val="0"/>
+          <w:noProof/>
           <w:color w:val="1F1F1F"/>
-          <w:sz w:val="21"/>
-          <w:noProof/>
         </w:rPr>
         <w:t>{{CLOSING_STATEMENT}}</w:t>
       </w:r>
     </w:p>
     <w:sectPr>
-      <w:headerReference w:type="default" r:id="rId15"/>
-      <w:headerReference w:type="first" r:id="rId16"/>
-      <w:footerReference w:type="first" r:id="rId17"/>
+      <w:headerReference w:type="default" r:id="rId11"/>
+      <w:headerReference w:type="first" r:id="rId12"/>
+      <w:footerReference w:type="first" r:id="rId13"/>
       <w:pgSz w:w="11906" w:h="16838"/>
       <w:pgMar w:top="1368" w:right="1134" w:bottom="907" w:left="1134" w:header="360" w:footer="709" w:gutter="0"/>
       <w:cols w:space="708"/>
@@ -1569,158 +1423,6 @@
       </w:rPr>
       <w:t>6</w:t>
     </w:r>
-    <w:sdt>
-      <w:sdtPr>
-        <w:rPr>
-          <w:bCs/>
-          <w:lang w:val="en-GB"/>
-        </w:rPr>
-        <w:alias w:val="Company"/>
-        <w:tag w:val=""/>
-        <w:id w:val="-1979137449"/>
-        <w:placeholder>
-          <w:docPart w:val="F9B3FD16871F4C54ACF12EFE83A2BD4C"/>
-        </w:placeholder>
-        <w:dataBinding w:prefixMappings="xmlns:ns0='http://schemas.openxmlformats.org/officeDocument/2006/extended-properties' " w:xpath="/ns0:Properties[1]/ns0:Company[1]" w:storeItemID="{6668398D-A668-4E3E-A5EB-62B293D839F1}"/>
-        <w:text/>
-      </w:sdtPr>
-      <w:sdtContent>
-        <w:r>
-          <w:rPr>
-            <w:bCs/>
-            <w:lang w:val="en-GB"/>
-          </w:rPr>
-          <w:t>NTT DATA Corporation</w:t>
-        </w:r>
-      </w:sdtContent>
-    </w:sdt>
-    <w:r>
-      <w:rPr>
-        <w:noProof/>
-      </w:rPr>
-      <w:pict w14:anchorId="039F4828">
-        <v:shapetype id="_x0000_t202" coordsize="21600,21600" o:spt="202" path="m,l,21600r21600,l21600,xe">
-          <v:stroke joinstyle="miter"/>
-          <v:path gradientshapeok="t" o:connecttype="rect"/>
-        </v:shapetype>
-        <v:shape id="Text Box 2" o:spid="_x0000_s1026" type="#_x0000_t202" style="position:absolute;margin-left:71.95pt;margin-top:.45pt;width:63.35pt;height:12.6pt;z-index:251694080;visibility:visible;mso-wrap-distance-top:3.6pt;mso-wrap-distance-bottom:3.6pt;mso-position-horizontal:right;mso-position-horizontal-relative:margin;mso-position-vertical-relative:text;mso-width-relative:margin;mso-height-relative:margin" o:gfxdata="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" stroked="f">
-          <v:textbox style="mso-fit-shape-to-text:t" inset="0,0,0,0">
-            <w:txbxContent>
-              <w:p>
-                <w:pPr>
-                  <w:pStyle w:val="Piedepgina"/>
-                  <w:jc w:val="right"/>
-                  <w:rPr>
-                    <w:b/>
-                    <w:bCs/>
-                  </w:rPr>
-                </w:pPr>
-                <w:r>
-                  <w:t xml:space="preserve">Page </w:t>
-                </w:r>
-                <w:r>
-                  <w:rPr>
-                    <w:b/>
-                    <w:bCs/>
-                  </w:rPr>
-                  <w:fldChar w:fldCharType="begin"/>
-                </w:r>
-                <w:r>
-                  <w:rPr>
-                    <w:b/>
-                    <w:bCs/>
-                  </w:rPr>
-                  <w:instrText xml:space="preserve"> PAGE  \* Arabic  \* MERGEFORMAT </w:instrText>
-                </w:r>
-                <w:r>
-                  <w:rPr>
-                    <w:b/>
-                    <w:bCs/>
-                  </w:rPr>
-                  <w:fldChar w:fldCharType="separate"/>
-                </w:r>
-                <w:r>
-                  <w:rPr>
-                    <w:b/>
-                    <w:bCs/>
-                    <w:noProof/>
-                  </w:rPr>
-                  <w:t>9</w:t>
-                </w:r>
-                <w:r>
-                  <w:rPr>
-                    <w:b/>
-                    <w:bCs/>
-                  </w:rPr>
-                  <w:fldChar w:fldCharType="end"/>
-                </w:r>
-                <w:r>
-                  <w:t xml:space="preserve"> of </w:t>
-                </w:r>
-                <w:fldSimple w:instr=" NUMPAGES  \* Arabic  \* MERGEFORMAT ">
-                  <w:r>
-                    <w:rPr>
-                      <w:b/>
-                      <w:bCs/>
-                      <w:noProof/>
-                    </w:rPr>
-                    <w:t>12</w:t>
-                  </w:r>
-                </w:fldSimple>
-              </w:p>
-            </w:txbxContent>
-          </v:textbox>
-          <w10:wrap type="square" anchorx="margin"/>
-        </v:shape>
-      </w:pict>
-    </w:r>
-  </w:p>
-</w:ftr>
-</file>
-
-<file path=word/footer2.xml><?xml version="1.0" encoding="utf-8"?>
-<w:ftr xmlns:wpc="http://schemas.microsoft.com/office/word/2010/wordprocessingCanvas" xmlns:cx="http://schemas.microsoft.com/office/drawing/2014/chartex" xmlns:cx1="http://schemas.microsoft.com/office/drawing/2015/9/8/chartex" xmlns:cx2="http://schemas.microsoft.com/office/drawing/2015/10/21/chartex" xmlns:cx3="http://schemas.microsoft.com/office/drawing/2016/5/9/chartex" xmlns:cx4="http://schemas.microsoft.com/office/drawing/2016/5/10/chartex" xmlns:cx5="http://schemas.microsoft.com/office/drawing/2016/5/11/chartex" xmlns:cx6="http://schemas.microsoft.com/office/drawing/2016/5/12/chartex" xmlns:cx7="http://schemas.microsoft.com/office/drawing/2016/5/13/chartex" xmlns:cx8="http://schemas.microsoft.com/office/drawing/2016/5/14/chartex" xmlns:mc="http://schemas.openxmlformats.org/markup-compatibility/2006" xmlns:aink="http://schemas.microsoft.com/office/drawing/2016/ink" xmlns:am3d="http://schemas.microsoft.com/office/drawing/2017/model3d" xmlns:o="urn:schemas-microsoft-com:office:office" xmlns:oel="http://schemas.microsoft.com/office/2019/extlst" xmlns:r="http://schemas.openxmlformats.org/officeDocument/2006/relationships" xmlns:m="http://schemas.openxmlformats.org/officeDocument/2006/math" xmlns:v="urn:schemas-microsoft-com:vml" xmlns:wp14="http://schemas.microsoft.com/office/word/2010/wordprocessingDrawing" xmlns:wp="http://schemas.openxmlformats.org/drawingml/2006/wordprocessingDrawing" xmlns:w10="urn:schemas-microsoft-com:office:word" xmlns:w="http://schemas.openxmlformats.org/wordprocessingml/2006/main" xmlns:w14="http://schemas.microsoft.com/office/word/2010/wordml" xmlns:w15="http://schemas.microsoft.com/office/word/2012/wordml" xmlns:w16cex="http://schemas.microsoft.com/office/word/2018/wordml/cex" xmlns:w16cid="http://schemas.microsoft.com/office/word/2016/wordml/cid" xmlns:w16="http://schemas.microsoft.com/office/word/2018/wordml" xmlns:w16du="http://schemas.microsoft.com/office/word/2023/wordml/word16du" xmlns:w16sdtdh="http://schemas.microsoft.com/office/word/2020/wordml/sdtdatahash" xmlns:w16sdtfl="http://schemas.microsoft.com/office/word/2024/wordml/sdtformatlock" xmlns:w16se="http://schemas.microsoft.com/office/word/2015/wordml/symex" xmlns:wpg="http://schemas.microsoft.com/office/word/2010/wordprocessingGroup" xmlns:wpi="http://schemas.microsoft.com/office/word/2010/wordprocessingInk" xmlns:wne="http://schemas.microsoft.com/office/word/2006/wordml" xmlns:wps="http://schemas.microsoft.com/office/word/2010/wordprocessingShape" mc:Ignorable="w14 w15 w16se w16cid w16 w16cex w16sdtdh w16sdtfl w16du wp14">
-  <w:p>
-    <w:pPr>
-      <w:pStyle w:val="Piedepgina"/>
-      <w:jc w:val="right"/>
-    </w:pPr>
-  </w:p>
-</w:ftr>
-</file>
-
-<file path=word/footer3.xml><?xml version="1.0" encoding="utf-8"?>
-<w:ftr xmlns:wpc="http://schemas.microsoft.com/office/word/2010/wordprocessingCanvas" xmlns:cx="http://schemas.microsoft.com/office/drawing/2014/chartex" xmlns:cx1="http://schemas.microsoft.com/office/drawing/2015/9/8/chartex" xmlns:cx2="http://schemas.microsoft.com/office/drawing/2015/10/21/chartex" xmlns:cx3="http://schemas.microsoft.com/office/drawing/2016/5/9/chartex" xmlns:cx4="http://schemas.microsoft.com/office/drawing/2016/5/10/chartex" xmlns:cx5="http://schemas.microsoft.com/office/drawing/2016/5/11/chartex" xmlns:cx6="http://schemas.microsoft.com/office/drawing/2016/5/12/chartex" xmlns:cx7="http://schemas.microsoft.com/office/drawing/2016/5/13/chartex" xmlns:cx8="http://schemas.microsoft.com/office/drawing/2016/5/14/chartex" xmlns:mc="http://schemas.openxmlformats.org/markup-compatibility/2006" xmlns:aink="http://schemas.microsoft.com/office/drawing/2016/ink" xmlns:am3d="http://schemas.microsoft.com/office/drawing/2017/model3d" xmlns:o="urn:schemas-microsoft-com:office:office" xmlns:oel="http://schemas.microsoft.com/office/2019/extlst" xmlns:r="http://schemas.openxmlformats.org/officeDocument/2006/relationships" xmlns:m="http://schemas.openxmlformats.org/officeDocument/2006/math" xmlns:v="urn:schemas-microsoft-com:vml" xmlns:wp14="http://schemas.microsoft.com/office/word/2010/wordprocessingDrawing" xmlns:wp="http://schemas.openxmlformats.org/drawingml/2006/wordprocessingDrawing" xmlns:w10="urn:schemas-microsoft-com:office:word" xmlns:w="http://schemas.openxmlformats.org/wordprocessingml/2006/main" xmlns:w14="http://schemas.microsoft.com/office/word/2010/wordml" xmlns:w15="http://schemas.microsoft.com/office/word/2012/wordml" xmlns:w16cex="http://schemas.microsoft.com/office/word/2018/wordml/cex" xmlns:w16cid="http://schemas.microsoft.com/office/word/2016/wordml/cid" xmlns:w16="http://schemas.microsoft.com/office/word/2018/wordml" xmlns:w16du="http://schemas.microsoft.com/office/word/2023/wordml/word16du" xmlns:w16sdtdh="http://schemas.microsoft.com/office/word/2020/wordml/sdtdatahash" xmlns:w16sdtfl="http://schemas.microsoft.com/office/word/2024/wordml/sdtformatlock" xmlns:w16se="http://schemas.microsoft.com/office/word/2015/wordml/symex" xmlns:wpg="http://schemas.microsoft.com/office/word/2010/wordprocessingGroup" xmlns:wpi="http://schemas.microsoft.com/office/word/2010/wordprocessingInk" xmlns:wne="http://schemas.microsoft.com/office/word/2006/wordml" xmlns:wps="http://schemas.microsoft.com/office/word/2010/wordprocessingShape" mc:Ignorable="w14 w15 w16se w16cid w16 w16cex w16sdtdh w16sdtfl w16du wp14">
-  <w:p>
-    <w:pPr>
-      <w:pStyle w:val="Piedepgina"/>
-      <w:tabs>
-        <w:tab w:val="clear" w:pos="9026"/>
-        <w:tab w:val="right" w:pos="9575"/>
-      </w:tabs>
-    </w:pPr>
-    <w:r>
-      <w:rPr>
-        <w:rFonts w:hint="eastAsia"/>
-        <w:bCs/>
-        <w:lang w:val="en-GB"/>
-      </w:rPr>
-      <w:t>©</w:t>
-    </w:r>
-    <w:r>
-      <w:rPr>
-        <w:bCs/>
-        <w:lang w:val="en-GB"/>
-      </w:rPr>
-      <w:t xml:space="preserve"> 202</w:t>
-    </w:r>
-    <w:r>
-      <w:rPr>
-        <w:bCs/>
-        <w:lang w:val="en-GB"/>
-      </w:rPr>
-      <w:t>6</w:t>
-    </w:r>
     <w:r>
       <w:rPr>
         <w:bCs/>
@@ -1738,7 +1440,7 @@
           <v:stroke joinstyle="miter"/>
           <v:path gradientshapeok="t" o:connecttype="rect"/>
         </v:shapetype>
-        <v:shape id="_x0000_s1027" type="#_x0000_t202" style="position:absolute;margin-left:71.95pt;margin-top:.45pt;width:63.35pt;height:12.6pt;z-index:251683840;visibility:visible;mso-wrap-distance-top:3.6pt;mso-wrap-distance-bottom:3.6pt;mso-position-horizontal:right;mso-position-horizontal-relative:margin;mso-position-vertical-relative:text;mso-width-relative:margin;mso-height-relative:margin" o:gfxdata="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" stroked="f">
+        <v:shape id="_x0000_s1027" type="#_x0000_t202" style="position:absolute;margin-left:84.1pt;margin-top:.45pt;width:63.35pt;height:12.6pt;z-index:251683840;visibility:visible;mso-wrap-distance-top:3.6pt;mso-wrap-distance-bottom:3.6pt;mso-position-horizontal:right;mso-position-horizontal-relative:margin;mso-position-vertical-relative:text;mso-width-relative:margin;mso-height-relative:margin" o:gfxdata="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" stroked="f">
           <v:textbox style="mso-fit-shape-to-text:t" inset="0,0,0,0">
             <w:txbxContent>
               <w:p>
@@ -1836,228 +1538,6 @@
 
 <file path=word/header1.xml><?xml version="1.0" encoding="utf-8"?>
 <w:hdr xmlns:wpc="http://schemas.microsoft.com/office/word/2010/wordprocessingCanvas" xmlns:cx="http://schemas.microsoft.com/office/drawing/2014/chartex" xmlns:cx1="http://schemas.microsoft.com/office/drawing/2015/9/8/chartex" xmlns:cx2="http://schemas.microsoft.com/office/drawing/2015/10/21/chartex" xmlns:cx3="http://schemas.microsoft.com/office/drawing/2016/5/9/chartex" xmlns:cx4="http://schemas.microsoft.com/office/drawing/2016/5/10/chartex" xmlns:cx5="http://schemas.microsoft.com/office/drawing/2016/5/11/chartex" xmlns:cx6="http://schemas.microsoft.com/office/drawing/2016/5/12/chartex" xmlns:cx7="http://schemas.microsoft.com/office/drawing/2016/5/13/chartex" xmlns:cx8="http://schemas.microsoft.com/office/drawing/2016/5/14/chartex" xmlns:mc="http://schemas.openxmlformats.org/markup-compatibility/2006" xmlns:aink="http://schemas.microsoft.com/office/drawing/2016/ink" xmlns:am3d="http://schemas.microsoft.com/office/drawing/2017/model3d" xmlns:o="urn:schemas-microsoft-com:office:office" xmlns:oel="http://schemas.microsoft.com/office/2019/extlst" xmlns:r="http://schemas.openxmlformats.org/officeDocument/2006/relationships" xmlns:m="http://schemas.openxmlformats.org/officeDocument/2006/math" xmlns:v="urn:schemas-microsoft-com:vml" xmlns:wp14="http://schemas.microsoft.com/office/word/2010/wordprocessingDrawing" xmlns:wp="http://schemas.openxmlformats.org/drawingml/2006/wordprocessingDrawing" xmlns:w10="urn:schemas-microsoft-com:office:word" xmlns:w="http://schemas.openxmlformats.org/wordprocessingml/2006/main" xmlns:w14="http://schemas.microsoft.com/office/word/2010/wordml" xmlns:w15="http://schemas.microsoft.com/office/word/2012/wordml" xmlns:w16cex="http://schemas.microsoft.com/office/word/2018/wordml/cex" xmlns:w16cid="http://schemas.microsoft.com/office/word/2016/wordml/cid" xmlns:w16="http://schemas.microsoft.com/office/word/2018/wordml" xmlns:w16du="http://schemas.microsoft.com/office/word/2023/wordml/word16du" xmlns:w16sdtdh="http://schemas.microsoft.com/office/word/2020/wordml/sdtdatahash" xmlns:w16sdtfl="http://schemas.microsoft.com/office/word/2024/wordml/sdtformatlock" xmlns:w16se="http://schemas.microsoft.com/office/word/2015/wordml/symex" xmlns:wpg="http://schemas.microsoft.com/office/word/2010/wordprocessingGroup" xmlns:wpi="http://schemas.microsoft.com/office/word/2010/wordprocessingInk" xmlns:wne="http://schemas.microsoft.com/office/word/2006/wordml" xmlns:wps="http://schemas.microsoft.com/office/word/2010/wordprocessingShape" mc:Ignorable="w14 w15 w16se w16cid w16 w16cex w16sdtdh w16sdtfl w16du wp14">
-  <w:sdt>
-    <w:sdtPr>
-      <w:rPr>
-        <w:noProof/>
-      </w:rPr>
-      <w:alias w:val="Title"/>
-      <w:tag w:val="Title"/>
-      <w:id w:val="-1121457527"/>
-      <w:lock w:val="sdtContentLocked"/>
-      <w:placeholder>
-        <w:docPart w:val="DefaultPlaceholder_-1854013440"/>
-      </w:placeholder>
-    </w:sdtPr>
-    <w:sdtContent>
-      <w:p>
-        <w:pPr>
-          <w:pStyle w:val="Encabezado"/>
-          <w:tabs>
-            <w:tab w:val="clear" w:pos="9026"/>
-          </w:tabs>
-          <w:rPr>
-            <w:lang w:val="es-ES"/>
-          </w:rPr>
-        </w:pPr>
-        <w:r>
-          <w:rPr>
-            <w:noProof/>
-            <w:lang w:val="es-ES" w:eastAsia="es-ES"/>
-          </w:rPr>
-          <w:drawing>
-            <wp:anchor distT="0" distB="0" distL="114300" distR="114300" simplePos="0" relativeHeight="251658240" behindDoc="0" locked="0" layoutInCell="1" allowOverlap="1" wp14:anchorId="039F4826" wp14:editId="039F4827">
-              <wp:simplePos x="0" y="0"/>
-              <wp:positionH relativeFrom="margin">
-                <wp:align>right</wp:align>
-              </wp:positionH>
-              <wp:positionV relativeFrom="paragraph">
-                <wp:posOffset>-635</wp:posOffset>
-              </wp:positionV>
-              <wp:extent cx="1223645" cy="249555"/>
-              <wp:effectExtent l="0" t="0" r="0" b="0"/>
-              <wp:wrapNone/>
-              <wp:docPr id="206229929" name="Graphic 701481139">
-                <a:extLst xmlns:a="http://schemas.openxmlformats.org/drawingml/2006/main">
-                  <a:ext uri="{FF2B5EF4-FFF2-40B4-BE49-F238E27FC236}">
-                    <a16:creationId xmlns:a16="http://schemas.microsoft.com/office/drawing/2014/main" id="{1DB40E02-E43E-21B5-7D2A-60B35F0977AE}"/>
-                  </a:ext>
-                  <a:ext uri="{C183D7F6-B498-43B3-948B-1728B52AA6E4}">
-                    <adec:decorative xmlns:adec="http://schemas.microsoft.com/office/drawing/2017/decorative" val="1"/>
-                  </a:ext>
-                </a:extLst>
-              </wp:docPr>
-              <wp:cNvGraphicFramePr>
-                <a:graphicFrameLocks xmlns:a="http://schemas.openxmlformats.org/drawingml/2006/main" noChangeAspect="1"/>
-              </wp:cNvGraphicFramePr>
-              <a:graphic xmlns:a="http://schemas.openxmlformats.org/drawingml/2006/main">
-                <a:graphicData uri="http://schemas.openxmlformats.org/drawingml/2006/picture">
-                  <pic:pic xmlns:pic="http://schemas.openxmlformats.org/drawingml/2006/picture">
-                    <pic:nvPicPr>
-                      <pic:cNvPr id="7" name="Logo">
-                        <a:extLst>
-                          <a:ext uri="{FF2B5EF4-FFF2-40B4-BE49-F238E27FC236}">
-                            <a16:creationId xmlns:a16="http://schemas.microsoft.com/office/drawing/2014/main" id="{1DB40E02-E43E-21B5-7D2A-60B35F0977AE}"/>
-                          </a:ext>
-                          <a:ext uri="{C183D7F6-B498-43B3-948B-1728B52AA6E4}">
-                            <adec:decorative xmlns:adec="http://schemas.microsoft.com/office/drawing/2017/decorative" val="1"/>
-                          </a:ext>
-                        </a:extLst>
-                      </pic:cNvPr>
-                      <pic:cNvPicPr/>
-                    </pic:nvPicPr>
-                    <pic:blipFill>
-                      <a:blip r:embed="rId1">
-                        <a:extLst>
-                          <a:ext uri="{28A0092B-C50C-407E-A947-70E740481C1C}">
-                            <a14:useLocalDpi xmlns:a14="http://schemas.microsoft.com/office/drawing/2010/main" val="0"/>
-                          </a:ext>
-                          <a:ext uri="{96DAC541-7B7A-43D3-8B79-37D633B846F1}">
-                            <asvg:svgBlip xmlns:asvg="http://schemas.microsoft.com/office/drawing/2016/SVG/main" r:embed="rId2"/>
-                          </a:ext>
-                        </a:extLst>
-                      </a:blip>
-                      <a:stretch>
-                        <a:fillRect/>
-                      </a:stretch>
-                    </pic:blipFill>
-                    <pic:spPr>
-                      <a:xfrm>
-                        <a:off x="0" y="0"/>
-                        <a:ext cx="1223645" cy="249555"/>
-                      </a:xfrm>
-                      <a:prstGeom prst="rect">
-                        <a:avLst/>
-                      </a:prstGeom>
-                    </pic:spPr>
-                  </pic:pic>
-                </a:graphicData>
-              </a:graphic>
-            </wp:anchor>
-          </w:drawing>
-        </w:r>
-        <w:r>
-          <w:rPr>
-            <w:noProof/>
-          </w:rPr>
-          <w:fldChar w:fldCharType="begin"/>
-        </w:r>
-        <w:r>
-          <w:rPr>
-            <w:noProof/>
-          </w:rPr>
-          <w:instrText xml:space="preserve"> STYLEREF  Title  \* MERGEFORMAT </w:instrText>
-        </w:r>
-        <w:r>
-          <w:rPr>
-            <w:noProof/>
-          </w:rPr>
-          <w:fldChar w:fldCharType="separate"/>
-        </w:r>
-        <w:r>
-          <w:rPr>
-            <w:b/>
-            <w:bCs/>
-            <w:noProof/>
-            <w:lang w:val="es-ES"/>
-          </w:rPr>
-          <w:t>¡Error! Utilice la pestaña Inicio para aplicar Title al texto que desea que aparezca aquí.</w:t>
-        </w:r>
-        <w:r>
-          <w:rPr>
-            <w:noProof/>
-          </w:rPr>
-          <w:fldChar w:fldCharType="end"/>
-        </w:r>
-      </w:p>
-    </w:sdtContent>
-  </w:sdt>
-  <w:p>
-    <w:pPr>
-      <w:pStyle w:val="Encabezado"/>
-      <w:rPr>
-        <w:lang w:val="es-ES"/>
-      </w:rPr>
-    </w:pPr>
-  </w:p>
-  <w:p>
-    <w:pPr>
-      <w:pStyle w:val="Encabezado"/>
-      <w:rPr>
-        <w:lang w:val="es-ES"/>
-      </w:rPr>
-    </w:pPr>
-  </w:p>
-  <w:p>
-    <w:pPr>
-      <w:pStyle w:val="Encabezado"/>
-      <w:rPr>
-        <w:lang w:val="es-ES"/>
-      </w:rPr>
-    </w:pPr>
-  </w:p>
-</w:hdr>
-</file>
-
-<file path=word/header2.xml><?xml version="1.0" encoding="utf-8"?>
-<w:hdr xmlns:wpc="http://schemas.microsoft.com/office/word/2010/wordprocessingCanvas" xmlns:cx="http://schemas.microsoft.com/office/drawing/2014/chartex" xmlns:cx1="http://schemas.microsoft.com/office/drawing/2015/9/8/chartex" xmlns:cx2="http://schemas.microsoft.com/office/drawing/2015/10/21/chartex" xmlns:cx3="http://schemas.microsoft.com/office/drawing/2016/5/9/chartex" xmlns:cx4="http://schemas.microsoft.com/office/drawing/2016/5/10/chartex" xmlns:cx5="http://schemas.microsoft.com/office/drawing/2016/5/11/chartex" xmlns:cx6="http://schemas.microsoft.com/office/drawing/2016/5/12/chartex" xmlns:cx7="http://schemas.microsoft.com/office/drawing/2016/5/13/chartex" xmlns:cx8="http://schemas.microsoft.com/office/drawing/2016/5/14/chartex" xmlns:mc="http://schemas.openxmlformats.org/markup-compatibility/2006" xmlns:aink="http://schemas.microsoft.com/office/drawing/2016/ink" xmlns:am3d="http://schemas.microsoft.com/office/drawing/2017/model3d" xmlns:o="urn:schemas-microsoft-com:office:office" xmlns:oel="http://schemas.microsoft.com/office/2019/extlst" xmlns:r="http://schemas.openxmlformats.org/officeDocument/2006/relationships" xmlns:m="http://schemas.openxmlformats.org/officeDocument/2006/math" xmlns:v="urn:schemas-microsoft-com:vml" xmlns:wp14="http://schemas.microsoft.com/office/word/2010/wordprocessingDrawing" xmlns:wp="http://schemas.openxmlformats.org/drawingml/2006/wordprocessingDrawing" xmlns:w10="urn:schemas-microsoft-com:office:word" xmlns:w="http://schemas.openxmlformats.org/wordprocessingml/2006/main" xmlns:w14="http://schemas.microsoft.com/office/word/2010/wordml" xmlns:w15="http://schemas.microsoft.com/office/word/2012/wordml" xmlns:w16cex="http://schemas.microsoft.com/office/word/2018/wordml/cex" xmlns:w16cid="http://schemas.microsoft.com/office/word/2016/wordml/cid" xmlns:w16="http://schemas.microsoft.com/office/word/2018/wordml" xmlns:w16du="http://schemas.microsoft.com/office/word/2023/wordml/word16du" xmlns:w16sdtdh="http://schemas.microsoft.com/office/word/2020/wordml/sdtdatahash" xmlns:w16sdtfl="http://schemas.microsoft.com/office/word/2024/wordml/sdtformatlock" xmlns:w16se="http://schemas.microsoft.com/office/word/2015/wordml/symex" xmlns:wpg="http://schemas.microsoft.com/office/word/2010/wordprocessingGroup" xmlns:wpi="http://schemas.microsoft.com/office/word/2010/wordprocessingInk" xmlns:wne="http://schemas.microsoft.com/office/word/2006/wordml" xmlns:wps="http://schemas.microsoft.com/office/word/2010/wordprocessingShape" mc:Ignorable="w14 w15 w16se w16cid w16 w16cex w16sdtdh w16sdtfl w16du wp14">
-  <w:p>
-    <w:pPr>
-      <w:pStyle w:val="Encabezado"/>
-    </w:pPr>
-    <w:r>
-      <w:rPr>
-        <w:noProof/>
-        <w:lang w:val="es-ES" w:eastAsia="es-ES"/>
-      </w:rPr>
-      <w:drawing>
-        <wp:inline distT="0" distB="0" distL="0" distR="0" wp14:anchorId="039F4829" wp14:editId="039F482A">
-          <wp:extent cx="1552575" cy="426402"/>
-          <wp:effectExtent l="0" t="0" r="0" b="0"/>
-          <wp:docPr id="2098361715" name="Picture 1" descr="A blue text on a black background&#10;&#10;Description automatically generated"/>
-          <wp:cNvGraphicFramePr>
-            <a:graphicFrameLocks xmlns:a="http://schemas.openxmlformats.org/drawingml/2006/main" noChangeAspect="1"/>
-          </wp:cNvGraphicFramePr>
-          <a:graphic xmlns:a="http://schemas.openxmlformats.org/drawingml/2006/main">
-            <a:graphicData uri="http://schemas.openxmlformats.org/drawingml/2006/picture">
-              <pic:pic xmlns:pic="http://schemas.openxmlformats.org/drawingml/2006/picture">
-                <pic:nvPicPr>
-                  <pic:cNvPr id="2145108023" name="Picture 1" descr="A blue text on a black background&#10;&#10;Description automatically generated"/>
-                  <pic:cNvPicPr/>
-                </pic:nvPicPr>
-                <pic:blipFill>
-                  <a:blip r:embed="rId1">
-                    <a:extLst>
-                      <a:ext uri="{28A0092B-C50C-407E-A947-70E740481C1C}">
-                        <a14:useLocalDpi xmlns:a14="http://schemas.microsoft.com/office/drawing/2010/main" val="0"/>
-                      </a:ext>
-                    </a:extLst>
-                  </a:blip>
-                  <a:stretch>
-                    <a:fillRect/>
-                  </a:stretch>
-                </pic:blipFill>
-                <pic:spPr>
-                  <a:xfrm>
-                    <a:off x="0" y="0"/>
-                    <a:ext cx="1573024" cy="432018"/>
-                  </a:xfrm>
-                  <a:prstGeom prst="rect">
-                    <a:avLst/>
-                  </a:prstGeom>
-                </pic:spPr>
-              </pic:pic>
-            </a:graphicData>
-          </a:graphic>
-        </wp:inline>
-      </w:drawing>
-    </w:r>
-  </w:p>
-</w:hdr>
-</file>
-
-<file path=word/header3.xml><?xml version="1.0" encoding="utf-8"?>
-<w:hdr xmlns:wpc="http://schemas.microsoft.com/office/word/2010/wordprocessingCanvas" xmlns:cx="http://schemas.microsoft.com/office/drawing/2014/chartex" xmlns:cx1="http://schemas.microsoft.com/office/drawing/2015/9/8/chartex" xmlns:cx2="http://schemas.microsoft.com/office/drawing/2015/10/21/chartex" xmlns:cx3="http://schemas.microsoft.com/office/drawing/2016/5/9/chartex" xmlns:cx4="http://schemas.microsoft.com/office/drawing/2016/5/10/chartex" xmlns:cx5="http://schemas.microsoft.com/office/drawing/2016/5/11/chartex" xmlns:cx6="http://schemas.microsoft.com/office/drawing/2016/5/12/chartex" xmlns:cx7="http://schemas.microsoft.com/office/drawing/2016/5/13/chartex" xmlns:cx8="http://schemas.microsoft.com/office/drawing/2016/5/14/chartex" xmlns:mc="http://schemas.openxmlformats.org/markup-compatibility/2006" xmlns:aink="http://schemas.microsoft.com/office/drawing/2016/ink" xmlns:am3d="http://schemas.microsoft.com/office/drawing/2017/model3d" xmlns:o="urn:schemas-microsoft-com:office:office" xmlns:oel="http://schemas.microsoft.com/office/2019/extlst" xmlns:r="http://schemas.openxmlformats.org/officeDocument/2006/relationships" xmlns:m="http://schemas.openxmlformats.org/officeDocument/2006/math" xmlns:v="urn:schemas-microsoft-com:vml" xmlns:wp14="http://schemas.microsoft.com/office/word/2010/wordprocessingDrawing" xmlns:wp="http://schemas.openxmlformats.org/drawingml/2006/wordprocessingDrawing" xmlns:w10="urn:schemas-microsoft-com:office:word" xmlns:w="http://schemas.openxmlformats.org/wordprocessingml/2006/main" xmlns:w14="http://schemas.microsoft.com/office/word/2010/wordml" xmlns:w15="http://schemas.microsoft.com/office/word/2012/wordml" xmlns:w16cex="http://schemas.microsoft.com/office/word/2018/wordml/cex" xmlns:w16cid="http://schemas.microsoft.com/office/word/2016/wordml/cid" xmlns:w16="http://schemas.microsoft.com/office/word/2018/wordml" xmlns:w16du="http://schemas.microsoft.com/office/word/2023/wordml/word16du" xmlns:w16sdtdh="http://schemas.microsoft.com/office/word/2020/wordml/sdtdatahash" xmlns:w16sdtfl="http://schemas.microsoft.com/office/word/2024/wordml/sdtformatlock" xmlns:w16se="http://schemas.microsoft.com/office/word/2015/wordml/symex" xmlns:wpg="http://schemas.microsoft.com/office/word/2010/wordprocessingGroup" xmlns:wpi="http://schemas.microsoft.com/office/word/2010/wordprocessingInk" xmlns:wne="http://schemas.microsoft.com/office/word/2006/wordml" xmlns:wps="http://schemas.microsoft.com/office/word/2010/wordprocessingShape" mc:Ignorable="w14 w15 w16se w16cid w16 w16cex w16sdtdh w16sdtfl w16du wp14">
   <w:p>
     <w:pPr>
       <w:pStyle w:val="Encabezado"/>
@@ -2124,7 +1604,7 @@
 </w:hdr>
 </file>
 
-<file path=word/header4.xml><?xml version="1.0" encoding="utf-8"?>
+<file path=word/header2.xml><?xml version="1.0" encoding="utf-8"?>
 <w:hdr xmlns:wpc="http://schemas.microsoft.com/office/word/2010/wordprocessingCanvas" xmlns:cx="http://schemas.microsoft.com/office/drawing/2014/chartex" xmlns:cx1="http://schemas.microsoft.com/office/drawing/2015/9/8/chartex" xmlns:cx2="http://schemas.microsoft.com/office/drawing/2015/10/21/chartex" xmlns:cx3="http://schemas.microsoft.com/office/drawing/2016/5/9/chartex" xmlns:cx4="http://schemas.microsoft.com/office/drawing/2016/5/10/chartex" xmlns:cx5="http://schemas.microsoft.com/office/drawing/2016/5/11/chartex" xmlns:cx6="http://schemas.microsoft.com/office/drawing/2016/5/12/chartex" xmlns:cx7="http://schemas.microsoft.com/office/drawing/2016/5/13/chartex" xmlns:cx8="http://schemas.microsoft.com/office/drawing/2016/5/14/chartex" xmlns:mc="http://schemas.openxmlformats.org/markup-compatibility/2006" xmlns:aink="http://schemas.microsoft.com/office/drawing/2016/ink" xmlns:am3d="http://schemas.microsoft.com/office/drawing/2017/model3d" xmlns:o="urn:schemas-microsoft-com:office:office" xmlns:oel="http://schemas.microsoft.com/office/2019/extlst" xmlns:r="http://schemas.openxmlformats.org/officeDocument/2006/relationships" xmlns:m="http://schemas.openxmlformats.org/officeDocument/2006/math" xmlns:v="urn:schemas-microsoft-com:vml" xmlns:wp14="http://schemas.microsoft.com/office/word/2010/wordprocessingDrawing" xmlns:wp="http://schemas.openxmlformats.org/drawingml/2006/wordprocessingDrawing" xmlns:w10="urn:schemas-microsoft-com:office:word" xmlns:w="http://schemas.openxmlformats.org/wordprocessingml/2006/main" xmlns:w14="http://schemas.microsoft.com/office/word/2010/wordml" xmlns:w15="http://schemas.microsoft.com/office/word/2012/wordml" xmlns:w16cex="http://schemas.microsoft.com/office/word/2018/wordml/cex" xmlns:w16cid="http://schemas.microsoft.com/office/word/2016/wordml/cid" xmlns:w16="http://schemas.microsoft.com/office/word/2018/wordml" xmlns:w16du="http://schemas.microsoft.com/office/word/2023/wordml/word16du" xmlns:w16sdtdh="http://schemas.microsoft.com/office/word/2020/wordml/sdtdatahash" xmlns:w16sdtfl="http://schemas.microsoft.com/office/word/2024/wordml/sdtformatlock" xmlns:w16se="http://schemas.microsoft.com/office/word/2015/wordml/symex" xmlns:wpg="http://schemas.microsoft.com/office/word/2010/wordprocessingGroup" xmlns:wpi="http://schemas.microsoft.com/office/word/2010/wordprocessingInk" xmlns:wne="http://schemas.microsoft.com/office/word/2006/wordml" xmlns:wps="http://schemas.microsoft.com/office/word/2010/wordprocessingShape" mc:Ignorable="w14 w15 w16se w16cid w16 w16cex w16sdtdh w16sdtfl w16du wp14">
   <w:p>
     <w:pPr>
@@ -23077,7 +22557,11 @@
     <w:name w:val="Bullet"/>
     <w:basedOn w:val="NTTFlushBullet1"/>
     <w:qFormat/>
-    <w:rsid w:val="00E728B1"/>
+    <w:rsid w:val="0051663B"/>
+    <w:pPr>
+      <w:spacing w:after="240"/>
+      <w:contextualSpacing w:val="0"/>
+    </w:pPr>
   </w:style>
   <w:style w:type="paragraph" w:styleId="Sinespaciado">
     <w:name w:val="No Spacing"/>
@@ -29915,736 +29399,6 @@
     </w:tblStylePr>
   </w:style>
 </w:styles>
-</file>
-
-<file path=word/glossary/document.xml><?xml version="1.0" encoding="utf-8"?>
-<w:glossaryDocument xmlns:wpc="http://schemas.microsoft.com/office/word/2010/wordprocessingCanvas" xmlns:cx="http://schemas.microsoft.com/office/drawing/2014/chartex" xmlns:cx1="http://schemas.microsoft.com/office/drawing/2015/9/8/chartex" xmlns:cx2="http://schemas.microsoft.com/office/drawing/2015/10/21/chartex" xmlns:cx3="http://schemas.microsoft.com/office/drawing/2016/5/9/chartex" xmlns:cx4="http://schemas.microsoft.com/office/drawing/2016/5/10/chartex" xmlns:cx5="http://schemas.microsoft.com/office/drawing/2016/5/11/chartex" xmlns:cx6="http://schemas.microsoft.com/office/drawing/2016/5/12/chartex" xmlns:cx7="http://schemas.microsoft.com/office/drawing/2016/5/13/chartex" xmlns:cx8="http://schemas.microsoft.com/office/drawing/2016/5/14/chartex" xmlns:mc="http://schemas.openxmlformats.org/markup-compatibility/2006" xmlns:aink="http://schemas.microsoft.com/office/drawing/2016/ink" xmlns:am3d="http://schemas.microsoft.com/office/drawing/2017/model3d" xmlns:o="urn:schemas-microsoft-com:office:office" xmlns:oel="http://schemas.microsoft.com/office/2019/extlst" xmlns:r="http://schemas.openxmlformats.org/officeDocument/2006/relationships" xmlns:m="http://schemas.openxmlformats.org/officeDocument/2006/math" xmlns:v="urn:schemas-microsoft-com:vml" xmlns:wp14="http://schemas.microsoft.com/office/word/2010/wordprocessingDrawing" xmlns:wp="http://schemas.openxmlformats.org/drawingml/2006/wordprocessingDrawing" xmlns:w10="urn:schemas-microsoft-com:office:word" xmlns:w="http://schemas.openxmlformats.org/wordprocessingml/2006/main" xmlns:w14="http://schemas.microsoft.com/office/word/2010/wordml" xmlns:w15="http://schemas.microsoft.com/office/word/2012/wordml" xmlns:w16cex="http://schemas.microsoft.com/office/word/2018/wordml/cex" xmlns:w16cid="http://schemas.microsoft.com/office/word/2016/wordml/cid" xmlns:w16="http://schemas.microsoft.com/office/word/2018/wordml" xmlns:w16du="http://schemas.microsoft.com/office/word/2023/wordml/word16du" xmlns:w16sdtdh="http://schemas.microsoft.com/office/word/2020/wordml/sdtdatahash" xmlns:w16sdtfl="http://schemas.microsoft.com/office/word/2024/wordml/sdtformatlock" xmlns:w16se="http://schemas.microsoft.com/office/word/2015/wordml/symex" xmlns:wpg="http://schemas.microsoft.com/office/word/2010/wordprocessingGroup" xmlns:wpi="http://schemas.microsoft.com/office/word/2010/wordprocessingInk" xmlns:wne="http://schemas.microsoft.com/office/word/2006/wordml" xmlns:wps="http://schemas.microsoft.com/office/word/2010/wordprocessingShape" mc:Ignorable="w14 w15 w16se w16cid w16 w16cex w16sdtdh w16sdtfl w16du wp14">
-  <w:docParts>
-    <w:docPart>
-      <w:docPartPr>
-        <w:name w:val="DefaultPlaceholder_-1854013440"/>
-        <w:category>
-          <w:name w:val="General"/>
-          <w:gallery w:val="placeholder"/>
-        </w:category>
-        <w:types>
-          <w:type w:val="bbPlcHdr"/>
-        </w:types>
-        <w:behaviors>
-          <w:behavior w:val="content"/>
-        </w:behaviors>
-        <w:guid w:val="{A54994FB-CE9A-4296-A86B-8438FEAF527F}"/>
-      </w:docPartPr>
-      <w:docPartBody>
-        <w:p>
-          <w:r>
-            <w:rPr>
-              <w:rStyle w:val="Textodelmarcadordeposicin"/>
-            </w:rPr>
-            <w:t>Click or tap here to enter text.</w:t>
-          </w:r>
-        </w:p>
-      </w:docPartBody>
-    </w:docPart>
-    <w:docPart>
-      <w:docPartPr>
-        <w:name w:val="F9B3FD16871F4C54ACF12EFE83A2BD4C"/>
-        <w:category>
-          <w:name w:val="General"/>
-          <w:gallery w:val="placeholder"/>
-        </w:category>
-        <w:types>
-          <w:type w:val="bbPlcHdr"/>
-        </w:types>
-        <w:behaviors>
-          <w:behavior w:val="content"/>
-        </w:behaviors>
-        <w:guid w:val="{4B24693D-798D-445E-B310-428280FDF684}"/>
-      </w:docPartPr>
-      <w:docPartBody>
-        <w:p>
-          <w:pPr>
-            <w:pStyle w:val="F9B3FD16871F4C54ACF12EFE83A2BD4C"/>
-          </w:pPr>
-          <w:r>
-            <w:rPr>
-              <w:bCs/>
-              <w:lang w:val="en-GB"/>
-            </w:rPr>
-            <w:t>[Legal Entity Information]</w:t>
-          </w:r>
-        </w:p>
-      </w:docPartBody>
-    </w:docPart>
-    <w:docPart>
-      <w:docPartPr>
-        <w:name w:val="AFC2A32C2DA549D79D2111FE3A5FBF8D"/>
-        <w:category>
-          <w:name w:val="General"/>
-          <w:gallery w:val="placeholder"/>
-        </w:category>
-        <w:types>
-          <w:type w:val="bbPlcHdr"/>
-        </w:types>
-        <w:behaviors>
-          <w:behavior w:val="content"/>
-        </w:behaviors>
-        <w:guid w:val="{F39A6668-4EFE-4D6A-BE1C-18E37564226E}"/>
-      </w:docPartPr>
-      <w:docPartBody>
-        <w:p>
-          <w:pPr>
-            <w:pStyle w:val="AFC2A32C2DA549D79D2111FE3A5FBF8D"/>
-          </w:pPr>
-          <w:r>
-            <w:rPr>
-              <w:rStyle w:val="Textodelmarcadordeposicin"/>
-            </w:rPr>
-            <w:t>Click or tap here to enter text.</w:t>
-          </w:r>
-        </w:p>
-      </w:docPartBody>
-    </w:docPart>
-  </w:docParts>
-</w:glossaryDocument>
-</file>
-
-<file path=word/glossary/fontTable.xml><?xml version="1.0" encoding="utf-8"?>
-<w:fonts xmlns:mc="http://schemas.openxmlformats.org/markup-compatibility/2006" xmlns:r="http://schemas.openxmlformats.org/officeDocument/2006/relationships" xmlns:w="http://schemas.openxmlformats.org/wordprocessingml/2006/main" xmlns:w14="http://schemas.microsoft.com/office/word/2010/wordml" xmlns:w15="http://schemas.microsoft.com/office/word/2012/wordml" xmlns:w16cex="http://schemas.microsoft.com/office/word/2018/wordml/cex" xmlns:w16cid="http://schemas.microsoft.com/office/word/2016/wordml/cid" xmlns:w16="http://schemas.microsoft.com/office/word/2018/wordml" xmlns:w16du="http://schemas.microsoft.com/office/word/2023/wordml/word16du" xmlns:w16sdtdh="http://schemas.microsoft.com/office/word/2020/wordml/sdtdatahash" xmlns:w16sdtfl="http://schemas.microsoft.com/office/word/2024/wordml/sdtformatlock" xmlns:w16se="http://schemas.microsoft.com/office/word/2015/wordml/symex" mc:Ignorable="w14 w15 w16se w16cid w16 w16cex w16sdtdh w16sdtfl w16du">
-  <w:font w:name="Symbol">
-    <w:panose1 w:val="05050102010706020507"/>
-    <w:charset w:val="02"/>
-    <w:family w:val="roman"/>
-    <w:pitch w:val="variable"/>
-    <w:sig w:usb0="00000000" w:usb1="10000000" w:usb2="00000000" w:usb3="00000000" w:csb0="80000000" w:csb1="00000000"/>
-  </w:font>
-  <w:font w:name="Times New Roman">
-    <w:panose1 w:val="02020603050405020304"/>
-    <w:charset w:val="00"/>
-    <w:family w:val="roman"/>
-    <w:pitch w:val="variable"/>
-    <w:sig w:usb0="E0002EFF" w:usb1="C000785B" w:usb2="00000009" w:usb3="00000000" w:csb0="000001FF" w:csb1="00000000"/>
-  </w:font>
-  <w:font w:name="Courier New">
-    <w:panose1 w:val="02070309020205020404"/>
-    <w:charset w:val="00"/>
-    <w:family w:val="modern"/>
-    <w:pitch w:val="fixed"/>
-    <w:sig w:usb0="E0002EFF" w:usb1="C0007843" w:usb2="00000009" w:usb3="00000000" w:csb0="000001FF" w:csb1="00000000"/>
-  </w:font>
-  <w:font w:name="Wingdings">
-    <w:panose1 w:val="05000000000000000000"/>
-    <w:charset w:val="02"/>
-    <w:family w:val="auto"/>
-    <w:pitch w:val="variable"/>
-    <w:sig w:usb0="00000000" w:usb1="10000000" w:usb2="00000000" w:usb3="00000000" w:csb0="80000000" w:csb1="00000000"/>
-  </w:font>
-  <w:font w:name="Arial Bold">
-    <w:altName w:val="Arial"/>
-    <w:panose1 w:val="00000000000000000000"/>
-    <w:charset w:val="00"/>
-    <w:family w:val="roman"/>
-    <w:notTrueType/>
-    <w:pitch w:val="default"/>
-  </w:font>
-  <w:font w:name="Arial">
-    <w:panose1 w:val="020B0604020202020204"/>
-    <w:charset w:val="00"/>
-    <w:family w:val="swiss"/>
-    <w:pitch w:val="variable"/>
-    <w:sig w:usb0="E0002EFF" w:usb1="C000785B" w:usb2="00000009" w:usb3="00000000" w:csb0="000001FF" w:csb1="00000000"/>
-  </w:font>
-  <w:font w:name="Georgia">
-    <w:panose1 w:val="02040502050405020303"/>
-    <w:charset w:val="00"/>
-    <w:family w:val="roman"/>
-    <w:pitch w:val="variable"/>
-    <w:sig w:usb0="00000287" w:usb1="00000000" w:usb2="00000000" w:usb3="00000000" w:csb0="0000009F" w:csb1="00000000"/>
-  </w:font>
-  <w:font w:name="Segoe UI">
-    <w:panose1 w:val="020B0502040204020203"/>
-    <w:charset w:val="00"/>
-    <w:family w:val="swiss"/>
-    <w:pitch w:val="variable"/>
-    <w:sig w:usb0="E4002EFF" w:usb1="C000E47F" w:usb2="00000009" w:usb3="00000000" w:csb0="000001FF" w:csb1="00000000"/>
-  </w:font>
-  <w:font w:name="MS PGothic">
-    <w:panose1 w:val="020B0600070205080204"/>
-    <w:charset w:val="80"/>
-    <w:family w:val="swiss"/>
-    <w:pitch w:val="variable"/>
-    <w:sig w:usb0="E00002FF" w:usb1="6AC7FDFB" w:usb2="08000012" w:usb3="00000000" w:csb0="0002009F" w:csb1="00000000"/>
-  </w:font>
-  <w:font w:name="Tahoma">
-    <w:panose1 w:val="020B0604030504040204"/>
-    <w:charset w:val="00"/>
-    <w:family w:val="swiss"/>
-    <w:pitch w:val="variable"/>
-    <w:sig w:usb0="E1002EFF" w:usb1="C000605B" w:usb2="00000029" w:usb3="00000000" w:csb0="000101FF" w:csb1="00000000"/>
-  </w:font>
-  <w:font w:name="Aptos">
-    <w:charset w:val="00"/>
-    <w:family w:val="swiss"/>
-    <w:pitch w:val="variable"/>
-    <w:sig w:usb0="20000287" w:usb1="00000003" w:usb2="00000000" w:usb3="00000000" w:csb0="0000019F" w:csb1="00000000"/>
-  </w:font>
-  <w:font w:name="Aptos Display">
-    <w:charset w:val="00"/>
-    <w:family w:val="swiss"/>
-    <w:pitch w:val="variable"/>
-    <w:sig w:usb0="20000287" w:usb1="00000003" w:usb2="00000000" w:usb3="00000000" w:csb0="0000019F" w:csb1="00000000"/>
-  </w:font>
-</w:fonts>
-</file>
-
-<file path=word/glossary/settings.xml><?xml version="1.0" encoding="utf-8"?>
-<w:settings xmlns:mc="http://schemas.openxmlformats.org/markup-compatibility/2006" xmlns:o="urn:schemas-microsoft-com:office:office" xmlns:r="http://schemas.openxmlformats.org/officeDocument/2006/relationships" xmlns:m="http://schemas.openxmlformats.org/officeDocument/2006/math" xmlns:v="urn:schemas-microsoft-com:vml" xmlns:w10="urn:schemas-microsoft-com:office:word" xmlns:w="http://schemas.openxmlformats.org/wordprocessingml/2006/main" xmlns:w14="http://schemas.microsoft.com/office/word/2010/wordml" xmlns:w15="http://schemas.microsoft.com/office/word/2012/wordml" xmlns:w16cex="http://schemas.microsoft.com/office/word/2018/wordml/cex" xmlns:w16cid="http://schemas.microsoft.com/office/word/2016/wordml/cid" xmlns:w16="http://schemas.microsoft.com/office/word/2018/wordml" xmlns:w16du="http://schemas.microsoft.com/office/word/2023/wordml/word16du" xmlns:w16sdtdh="http://schemas.microsoft.com/office/word/2020/wordml/sdtdatahash" xmlns:w16sdtfl="http://schemas.microsoft.com/office/word/2024/wordml/sdtformatlock" xmlns:w16se="http://schemas.microsoft.com/office/word/2015/wordml/symex" xmlns:sl="http://schemas.openxmlformats.org/schemaLibrary/2006/main" mc:Ignorable="w14 w15 w16se w16cid w16 w16cex w16sdtdh w16sdtfl w16du">
-  <w:view w:val="normal"/>
-  <w:defaultTabStop w:val="720"/>
-  <w:hyphenationZone w:val="425"/>
-  <w:characterSpacingControl w:val="doNotCompress"/>
-  <w:compat>
-    <w:useFELayout/>
-    <w:compatSetting w:name="compatibilityMode" w:uri="http://schemas.microsoft.com/office/word" w:val="12"/>
-    <w:compatSetting w:name="useWord2013TrackBottomHyphenation" w:uri="http://schemas.microsoft.com/office/word" w:val="1"/>
-  </w:compat>
-  <w:rsids>
-    <w:rsidRoot w:val="000620EA"/>
-    <w:rsid w:val="00010AEF"/>
-    <w:rsid w:val="000620EA"/>
-    <w:rsid w:val="00066FF7"/>
-    <w:rsid w:val="00151211"/>
-    <w:rsid w:val="00155B5A"/>
-    <w:rsid w:val="00266407"/>
-    <w:rsid w:val="0027666A"/>
-    <w:rsid w:val="002D2D5C"/>
-    <w:rsid w:val="0030429A"/>
-    <w:rsid w:val="00317C49"/>
-    <w:rsid w:val="003475B5"/>
-    <w:rsid w:val="003F0D2F"/>
-    <w:rsid w:val="004125B6"/>
-    <w:rsid w:val="004C1D09"/>
-    <w:rsid w:val="00503882"/>
-    <w:rsid w:val="005A6B75"/>
-    <w:rsid w:val="005C5439"/>
-    <w:rsid w:val="005C6527"/>
-    <w:rsid w:val="00615AC3"/>
-    <w:rsid w:val="00622C7E"/>
-    <w:rsid w:val="00636417"/>
-    <w:rsid w:val="00641AEA"/>
-    <w:rsid w:val="00655EC4"/>
-    <w:rsid w:val="006621A4"/>
-    <w:rsid w:val="0069018A"/>
-    <w:rsid w:val="006A0EE0"/>
-    <w:rsid w:val="006C5260"/>
-    <w:rsid w:val="007B6F7A"/>
-    <w:rsid w:val="007E030B"/>
-    <w:rsid w:val="008809DA"/>
-    <w:rsid w:val="008A3E95"/>
-    <w:rsid w:val="008A6AAC"/>
-    <w:rsid w:val="00926AFB"/>
-    <w:rsid w:val="009A3E4D"/>
-    <w:rsid w:val="009C3239"/>
-    <w:rsid w:val="00AA08D9"/>
-    <w:rsid w:val="00AD5B86"/>
-    <w:rsid w:val="00AE0F69"/>
-    <w:rsid w:val="00B206CE"/>
-    <w:rsid w:val="00CA61CA"/>
-    <w:rsid w:val="00CB31A5"/>
-    <w:rsid w:val="00CC0890"/>
-    <w:rsid w:val="00CD329B"/>
-    <w:rsid w:val="00CE61BE"/>
-    <w:rsid w:val="00D82043"/>
-    <w:rsid w:val="00DB4EA8"/>
-    <w:rsid w:val="00DC0C7E"/>
-    <w:rsid w:val="00DD56B1"/>
-    <w:rsid w:val="00DE21C5"/>
-    <w:rsid w:val="00DF07DD"/>
-    <w:rsid w:val="00E13578"/>
-    <w:rsid w:val="00E2540E"/>
-    <w:rsid w:val="00E563C7"/>
-    <w:rsid w:val="00EF018A"/>
-    <w:rsid w:val="00EF24ED"/>
-    <w:rsid w:val="00F94E0E"/>
-    <w:rsid w:val="00FB5D9B"/>
-  </w:rsids>
-  <m:mathPr>
-    <m:mathFont m:val="Cambria Math"/>
-    <m:brkBin m:val="before"/>
-    <m:brkBinSub m:val="--"/>
-    <m:smallFrac/>
-    <m:dispDef/>
-    <m:lMargin m:val="0"/>
-    <m:rMargin m:val="0"/>
-    <m:defJc m:val="centerGroup"/>
-    <m:wrapIndent m:val="1440"/>
-    <m:intLim m:val="subSup"/>
-    <m:naryLim m:val="undOvr"/>
-  </m:mathPr>
-  <w:themeFontLang w:val="es-ES"/>
-  <w:clrSchemeMapping w:bg1="light1" w:t1="dark1" w:bg2="light2" w:t2="dark2" w:accent1="accent1" w:accent2="accent2" w:accent3="accent3" w:accent4="accent4" w:accent5="accent5" w:accent6="accent6" w:hyperlink="hyperlink" w:followedHyperlink="followedHyperlink"/>
-  <w:decimalSymbol w:val=","/>
-  <w:listSeparator w:val=";"/>
-</w:settings>
-</file>
-
-<file path=word/glossary/styles.xml><?xml version="1.0" encoding="utf-8"?>
-<w:styles xmlns:mc="http://schemas.openxmlformats.org/markup-compatibility/2006" xmlns:r="http://schemas.openxmlformats.org/officeDocument/2006/relationships" xmlns:w="http://schemas.openxmlformats.org/wordprocessingml/2006/main" xmlns:w14="http://schemas.microsoft.com/office/word/2010/wordml" xmlns:w15="http://schemas.microsoft.com/office/word/2012/wordml" xmlns:w16cex="http://schemas.microsoft.com/office/word/2018/wordml/cex" xmlns:w16cid="http://schemas.microsoft.com/office/word/2016/wordml/cid" xmlns:w16="http://schemas.microsoft.com/office/word/2018/wordml" xmlns:w16du="http://schemas.microsoft.com/office/word/2023/wordml/word16du" xmlns:w16sdtdh="http://schemas.microsoft.com/office/word/2020/wordml/sdtdatahash" xmlns:w16sdtfl="http://schemas.microsoft.com/office/word/2024/wordml/sdtformatlock" xmlns:w16se="http://schemas.microsoft.com/office/word/2015/wordml/symex" mc:Ignorable="w14 w15 w16se w16cid w16 w16cex w16sdtdh w16sdtfl w16du">
-  <w:docDefaults>
-    <w:rPrDefault>
-      <w:rPr>
-        <w:rFonts w:asciiTheme="minorHAnsi" w:eastAsiaTheme="minorEastAsia" w:hAnsiTheme="minorHAnsi" w:cstheme="minorBidi"/>
-        <w:kern w:val="2"/>
-        <w:sz w:val="22"/>
-        <w:szCs w:val="22"/>
-        <w:lang w:val="en-US" w:eastAsia="en-US" w:bidi="ar-SA"/>
-      </w:rPr>
-    </w:rPrDefault>
-    <w:pPrDefault>
-      <w:pPr>
-        <w:spacing w:after="160" w:line="259" w:lineRule="auto"/>
-      </w:pPr>
-    </w:pPrDefault>
-  </w:docDefaults>
-  <w:latentStyles w:defLockedState="0" w:defUIPriority="99" w:defSemiHidden="0" w:defUnhideWhenUsed="0" w:defQFormat="0" w:count="376">
-    <w:lsdException w:name="Normal" w:uiPriority="0" w:qFormat="1"/>
-    <w:lsdException w:name="heading 1" w:uiPriority="9" w:qFormat="1"/>
-    <w:lsdException w:name="heading 2" w:semiHidden="1" w:uiPriority="9" w:unhideWhenUsed="1" w:qFormat="1"/>
-    <w:lsdException w:name="heading 3" w:semiHidden="1" w:uiPriority="9" w:unhideWhenUsed="1" w:qFormat="1"/>
-    <w:lsdException w:name="heading 4" w:semiHidden="1" w:uiPriority="9" w:unhideWhenUsed="1" w:qFormat="1"/>
-    <w:lsdException w:name="heading 5" w:semiHidden="1" w:uiPriority="9" w:unhideWhenUsed="1" w:qFormat="1"/>
-    <w:lsdException w:name="heading 6" w:semiHidden="1" w:uiPriority="9" w:unhideWhenUsed="1" w:qFormat="1"/>
-    <w:lsdException w:name="heading 7" w:semiHidden="1" w:uiPriority="9" w:unhideWhenUsed="1" w:qFormat="1"/>
-    <w:lsdException w:name="heading 8" w:semiHidden="1" w:uiPriority="9" w:unhideWhenUsed="1" w:qFormat="1"/>
-    <w:lsdException w:name="heading 9" w:semiHidden="1" w:uiPriority="9" w:unhideWhenUsed="1" w:qFormat="1"/>
-    <w:lsdException w:name="index 1" w:semiHidden="1" w:unhideWhenUsed="1"/>
-    <w:lsdException w:name="index 2" w:semiHidden="1" w:unhideWhenUsed="1"/>
-    <w:lsdException w:name="index 3" w:semiHidden="1" w:unhideWhenUsed="1"/>
-    <w:lsdException w:name="index 4" w:semiHidden="1" w:unhideWhenUsed="1"/>
-    <w:lsdException w:name="index 5" w:semiHidden="1" w:unhideWhenUsed="1"/>
-    <w:lsdException w:name="index 6" w:semiHidden="1" w:unhideWhenUsed="1"/>
-    <w:lsdException w:name="index 7" w:semiHidden="1" w:unhideWhenUsed="1"/>
-    <w:lsdException w:name="index 8" w:semiHidden="1" w:unhideWhenUsed="1"/>
-    <w:lsdException w:name="index 9" w:semiHidden="1" w:unhideWhenUsed="1"/>
-    <w:lsdException w:name="toc 1" w:semiHidden="1" w:uiPriority="39" w:unhideWhenUsed="1"/>
-    <w:lsdException w:name="toc 2" w:semiHidden="1" w:uiPriority="39" w:unhideWhenUsed="1"/>
-    <w:lsdException w:name="toc 3" w:semiHidden="1" w:uiPriority="39" w:unhideWhenUsed="1"/>
-    <w:lsdException w:name="toc 4" w:semiHidden="1" w:uiPriority="39" w:unhideWhenUsed="1"/>
-    <w:lsdException w:name="toc 5" w:semiHidden="1" w:uiPriority="39" w:unhideWhenUsed="1"/>
-    <w:lsdException w:name="toc 6" w:semiHidden="1" w:uiPriority="39" w:unhideWhenUsed="1"/>
-    <w:lsdException w:name="toc 7" w:semiHidden="1" w:uiPriority="39" w:unhideWhenUsed="1"/>
-    <w:lsdException w:name="toc 8" w:semiHidden="1" w:uiPriority="39" w:unhideWhenUsed="1"/>
-    <w:lsdException w:name="toc 9" w:semiHidden="1" w:uiPriority="39" w:unhideWhenUsed="1"/>
-    <w:lsdException w:name="Normal Indent" w:semiHidden="1" w:unhideWhenUsed="1"/>
-    <w:lsdException w:name="footnote text" w:semiHidden="1" w:unhideWhenUsed="1"/>
-    <w:lsdException w:name="annotation text" w:semiHidden="1" w:unhideWhenUsed="1"/>
-    <w:lsdException w:name="header" w:semiHidden="1" w:unhideWhenUsed="1"/>
-    <w:lsdException w:name="footer" w:semiHidden="1" w:unhideWhenUsed="1"/>
-    <w:lsdException w:name="index heading" w:semiHidden="1" w:unhideWhenUsed="1"/>
-    <w:lsdException w:name="caption" w:semiHidden="1" w:uiPriority="35" w:unhideWhenUsed="1" w:qFormat="1"/>
-    <w:lsdException w:name="table of figures" w:semiHidden="1" w:unhideWhenUsed="1"/>
-    <w:lsdException w:name="envelope address" w:semiHidden="1" w:unhideWhenUsed="1"/>
-    <w:lsdException w:name="envelope return" w:semiHidden="1" w:unhideWhenUsed="1"/>
-    <w:lsdException w:name="footnote reference" w:semiHidden="1" w:unhideWhenUsed="1"/>
-    <w:lsdException w:name="annotation reference" w:semiHidden="1" w:unhideWhenUsed="1"/>
-    <w:lsdException w:name="line number" w:semiHidden="1" w:unhideWhenUsed="1"/>
-    <w:lsdException w:name="page number" w:semiHidden="1" w:unhideWhenUsed="1"/>
-    <w:lsdException w:name="endnote reference" w:semiHidden="1" w:unhideWhenUsed="1"/>
-    <w:lsdException w:name="endnote text" w:semiHidden="1" w:unhideWhenUsed="1"/>
-    <w:lsdException w:name="table of authorities" w:semiHidden="1" w:unhideWhenUsed="1"/>
-    <w:lsdException w:name="macro" w:semiHidden="1" w:unhideWhenUsed="1"/>
-    <w:lsdException w:name="toa heading" w:semiHidden="1" w:unhideWhenUsed="1"/>
-    <w:lsdException w:name="List" w:semiHidden="1" w:unhideWhenUsed="1"/>
-    <w:lsdException w:name="List Bullet" w:semiHidden="1" w:unhideWhenUsed="1"/>
-    <w:lsdException w:name="List Number" w:semiHidden="1" w:unhideWhenUsed="1"/>
-    <w:lsdException w:name="List 2" w:semiHidden="1" w:unhideWhenUsed="1"/>
-    <w:lsdException w:name="List 3" w:semiHidden="1" w:unhideWhenUsed="1"/>
-    <w:lsdException w:name="List 4" w:semiHidden="1" w:unhideWhenUsed="1"/>
-    <w:lsdException w:name="List 5" w:semiHidden="1" w:unhideWhenUsed="1"/>
-    <w:lsdException w:name="List Bullet 2" w:semiHidden="1" w:unhideWhenUsed="1"/>
-    <w:lsdException w:name="List Bullet 3" w:semiHidden="1" w:unhideWhenUsed="1"/>
-    <w:lsdException w:name="List Bullet 4" w:semiHidden="1" w:unhideWhenUsed="1"/>
-    <w:lsdException w:name="List Bullet 5" w:semiHidden="1" w:unhideWhenUsed="1"/>
-    <w:lsdException w:name="List Number 2" w:semiHidden="1" w:unhideWhenUsed="1"/>
-    <w:lsdException w:name="List Number 3" w:semiHidden="1" w:unhideWhenUsed="1"/>
-    <w:lsdException w:name="List Number 4" w:semiHidden="1" w:unhideWhenUsed="1"/>
-    <w:lsdException w:name="List Number 5" w:semiHidden="1" w:unhideWhenUsed="1"/>
-    <w:lsdException w:name="Title" w:uiPriority="10" w:qFormat="1"/>
-    <w:lsdException w:name="Closing" w:semiHidden="1" w:unhideWhenUsed="1"/>
-    <w:lsdException w:name="Signature" w:semiHidden="1" w:unhideWhenUsed="1"/>
-    <w:lsdException w:name="Default Paragraph Font" w:semiHidden="1" w:uiPriority="1" w:unhideWhenUsed="1"/>
-    <w:lsdException w:name="Body Text" w:semiHidden="1" w:unhideWhenUsed="1"/>
-    <w:lsdException w:name="Body Text Indent" w:semiHidden="1" w:unhideWhenUsed="1"/>
-    <w:lsdException w:name="List Continue" w:semiHidden="1" w:unhideWhenUsed="1"/>
-    <w:lsdException w:name="List Continue 2" w:semiHidden="1" w:unhideWhenUsed="1"/>
-    <w:lsdException w:name="List Continue 3" w:semiHidden="1" w:unhideWhenUsed="1"/>
-    <w:lsdException w:name="List Continue 4" w:semiHidden="1" w:unhideWhenUsed="1"/>
-    <w:lsdException w:name="List Continue 5" w:semiHidden="1" w:unhideWhenUsed="1"/>
-    <w:lsdException w:name="Message Header" w:semiHidden="1" w:unhideWhenUsed="1"/>
-    <w:lsdException w:name="Subtitle" w:uiPriority="11" w:qFormat="1"/>
-    <w:lsdException w:name="Salutation" w:semiHidden="1" w:unhideWhenUsed="1"/>
-    <w:lsdException w:name="Date" w:semiHidden="1" w:unhideWhenUsed="1"/>
-    <w:lsdException w:name="Body Text First Indent" w:semiHidden="1" w:unhideWhenUsed="1"/>
-    <w:lsdException w:name="Body Text First Indent 2" w:semiHidden="1" w:unhideWhenUsed="1"/>
-    <w:lsdException w:name="Note Heading" w:semiHidden="1" w:unhideWhenUsed="1"/>
-    <w:lsdException w:name="Body Text 2" w:semiHidden="1" w:unhideWhenUsed="1"/>
-    <w:lsdException w:name="Body Text 3" w:semiHidden="1" w:unhideWhenUsed="1"/>
-    <w:lsdException w:name="Body Text Indent 2" w:semiHidden="1" w:unhideWhenUsed="1"/>
-    <w:lsdException w:name="Body Text Indent 3" w:semiHidden="1" w:unhideWhenUsed="1"/>
-    <w:lsdException w:name="Block Text" w:semiHidden="1" w:unhideWhenUsed="1"/>
-    <w:lsdException w:name="Hyperlink" w:semiHidden="1" w:unhideWhenUsed="1"/>
-    <w:lsdException w:name="FollowedHyperlink" w:semiHidden="1" w:unhideWhenUsed="1"/>
-    <w:lsdException w:name="Strong" w:uiPriority="22" w:qFormat="1"/>
-    <w:lsdException w:name="Emphasis" w:uiPriority="20" w:qFormat="1"/>
-    <w:lsdException w:name="Document Map" w:semiHidden="1" w:unhideWhenUsed="1"/>
-    <w:lsdException w:name="Plain Text" w:semiHidden="1" w:unhideWhenUsed="1"/>
-    <w:lsdException w:name="E-mail Signature" w:semiHidden="1" w:unhideWhenUsed="1"/>
-    <w:lsdException w:name="HTML Top of Form" w:semiHidden="1" w:unhideWhenUsed="1"/>
-    <w:lsdException w:name="HTML Bottom of Form" w:semiHidden="1" w:unhideWhenUsed="1"/>
-    <w:lsdException w:name="Normal (Web)" w:semiHidden="1" w:unhideWhenUsed="1"/>
-    <w:lsdException w:name="HTML Acronym" w:semiHidden="1" w:unhideWhenUsed="1"/>
-    <w:lsdException w:name="HTML Address" w:semiHidden="1" w:unhideWhenUsed="1"/>
-    <w:lsdException w:name="HTML Cite" w:semiHidden="1" w:unhideWhenUsed="1"/>
-    <w:lsdException w:name="HTML Code" w:semiHidden="1" w:unhideWhenUsed="1"/>
-    <w:lsdException w:name="HTML Definition" w:semiHidden="1" w:unhideWhenUsed="1"/>
-    <w:lsdException w:name="HTML Keyboard" w:semiHidden="1" w:unhideWhenUsed="1"/>
-    <w:lsdException w:name="HTML Preformatted" w:semiHidden="1" w:unhideWhenUsed="1"/>
-    <w:lsdException w:name="HTML Sample" w:semiHidden="1" w:unhideWhenUsed="1"/>
-    <w:lsdException w:name="HTML Typewriter" w:semiHidden="1" w:unhideWhenUsed="1"/>
-    <w:lsdException w:name="HTML Variable" w:semiHidden="1" w:unhideWhenUsed="1"/>
-    <w:lsdException w:name="Normal Table" w:semiHidden="1" w:unhideWhenUsed="1"/>
-    <w:lsdException w:name="annotation subject" w:semiHidden="1" w:unhideWhenUsed="1"/>
-    <w:lsdException w:name="No List" w:semiHidden="1" w:unhideWhenUsed="1"/>
-    <w:lsdException w:name="Outline List 1" w:semiHidden="1" w:unhideWhenUsed="1"/>
-    <w:lsdException w:name="Outline List 2" w:semiHidden="1" w:unhideWhenUsed="1"/>
-    <w:lsdException w:name="Outline List 3" w:semiHidden="1" w:unhideWhenUsed="1"/>
-    <w:lsdException w:name="Table Simple 1" w:semiHidden="1" w:unhideWhenUsed="1"/>
-    <w:lsdException w:name="Table Simple 2" w:semiHidden="1" w:unhideWhenUsed="1"/>
-    <w:lsdException w:name="Table Simple 3" w:semiHidden="1" w:unhideWhenUsed="1"/>
-    <w:lsdException w:name="Table Classic 1" w:semiHidden="1" w:unhideWhenUsed="1"/>
-    <w:lsdException w:name="Table Classic 2" w:semiHidden="1" w:unhideWhenUsed="1"/>
-    <w:lsdException w:name="Table Classic 3" w:semiHidden="1" w:unhideWhenUsed="1"/>
-    <w:lsdException w:name="Table Classic 4" w:semiHidden="1" w:unhideWhenUsed="1"/>
-    <w:lsdException w:name="Table Colorful 1" w:semiHidden="1" w:unhideWhenUsed="1"/>
-    <w:lsdException w:name="Table Colorful 2" w:semiHidden="1" w:unhideWhenUsed="1"/>
-    <w:lsdException w:name="Table Colorful 3" w:semiHidden="1" w:unhideWhenUsed="1"/>
-    <w:lsdException w:name="Table Columns 1" w:semiHidden="1" w:unhideWhenUsed="1"/>
-    <w:lsdException w:name="Table Columns 2" w:semiHidden="1" w:unhideWhenUsed="1"/>
-    <w:lsdException w:name="Table Columns 3" w:semiHidden="1" w:unhideWhenUsed="1"/>
-    <w:lsdException w:name="Table Columns 4" w:semiHidden="1" w:unhideWhenUsed="1"/>
-    <w:lsdException w:name="Table Columns 5" w:semiHidden="1" w:unhideWhenUsed="1"/>
-    <w:lsdException w:name="Table Grid 1" w:semiHidden="1" w:unhideWhenUsed="1"/>
-    <w:lsdException w:name="Table Grid 2" w:semiHidden="1" w:unhideWhenUsed="1"/>
-    <w:lsdException w:name="Table Grid 3" w:semiHidden="1" w:unhideWhenUsed="1"/>
-    <w:lsdException w:name="Table Grid 4" w:semiHidden="1" w:unhideWhenUsed="1"/>
-    <w:lsdException w:name="Table Grid 5" w:semiHidden="1" w:unhideWhenUsed="1"/>
-    <w:lsdException w:name="Table Grid 6" w:semiHidden="1" w:unhideWhenUsed="1"/>
-    <w:lsdException w:name="Table Grid 7" w:semiHidden="1" w:unhideWhenUsed="1"/>
-    <w:lsdException w:name="Table Grid 8" w:semiHidden="1" w:unhideWhenUsed="1"/>
-    <w:lsdException w:name="Table List 1" w:semiHidden="1" w:unhideWhenUsed="1"/>
-    <w:lsdException w:name="Table List 2" w:semiHidden="1" w:unhideWhenUsed="1"/>
-    <w:lsdException w:name="Table List 3" w:semiHidden="1" w:unhideWhenUsed="1"/>
-    <w:lsdException w:name="Table List 4" w:semiHidden="1" w:unhideWhenUsed="1"/>
-    <w:lsdException w:name="Table List 5" w:semiHidden="1" w:unhideWhenUsed="1"/>
-    <w:lsdException w:name="Table List 6" w:semiHidden="1" w:unhideWhenUsed="1"/>
-    <w:lsdException w:name="Table List 7" w:semiHidden="1" w:unhideWhenUsed="1"/>
-    <w:lsdException w:name="Table List 8" w:semiHidden="1" w:unhideWhenUsed="1"/>
-    <w:lsdException w:name="Table 3D effects 1" w:semiHidden="1" w:unhideWhenUsed="1"/>
-    <w:lsdException w:name="Table 3D effects 2" w:semiHidden="1" w:unhideWhenUsed="1"/>
-    <w:lsdException w:name="Table 3D effects 3" w:semiHidden="1" w:unhideWhenUsed="1"/>
-    <w:lsdException w:name="Table Contemporary" w:semiHidden="1" w:unhideWhenUsed="1"/>
-    <w:lsdException w:name="Table Elegant" w:semiHidden="1" w:unhideWhenUsed="1"/>
-    <w:lsdException w:name="Table Professional" w:semiHidden="1" w:unhideWhenUsed="1"/>
-    <w:lsdException w:name="Table Subtle 1" w:semiHidden="1" w:unhideWhenUsed="1"/>
-    <w:lsdException w:name="Table Subtle 2" w:semiHidden="1" w:unhideWhenUsed="1"/>
-    <w:lsdException w:name="Table Web 1" w:semiHidden="1" w:unhideWhenUsed="1"/>
-    <w:lsdException w:name="Table Web 2" w:semiHidden="1" w:unhideWhenUsed="1"/>
-    <w:lsdException w:name="Table Web 3" w:semiHidden="1" w:unhideWhenUsed="1"/>
-    <w:lsdException w:name="Balloon Text" w:semiHidden="1" w:unhideWhenUsed="1"/>
-    <w:lsdException w:name="Table Grid" w:uiPriority="39"/>
-    <w:lsdException w:name="Table Theme" w:semiHidden="1" w:unhideWhenUsed="1"/>
-    <w:lsdException w:name="Placeholder Text" w:semiHidden="1"/>
-    <w:lsdException w:name="No Spacing" w:uiPriority="1" w:qFormat="1"/>
-    <w:lsdException w:name="Light Shading" w:uiPriority="60"/>
-    <w:lsdException w:name="Light List" w:uiPriority="61"/>
-    <w:lsdException w:name="Light Grid" w:uiPriority="62"/>
-    <w:lsdException w:name="Medium Shading 1" w:uiPriority="63"/>
-    <w:lsdException w:name="Medium Shading 2" w:uiPriority="64"/>
-    <w:lsdException w:name="Medium List 1" w:uiPriority="65"/>
-    <w:lsdException w:name="Medium List 2" w:uiPriority="66"/>
-    <w:lsdException w:name="Medium Grid 1" w:uiPriority="67"/>
-    <w:lsdException w:name="Medium Grid 2" w:uiPriority="68"/>
-    <w:lsdException w:name="Medium Grid 3" w:uiPriority="69"/>
-    <w:lsdException w:name="Dark List" w:uiPriority="70"/>
-    <w:lsdException w:name="Colorful Shading" w:uiPriority="71"/>
-    <w:lsdException w:name="Colorful List" w:uiPriority="72"/>
-    <w:lsdException w:name="Colorful Grid" w:uiPriority="73"/>
-    <w:lsdException w:name="Light Shading Accent 1" w:uiPriority="60"/>
-    <w:lsdException w:name="Light List Accent 1" w:uiPriority="61"/>
-    <w:lsdException w:name="Light Grid Accent 1" w:uiPriority="62"/>
-    <w:lsdException w:name="Medium Shading 1 Accent 1" w:uiPriority="63"/>
-    <w:lsdException w:name="Medium Shading 2 Accent 1" w:uiPriority="64"/>
-    <w:lsdException w:name="Medium List 1 Accent 1" w:uiPriority="65"/>
-    <w:lsdException w:name="Revision" w:semiHidden="1"/>
-    <w:lsdException w:name="List Paragraph" w:uiPriority="34" w:qFormat="1"/>
-    <w:lsdException w:name="Quote" w:uiPriority="29" w:qFormat="1"/>
-    <w:lsdException w:name="Intense Quote" w:uiPriority="30" w:qFormat="1"/>
-    <w:lsdException w:name="Medium List 2 Accent 1" w:uiPriority="66"/>
-    <w:lsdException w:name="Medium Grid 1 Accent 1" w:uiPriority="67"/>
-    <w:lsdException w:name="Medium Grid 2 Accent 1" w:uiPriority="68"/>
-    <w:lsdException w:name="Medium Grid 3 Accent 1" w:uiPriority="69"/>
-    <w:lsdException w:name="Dark List Accent 1" w:uiPriority="70"/>
-    <w:lsdException w:name="Colorful Shading Accent 1" w:uiPriority="71"/>
-    <w:lsdException w:name="Colorful List Accent 1" w:uiPriority="72"/>
-    <w:lsdException w:name="Colorful Grid Accent 1" w:uiPriority="73"/>
-    <w:lsdException w:name="Light Shading Accent 2" w:uiPriority="60"/>
-    <w:lsdException w:name="Light List Accent 2" w:uiPriority="61"/>
-    <w:lsdException w:name="Light Grid Accent 2" w:uiPriority="62"/>
-    <w:lsdException w:name="Medium Shading 1 Accent 2" w:uiPriority="63"/>
-    <w:lsdException w:name="Medium Shading 2 Accent 2" w:uiPriority="64"/>
-    <w:lsdException w:name="Medium List 1 Accent 2" w:uiPriority="65"/>
-    <w:lsdException w:name="Medium List 2 Accent 2" w:uiPriority="66"/>
-    <w:lsdException w:name="Medium Grid 1 Accent 2" w:uiPriority="67"/>
-    <w:lsdException w:name="Medium Grid 2 Accent 2" w:uiPriority="68"/>
-    <w:lsdException w:name="Medium Grid 3 Accent 2" w:uiPriority="69"/>
-    <w:lsdException w:name="Dark List Accent 2" w:uiPriority="70"/>
-    <w:lsdException w:name="Colorful Shading Accent 2" w:uiPriority="71"/>
-    <w:lsdException w:name="Colorful List Accent 2" w:uiPriority="72"/>
-    <w:lsdException w:name="Colorful Grid Accent 2" w:uiPriority="73"/>
-    <w:lsdException w:name="Light Shading Accent 3" w:uiPriority="60"/>
-    <w:lsdException w:name="Light List Accent 3" w:uiPriority="61"/>
-    <w:lsdException w:name="Light Grid Accent 3" w:uiPriority="62"/>
-    <w:lsdException w:name="Medium Shading 1 Accent 3" w:uiPriority="63"/>
-    <w:lsdException w:name="Medium Shading 2 Accent 3" w:uiPriority="64"/>
-    <w:lsdException w:name="Medium List 1 Accent 3" w:uiPriority="65"/>
-    <w:lsdException w:name="Medium List 2 Accent 3" w:uiPriority="66"/>
-    <w:lsdException w:name="Medium Grid 1 Accent 3" w:uiPriority="67"/>
-    <w:lsdException w:name="Medium Grid 2 Accent 3" w:uiPriority="68"/>
-    <w:lsdException w:name="Medium Grid 3 Accent 3" w:uiPriority="69"/>
-    <w:lsdException w:name="Dark List Accent 3" w:uiPriority="70"/>
-    <w:lsdException w:name="Colorful Shading Accent 3" w:uiPriority="71"/>
-    <w:lsdException w:name="Colorful List Accent 3" w:uiPriority="72"/>
-    <w:lsdException w:name="Colorful Grid Accent 3" w:uiPriority="73"/>
-    <w:lsdException w:name="Light Shading Accent 4" w:uiPriority="60"/>
-    <w:lsdException w:name="Light List Accent 4" w:uiPriority="61"/>
-    <w:lsdException w:name="Light Grid Accent 4" w:uiPriority="62"/>
-    <w:lsdException w:name="Medium Shading 1 Accent 4" w:uiPriority="63"/>
-    <w:lsdException w:name="Medium Shading 2 Accent 4" w:uiPriority="64"/>
-    <w:lsdException w:name="Medium List 1 Accent 4" w:uiPriority="65"/>
-    <w:lsdException w:name="Medium List 2 Accent 4" w:uiPriority="66"/>
-    <w:lsdException w:name="Medium Grid 1 Accent 4" w:uiPriority="67"/>
-    <w:lsdException w:name="Medium Grid 2 Accent 4" w:uiPriority="68"/>
-    <w:lsdException w:name="Medium Grid 3 Accent 4" w:uiPriority="69"/>
-    <w:lsdException w:name="Dark List Accent 4" w:uiPriority="70"/>
-    <w:lsdException w:name="Colorful Shading Accent 4" w:uiPriority="71"/>
-    <w:lsdException w:name="Colorful List Accent 4" w:uiPriority="72"/>
-    <w:lsdException w:name="Colorful Grid Accent 4" w:uiPriority="73"/>
-    <w:lsdException w:name="Light Shading Accent 5" w:uiPriority="60"/>
-    <w:lsdException w:name="Light List Accent 5" w:uiPriority="61"/>
-    <w:lsdException w:name="Light Grid Accent 5" w:uiPriority="62"/>
-    <w:lsdException w:name="Medium Shading 1 Accent 5" w:uiPriority="63"/>
-    <w:lsdException w:name="Medium Shading 2 Accent 5" w:uiPriority="64"/>
-    <w:lsdException w:name="Medium List 1 Accent 5" w:uiPriority="65"/>
-    <w:lsdException w:name="Medium List 2 Accent 5" w:uiPriority="66"/>
-    <w:lsdException w:name="Medium Grid 1 Accent 5" w:uiPriority="67"/>
-    <w:lsdException w:name="Medium Grid 2 Accent 5" w:uiPriority="68"/>
-    <w:lsdException w:name="Medium Grid 3 Accent 5" w:uiPriority="69"/>
-    <w:lsdException w:name="Dark List Accent 5" w:uiPriority="70"/>
-    <w:lsdException w:name="Colorful Shading Accent 5" w:uiPriority="71"/>
-    <w:lsdException w:name="Colorful List Accent 5" w:uiPriority="72"/>
-    <w:lsdException w:name="Colorful Grid Accent 5" w:uiPriority="73"/>
-    <w:lsdException w:name="Light Shading Accent 6" w:uiPriority="60"/>
-    <w:lsdException w:name="Light List Accent 6" w:uiPriority="61"/>
-    <w:lsdException w:name="Light Grid Accent 6" w:uiPriority="62"/>
-    <w:lsdException w:name="Medium Shading 1 Accent 6" w:uiPriority="63"/>
-    <w:lsdException w:name="Medium Shading 2 Accent 6" w:uiPriority="64"/>
-    <w:lsdException w:name="Medium List 1 Accent 6" w:uiPriority="65"/>
-    <w:lsdException w:name="Medium List 2 Accent 6" w:uiPriority="66"/>
-    <w:lsdException w:name="Medium Grid 1 Accent 6" w:uiPriority="67"/>
-    <w:lsdException w:name="Medium Grid 2 Accent 6" w:uiPriority="68"/>
-    <w:lsdException w:name="Medium Grid 3 Accent 6" w:uiPriority="69"/>
-    <w:lsdException w:name="Dark List Accent 6" w:uiPriority="70"/>
-    <w:lsdException w:name="Colorful Shading Accent 6" w:uiPriority="71"/>
-    <w:lsdException w:name="Colorful List Accent 6" w:uiPriority="72"/>
-    <w:lsdException w:name="Colorful Grid Accent 6" w:uiPriority="73"/>
-    <w:lsdException w:name="Subtle Emphasis" w:uiPriority="19" w:qFormat="1"/>
-    <w:lsdException w:name="Intense Emphasis" w:uiPriority="21" w:qFormat="1"/>
-    <w:lsdException w:name="Subtle Reference" w:uiPriority="31" w:qFormat="1"/>
-    <w:lsdException w:name="Intense Reference" w:uiPriority="32" w:qFormat="1"/>
-    <w:lsdException w:name="Book Title" w:uiPriority="33" w:qFormat="1"/>
-    <w:lsdException w:name="Bibliography" w:semiHidden="1" w:uiPriority="37" w:unhideWhenUsed="1"/>
-    <w:lsdException w:name="TOC Heading" w:semiHidden="1" w:uiPriority="39" w:unhideWhenUsed="1" w:qFormat="1"/>
-    <w:lsdException w:name="Plain Table 1" w:uiPriority="41"/>
-    <w:lsdException w:name="Plain Table 2" w:uiPriority="42"/>
-    <w:lsdException w:name="Plain Table 3" w:uiPriority="43"/>
-    <w:lsdException w:name="Plain Table 4" w:uiPriority="44"/>
-    <w:lsdException w:name="Plain Table 5" w:uiPriority="45"/>
-    <w:lsdException w:name="Grid Table Light" w:uiPriority="40"/>
-    <w:lsdException w:name="Grid Table 1 Light" w:uiPriority="46"/>
-    <w:lsdException w:name="Grid Table 2" w:uiPriority="47"/>
-    <w:lsdException w:name="Grid Table 3" w:uiPriority="48"/>
-    <w:lsdException w:name="Grid Table 4" w:uiPriority="49"/>
-    <w:lsdException w:name="Grid Table 5 Dark" w:uiPriority="50"/>
-    <w:lsdException w:name="Grid Table 6 Colorful" w:uiPriority="51"/>
-    <w:lsdException w:name="Grid Table 7 Colorful" w:uiPriority="52"/>
-    <w:lsdException w:name="Grid Table 1 Light Accent 1" w:uiPriority="46"/>
-    <w:lsdException w:name="Grid Table 2 Accent 1" w:uiPriority="47"/>
-    <w:lsdException w:name="Grid Table 3 Accent 1" w:uiPriority="48"/>
-    <w:lsdException w:name="Grid Table 4 Accent 1" w:uiPriority="49"/>
-    <w:lsdException w:name="Grid Table 5 Dark Accent 1" w:uiPriority="50"/>
-    <w:lsdException w:name="Grid Table 6 Colorful Accent 1" w:uiPriority="51"/>
-    <w:lsdException w:name="Grid Table 7 Colorful Accent 1" w:uiPriority="52"/>
-    <w:lsdException w:name="Grid Table 1 Light Accent 2" w:uiPriority="46"/>
-    <w:lsdException w:name="Grid Table 2 Accent 2" w:uiPriority="47"/>
-    <w:lsdException w:name="Grid Table 3 Accent 2" w:uiPriority="48"/>
-    <w:lsdException w:name="Grid Table 4 Accent 2" w:uiPriority="49"/>
-    <w:lsdException w:name="Grid Table 5 Dark Accent 2" w:uiPriority="50"/>
-    <w:lsdException w:name="Grid Table 6 Colorful Accent 2" w:uiPriority="51"/>
-    <w:lsdException w:name="Grid Table 7 Colorful Accent 2" w:uiPriority="52"/>
-    <w:lsdException w:name="Grid Table 1 Light Accent 3" w:uiPriority="46"/>
-    <w:lsdException w:name="Grid Table 2 Accent 3" w:uiPriority="47"/>
-    <w:lsdException w:name="Grid Table 3 Accent 3" w:uiPriority="48"/>
-    <w:lsdException w:name="Grid Table 4 Accent 3" w:uiPriority="49"/>
-    <w:lsdException w:name="Grid Table 5 Dark Accent 3" w:uiPriority="50"/>
-    <w:lsdException w:name="Grid Table 6 Colorful Accent 3" w:uiPriority="51"/>
-    <w:lsdException w:name="Grid Table 7 Colorful Accent 3" w:uiPriority="52"/>
-    <w:lsdException w:name="Grid Table 1 Light Accent 4" w:uiPriority="46"/>
-    <w:lsdException w:name="Grid Table 2 Accent 4" w:uiPriority="47"/>
-    <w:lsdException w:name="Grid Table 3 Accent 4" w:uiPriority="48"/>
-    <w:lsdException w:name="Grid Table 4 Accent 4" w:uiPriority="49"/>
-    <w:lsdException w:name="Grid Table 5 Dark Accent 4" w:uiPriority="50"/>
-    <w:lsdException w:name="Grid Table 6 Colorful Accent 4" w:uiPriority="51"/>
-    <w:lsdException w:name="Grid Table 7 Colorful Accent 4" w:uiPriority="52"/>
-    <w:lsdException w:name="Grid Table 1 Light Accent 5" w:uiPriority="46"/>
-    <w:lsdException w:name="Grid Table 2 Accent 5" w:uiPriority="47"/>
-    <w:lsdException w:name="Grid Table 3 Accent 5" w:uiPriority="48"/>
-    <w:lsdException w:name="Grid Table 4 Accent 5" w:uiPriority="49"/>
-    <w:lsdException w:name="Grid Table 5 Dark Accent 5" w:uiPriority="50"/>
-    <w:lsdException w:name="Grid Table 6 Colorful Accent 5" w:uiPriority="51"/>
-    <w:lsdException w:name="Grid Table 7 Colorful Accent 5" w:uiPriority="52"/>
-    <w:lsdException w:name="Grid Table 1 Light Accent 6" w:uiPriority="46"/>
-    <w:lsdException w:name="Grid Table 2 Accent 6" w:uiPriority="47"/>
-    <w:lsdException w:name="Grid Table 3 Accent 6" w:uiPriority="48"/>
-    <w:lsdException w:name="Grid Table 4 Accent 6" w:uiPriority="49"/>
-    <w:lsdException w:name="Grid Table 5 Dark Accent 6" w:uiPriority="50"/>
-    <w:lsdException w:name="Grid Table 6 Colorful Accent 6" w:uiPriority="51"/>
-    <w:lsdException w:name="Grid Table 7 Colorful Accent 6" w:uiPriority="52"/>
-    <w:lsdException w:name="List Table 1 Light" w:uiPriority="46"/>
-    <w:lsdException w:name="List Table 2" w:uiPriority="47"/>
-    <w:lsdException w:name="List Table 3" w:uiPriority="48"/>
-    <w:lsdException w:name="List Table 4" w:uiPriority="49"/>
-    <w:lsdException w:name="List Table 5 Dark" w:uiPriority="50"/>
-    <w:lsdException w:name="List Table 6 Colorful" w:uiPriority="51"/>
-    <w:lsdException w:name="List Table 7 Colorful" w:uiPriority="52"/>
-    <w:lsdException w:name="List Table 1 Light Accent 1" w:uiPriority="46"/>
-    <w:lsdException w:name="List Table 2 Accent 1" w:uiPriority="47"/>
-    <w:lsdException w:name="List Table 3 Accent 1" w:uiPriority="48"/>
-    <w:lsdException w:name="List Table 4 Accent 1" w:uiPriority="49"/>
-    <w:lsdException w:name="List Table 5 Dark Accent 1" w:uiPriority="50"/>
-    <w:lsdException w:name="List Table 6 Colorful Accent 1" w:uiPriority="51"/>
-    <w:lsdException w:name="List Table 7 Colorful Accent 1" w:uiPriority="52"/>
-    <w:lsdException w:name="List Table 1 Light Accent 2" w:uiPriority="46"/>
-    <w:lsdException w:name="List Table 2 Accent 2" w:uiPriority="47"/>
-    <w:lsdException w:name="List Table 3 Accent 2" w:uiPriority="48"/>
-    <w:lsdException w:name="List Table 4 Accent 2" w:uiPriority="49"/>
-    <w:lsdException w:name="List Table 5 Dark Accent 2" w:uiPriority="50"/>
-    <w:lsdException w:name="List Table 6 Colorful Accent 2" w:uiPriority="51"/>
-    <w:lsdException w:name="List Table 7 Colorful Accent 2" w:uiPriority="52"/>
-    <w:lsdException w:name="List Table 1 Light Accent 3" w:uiPriority="46"/>
-    <w:lsdException w:name="List Table 2 Accent 3" w:uiPriority="47"/>
-    <w:lsdException w:name="List Table 3 Accent 3" w:uiPriority="48"/>
-    <w:lsdException w:name="List Table 4 Accent 3" w:uiPriority="49"/>
-    <w:lsdException w:name="List Table 5 Dark Accent 3" w:uiPriority="50"/>
-    <w:lsdException w:name="List Table 6 Colorful Accent 3" w:uiPriority="51"/>
-    <w:lsdException w:name="List Table 7 Colorful Accent 3" w:uiPriority="52"/>
-    <w:lsdException w:name="List Table 1 Light Accent 4" w:uiPriority="46"/>
-    <w:lsdException w:name="List Table 2 Accent 4" w:uiPriority="47"/>
-    <w:lsdException w:name="List Table 3 Accent 4" w:uiPriority="48"/>
-    <w:lsdException w:name="List Table 4 Accent 4" w:uiPriority="49"/>
-    <w:lsdException w:name="List Table 5 Dark Accent 4" w:uiPriority="50"/>
-    <w:lsdException w:name="List Table 6 Colorful Accent 4" w:uiPriority="51"/>
-    <w:lsdException w:name="List Table 7 Colorful Accent 4" w:uiPriority="52"/>
-    <w:lsdException w:name="List Table 1 Light Accent 5" w:uiPriority="46"/>
-    <w:lsdException w:name="List Table 2 Accent 5" w:uiPriority="47"/>
-    <w:lsdException w:name="List Table 3 Accent 5" w:uiPriority="48"/>
-    <w:lsdException w:name="List Table 4 Accent 5" w:uiPriority="49"/>
-    <w:lsdException w:name="List Table 5 Dark Accent 5" w:uiPriority="50"/>
-    <w:lsdException w:name="List Table 6 Colorful Accent 5" w:uiPriority="51"/>
-    <w:lsdException w:name="List Table 7 Colorful Accent 5" w:uiPriority="52"/>
-    <w:lsdException w:name="List Table 1 Light Accent 6" w:uiPriority="46"/>
-    <w:lsdException w:name="List Table 2 Accent 6" w:uiPriority="47"/>
-    <w:lsdException w:name="List Table 3 Accent 6" w:uiPriority="48"/>
-    <w:lsdException w:name="List Table 4 Accent 6" w:uiPriority="49"/>
-    <w:lsdException w:name="List Table 5 Dark Accent 6" w:uiPriority="50"/>
-    <w:lsdException w:name="List Table 6 Colorful Accent 6" w:uiPriority="51"/>
-    <w:lsdException w:name="List Table 7 Colorful Accent 6" w:uiPriority="52"/>
-    <w:lsdException w:name="Mention" w:semiHidden="1" w:unhideWhenUsed="1"/>
-    <w:lsdException w:name="Smart Hyperlink" w:semiHidden="1" w:unhideWhenUsed="1"/>
-    <w:lsdException w:name="Hashtag" w:semiHidden="1" w:unhideWhenUsed="1"/>
-    <w:lsdException w:name="Unresolved Mention" w:semiHidden="1" w:unhideWhenUsed="1"/>
-    <w:lsdException w:name="Smart Link" w:semiHidden="1" w:unhideWhenUsed="1"/>
-  </w:latentStyles>
-  <w:style w:type="paragraph" w:default="1" w:styleId="Normal">
-    <w:name w:val="Normal"/>
-    <w:qFormat/>
-    <w:rsid w:val="004C1D09"/>
-  </w:style>
-  <w:style w:type="character" w:default="1" w:styleId="Fuentedeprrafopredeter">
-    <w:name w:val="Default Paragraph Font"/>
-    <w:uiPriority w:val="1"/>
-    <w:semiHidden/>
-    <w:unhideWhenUsed/>
-  </w:style>
-  <w:style w:type="table" w:default="1" w:styleId="Tablanormal">
-    <w:name w:val="Normal Table"/>
-    <w:uiPriority w:val="99"/>
-    <w:semiHidden/>
-    <w:unhideWhenUsed/>
-    <w:tblPr>
-      <w:tblInd w:w="0" w:type="dxa"/>
-      <w:tblCellMar>
-        <w:top w:w="0" w:type="dxa"/>
-        <w:left w:w="108" w:type="dxa"/>
-        <w:bottom w:w="0" w:type="dxa"/>
-        <w:right w:w="108" w:type="dxa"/>
-      </w:tblCellMar>
-    </w:tblPr>
-  </w:style>
-  <w:style w:type="numbering" w:default="1" w:styleId="Sinlista">
-    <w:name w:val="No List"/>
-    <w:uiPriority w:val="99"/>
-    <w:semiHidden/>
-    <w:unhideWhenUsed/>
-  </w:style>
-  <w:style w:type="character" w:styleId="Textodelmarcadordeposicin">
-    <w:name w:val="Placeholder Text"/>
-    <w:basedOn w:val="Fuentedeprrafopredeter"/>
-    <w:uiPriority w:val="99"/>
-    <w:semiHidden/>
-    <w:rsid w:val="00010AEF"/>
-    <w:rPr>
-      <w:color w:val="808080"/>
-    </w:rPr>
-  </w:style>
-  <w:style w:type="paragraph" w:customStyle="1" w:styleId="F9B3FD16871F4C54ACF12EFE83A2BD4C">
-    <w:name w:val="F9B3FD16871F4C54ACF12EFE83A2BD4C"/>
-    <w:rsid w:val="008809DA"/>
-  </w:style>
-  <w:style w:type="paragraph" w:customStyle="1" w:styleId="AFC2A32C2DA549D79D2111FE3A5FBF8D">
-    <w:name w:val="AFC2A32C2DA549D79D2111FE3A5FBF8D"/>
-    <w:rsid w:val="00010AEF"/>
-    <w:rPr>
-      <w:lang w:val="es-ES" w:eastAsia="es-ES"/>
-    </w:rPr>
-  </w:style>
-</w:styles>
-</file>
-
-<file path=word/glossary/webSettings.xml><?xml version="1.0" encoding="utf-8"?>
-<w:webSettings xmlns:mc="http://schemas.openxmlformats.org/markup-compatibility/2006" xmlns:r="http://schemas.openxmlformats.org/officeDocument/2006/relationships" xmlns:w="http://schemas.openxmlformats.org/wordprocessingml/2006/main" xmlns:w14="http://schemas.microsoft.com/office/word/2010/wordml" xmlns:w15="http://schemas.microsoft.com/office/word/2012/wordml" xmlns:w16cex="http://schemas.microsoft.com/office/word/2018/wordml/cex" xmlns:w16cid="http://schemas.microsoft.com/office/word/2016/wordml/cid" xmlns:w16="http://schemas.microsoft.com/office/word/2018/wordml" xmlns:w16du="http://schemas.microsoft.com/office/word/2023/wordml/word16du" xmlns:w16sdtdh="http://schemas.microsoft.com/office/word/2020/wordml/sdtdatahash" xmlns:w16sdtfl="http://schemas.microsoft.com/office/word/2024/wordml/sdtformatlock" xmlns:w16se="http://schemas.microsoft.com/office/word/2015/wordml/symex" mc:Ignorable="w14 w15 w16se w16cid w16 w16cex w16sdtdh w16sdtfl w16du">
-  <w:optimizeForBrowser/>
-  <w:allowPNG/>
-</w:webSettings>
 </file>
 
 <file path=word/theme/theme1.xml><?xml version="1.0" encoding="utf-8"?>
@@ -30909,6 +29663,25 @@
 </file>
 
 <file path=customXml/item1.xml><?xml version="1.0" encoding="utf-8"?>
+<b:Sources xmlns:b="http://schemas.openxmlformats.org/officeDocument/2006/bibliography" xmlns="http://schemas.openxmlformats.org/officeDocument/2006/bibliography" SelectedStyle="\APASixthEditionOfficeOnline.xsl" StyleName="APA" Version="6"/>
+</file>
+
+<file path=customXml/item2.xml><?xml version="1.0" encoding="utf-8"?>
+<p:properties xmlns:p="http://schemas.microsoft.com/office/2006/metadata/properties" xmlns:xsi="http://www.w3.org/2001/XMLSchema-instance" xmlns:pc="http://schemas.microsoft.com/office/infopath/2007/PartnerControls">
+  <documentManagement/>
+</p:properties>
+</file>
+
+<file path=customXml/item3.xml><?xml version="1.0" encoding="utf-8"?>
+<?mso-contentType ?>
+<FormTemplates xmlns="http://schemas.microsoft.com/sharepoint/v3/contenttype/forms">
+  <Display>DocumentLibraryForm</Display>
+  <Edit>DocumentLibraryForm</Edit>
+  <New>DocumentLibraryForm</New>
+</FormTemplates>
+</file>
+
+<file path=customXml/item4.xml><?xml version="1.0" encoding="utf-8"?>
 <ct:contentTypeSchema xmlns:ct="http://schemas.microsoft.com/office/2006/metadata/contentType" xmlns:ma="http://schemas.microsoft.com/office/2006/metadata/properties/metaAttributes" ct:_="" ma:_="" ma:contentTypeName="Document" ma:contentTypeID="0x010100EF7DF62604AB8147ADDD3F1F557EA2C9" ma:contentTypeVersion="5" ma:contentTypeDescription="Create a new document." ma:contentTypeScope="" ma:versionID="0deb20760b05127c0db3911951a298e2">
   <xsd:schema xmlns:xsd="http://www.w3.org/2001/XMLSchema" xmlns:xs="http://www.w3.org/2001/XMLSchema" xmlns:p="http://schemas.microsoft.com/office/2006/metadata/properties" xmlns:ns2="68363a1d-7d57-4fb3-bc9c-fb5fca631cac" targetNamespace="http://schemas.microsoft.com/office/2006/metadata/properties" ma:root="true" ma:fieldsID="cef2b7866cd2b4d4e76fca29086a0785" ns2:_="">
     <xsd:import namespace="68363a1d-7d57-4fb3-bc9c-fb5fca631cac"/>
@@ -31058,26 +29831,32 @@
 </ct:contentTypeSchema>
 </file>
 
-<file path=customXml/item2.xml><?xml version="1.0" encoding="utf-8"?>
-<?mso-contentType ?>
-<FormTemplates xmlns="http://schemas.microsoft.com/sharepoint/v3/contenttype/forms">
-  <Display>DocumentLibraryForm</Display>
-  <Edit>DocumentLibraryForm</Edit>
-  <New>DocumentLibraryForm</New>
-</FormTemplates>
+<file path=customXml/itemProps1.xml><?xml version="1.0" encoding="utf-8"?>
+<ds:datastoreItem xmlns:ds="http://schemas.openxmlformats.org/officeDocument/2006/customXml" ds:itemID="{98BD03B9-BFAB-42BE-8091-69031DD3A8CE}">
+  <ds:schemaRefs>
+    <ds:schemaRef ds:uri="http://schemas.openxmlformats.org/officeDocument/2006/bibliography"/>
+  </ds:schemaRefs>
+</ds:datastoreItem>
 </file>
 
-<file path=customXml/item3.xml><?xml version="1.0" encoding="utf-8"?>
-<p:properties xmlns:p="http://schemas.microsoft.com/office/2006/metadata/properties" xmlns:xsi="http://www.w3.org/2001/XMLSchema-instance" xmlns:pc="http://schemas.microsoft.com/office/infopath/2007/PartnerControls">
-  <documentManagement/>
-</p:properties>
+<file path=customXml/itemProps2.xml><?xml version="1.0" encoding="utf-8"?>
+<ds:datastoreItem xmlns:ds="http://schemas.openxmlformats.org/officeDocument/2006/customXml" ds:itemID="{B6ADF4F3-5389-4261-BA50-D9C1C4EE966F}">
+  <ds:schemaRefs>
+    <ds:schemaRef ds:uri="http://schemas.microsoft.com/office/2006/metadata/properties"/>
+    <ds:schemaRef ds:uri="http://schemas.microsoft.com/office/infopath/2007/PartnerControls"/>
+  </ds:schemaRefs>
+</ds:datastoreItem>
 </file>
 
-<file path=customXml/item4.xml><?xml version="1.0" encoding="utf-8"?>
-<b:Sources xmlns:b="http://schemas.openxmlformats.org/officeDocument/2006/bibliography" xmlns="http://schemas.openxmlformats.org/officeDocument/2006/bibliography" SelectedStyle="\APASixthEditionOfficeOnline.xsl" StyleName="APA" Version="6"/>
+<file path=customXml/itemProps3.xml><?xml version="1.0" encoding="utf-8"?>
+<ds:datastoreItem xmlns:ds="http://schemas.openxmlformats.org/officeDocument/2006/customXml" ds:itemID="{F4033E51-A133-484E-A999-B47BB42AC722}">
+  <ds:schemaRefs>
+    <ds:schemaRef ds:uri="http://schemas.microsoft.com/sharepoint/v3/contenttype/forms"/>
+  </ds:schemaRefs>
+</ds:datastoreItem>
 </file>
 
-<file path=customXml/itemProps1.xml><?xml version="1.0" encoding="utf-8"?>
+<file path=customXml/itemProps4.xml><?xml version="1.0" encoding="utf-8"?>
 <ds:datastoreItem xmlns:ds="http://schemas.openxmlformats.org/officeDocument/2006/customXml" ds:itemID="{D32E0D42-7523-4FD8-9EC0-4ECC4748ABAC}">
   <ds:schemaRefs>
     <ds:schemaRef ds:uri="http://schemas.microsoft.com/office/2006/metadata/contentType"/>
@@ -31095,31 +29874,6 @@
 </ds:datastoreItem>
 </file>
 
-<file path=customXml/itemProps2.xml><?xml version="1.0" encoding="utf-8"?>
-<ds:datastoreItem xmlns:ds="http://schemas.openxmlformats.org/officeDocument/2006/customXml" ds:itemID="{F4033E51-A133-484E-A999-B47BB42AC722}">
-  <ds:schemaRefs>
-    <ds:schemaRef ds:uri="http://schemas.microsoft.com/sharepoint/v3/contenttype/forms"/>
-  </ds:schemaRefs>
-</ds:datastoreItem>
-</file>
-
-<file path=customXml/itemProps3.xml><?xml version="1.0" encoding="utf-8"?>
-<ds:datastoreItem xmlns:ds="http://schemas.openxmlformats.org/officeDocument/2006/customXml" ds:itemID="{B6ADF4F3-5389-4261-BA50-D9C1C4EE966F}">
-  <ds:schemaRefs>
-    <ds:schemaRef ds:uri="http://schemas.microsoft.com/office/2006/metadata/properties"/>
-    <ds:schemaRef ds:uri="http://schemas.microsoft.com/office/infopath/2007/PartnerControls"/>
-  </ds:schemaRefs>
-</ds:datastoreItem>
-</file>
-
-<file path=customXml/itemProps4.xml><?xml version="1.0" encoding="utf-8"?>
-<ds:datastoreItem xmlns:ds="http://schemas.openxmlformats.org/officeDocument/2006/customXml" ds:itemID="{98BD03B9-BFAB-42BE-8091-69031DD3A8CE}">
-  <ds:schemaRefs>
-    <ds:schemaRef ds:uri="http://schemas.openxmlformats.org/officeDocument/2006/bibliography"/>
-  </ds:schemaRefs>
-</ds:datastoreItem>
-</file>
-
 <file path=docMetadata/LabelInfo.xml><?xml version="1.0" encoding="utf-8"?>
 <clbl:labelList xmlns:clbl="http://schemas.microsoft.com/office/2020/mipLabelMetadata">
   <clbl:label id="{3048dc87-43f0-4100-9acb-ae1971c79395}" enabled="0" method="" siteId="{3048dc87-43f0-4100-9acb-ae1971c79395}" removed="1"/>

</xml_diff>